<commit_message>
Unificación de la plantilla de Word, limpieza de versiones antiguas e inyección dinámica de fechas, periodo y datos de planilla de seguridad social.
</commit_message>
<xml_diff>
--- a/plantillas/INFORME_SUPERVISION_TEMPLATE.docx
+++ b/plantillas/INFORME_SUPERVISION_TEMPLATE.docx
@@ -4,8 +4,7 @@
   <w:body>
     <w:tbl>
       <w:tblPr>
-        <w:tblW w:w="9639" w:type="dxa"/>
-        <w:tblInd w:w="-5" w:type="dxa"/>
+        <w:tblW w:w="5000" w:type="pct"/>
         <w:tblCellMar>
           <w:left w:w="10" w:type="dxa"/>
           <w:right w:w="10" w:type="dxa"/>
@@ -13,10 +12,9 @@
         <w:tblLook w:val="04A0" w:firstRow="1" w:lastRow="0" w:firstColumn="1" w:lastColumn="0" w:noHBand="0" w:noVBand="1"/>
       </w:tblPr>
       <w:tblGrid>
-        <w:gridCol w:w="2627"/>
-        <w:gridCol w:w="2335"/>
-        <w:gridCol w:w="75"/>
-        <w:gridCol w:w="4602"/>
+        <w:gridCol w:w="3752"/>
+        <w:gridCol w:w="1324"/>
+        <w:gridCol w:w="4470"/>
       </w:tblGrid>
       <w:tr>
         <w:trPr>
@@ -25,8 +23,8 @@
         </w:trPr>
         <w:tc>
           <w:tcPr>
-            <w:tcW w:w="9639" w:type="dxa"/>
-            <w:gridSpan w:val="4"/>
+            <w:tcW w:w="5000" w:type="pct"/>
+            <w:gridSpan w:val="3"/>
             <w:tcBorders>
               <w:top w:val="single" w:sz="4" w:space="0" w:color="000000"/>
               <w:left w:val="single" w:sz="4" w:space="0" w:color="000000"/>
@@ -74,8 +72,8 @@
         </w:trPr>
         <w:tc>
           <w:tcPr>
-            <w:tcW w:w="9639" w:type="dxa"/>
-            <w:gridSpan w:val="4"/>
+            <w:tcW w:w="5000" w:type="pct"/>
+            <w:gridSpan w:val="3"/>
             <w:tcBorders>
               <w:top w:val="single" w:sz="4" w:space="0" w:color="000000"/>
               <w:left w:val="single" w:sz="4" w:space="0" w:color="000000"/>
@@ -109,7 +107,7 @@
               <mc:AlternateContent>
                 <mc:Choice Requires="wps">
                   <w:drawing>
-                    <wp:anchor distT="0" distB="0" distL="114300" distR="114300" simplePos="0" relativeHeight="251659264" behindDoc="0" locked="0" layoutInCell="1" allowOverlap="1" wp14:anchorId="782E5C85" wp14:editId="25A05B92">
+                    <wp:anchor distT="0" distB="0" distL="114300" distR="114300" simplePos="0" relativeHeight="251659264" behindDoc="0" locked="0" layoutInCell="1" allowOverlap="1" wp14:anchorId="0825D857" wp14:editId="2EE93F93">
                       <wp:simplePos x="0" y="0"/>
                       <wp:positionH relativeFrom="column">
                         <wp:posOffset>4511675</wp:posOffset>
@@ -153,6 +151,23 @@
                               <w:txbxContent>
                                 <w:p>
                                   <w:pPr>
+                                    <w:pStyle w:val="Textoindependiente2"/>
+                                    <w:spacing w:line="240" w:lineRule="auto"/>
+                                    <w:rPr>
+                                      <w:rFonts w:ascii="Arial" w:hAnsi="Arial" w:cs="Arial"/>
+                                      <w:szCs w:val="24"/>
+                                    </w:rPr>
+                                  </w:pPr>
+                                  <w:r>
+                                    <w:rPr>
+                                      <w:rFonts w:ascii="Arial" w:hAnsi="Arial" w:cs="Arial"/>
+                                      <w:szCs w:val="24"/>
+                                    </w:rPr>
+                                    <w:t xml:space="preserve">${X_FINAL} </w:t>
+                                  </w:r>
+                                </w:p>
+                                <w:p>
+                                  <w:pPr>
                                     <w:jc w:val="center"/>
                                     <w:rPr>
                                       <w:b/>
@@ -186,6 +201,23 @@
                         <w:txbxContent>
                           <w:p>
                             <w:pPr>
+                              <w:pStyle w:val="Textoindependiente2"/>
+                              <w:spacing w:line="240" w:lineRule="auto"/>
+                              <w:rPr>
+                                <w:rFonts w:ascii="Arial" w:hAnsi="Arial" w:cs="Arial"/>
+                                <w:szCs w:val="24"/>
+                              </w:rPr>
+                            </w:pPr>
+                            <w:r>
+                              <w:rPr>
+                                <w:rFonts w:ascii="Arial" w:hAnsi="Arial" w:cs="Arial"/>
+                                <w:szCs w:val="24"/>
+                              </w:rPr>
+                              <w:t xml:space="preserve">${X_FINAL} </w:t>
+                            </w:r>
+                          </w:p>
+                          <w:p>
+                            <w:pPr>
                               <w:jc w:val="center"/>
                               <w:rPr>
                                 <w:b/>
@@ -211,7 +243,7 @@
               <mc:AlternateContent>
                 <mc:Choice Requires="wps">
                   <w:drawing>
-                    <wp:anchor distT="0" distB="0" distL="114300" distR="114300" simplePos="0" relativeHeight="251657216" behindDoc="0" locked="0" layoutInCell="1" allowOverlap="1" wp14:anchorId="13E5B041" wp14:editId="6DA77AA3">
+                    <wp:anchor distT="0" distB="0" distL="114300" distR="114300" simplePos="0" relativeHeight="251657216" behindDoc="0" locked="0" layoutInCell="1" allowOverlap="1" wp14:anchorId="4538A632" wp14:editId="294CA40F">
                       <wp:simplePos x="0" y="0"/>
                       <wp:positionH relativeFrom="column">
                         <wp:posOffset>1579245</wp:posOffset>
@@ -262,6 +294,13 @@
                                       <w:lang w:val="es-CO"/>
                                     </w:rPr>
                                   </w:pPr>
+                                  <w:r>
+                                    <w:rPr>
+                                      <w:rFonts w:ascii="Arial" w:hAnsi="Arial" w:cs="Arial"/>
+                                      <w:szCs w:val="24"/>
+                                    </w:rPr>
+                                    <w:t>${X_PARCIAL}</w:t>
+                                  </w:r>
                                 </w:p>
                               </w:txbxContent>
                             </wps:txbx>
@@ -295,6 +334,13 @@
                                 <w:lang w:val="es-CO"/>
                               </w:rPr>
                             </w:pPr>
+                            <w:r>
+                              <w:rPr>
+                                <w:rFonts w:ascii="Arial" w:hAnsi="Arial" w:cs="Arial"/>
+                                <w:szCs w:val="24"/>
+                              </w:rPr>
+                              <w:t>${X_PARCIAL}</w:t>
+                            </w:r>
                           </w:p>
                         </w:txbxContent>
                       </v:textbox>
@@ -318,7 +364,7 @@
                 <w:rFonts w:ascii="Arial" w:hAnsi="Arial" w:cs="Arial"/>
                 <w:szCs w:val="24"/>
               </w:rPr>
-              <w:t xml:space="preserve">INFORME PARCIAL                                         INFORME FINAL </w:t>
+              <w:t xml:space="preserve">INFORME PARCIAL                                          INFORME FINAL </w:t>
             </w:r>
           </w:p>
           <w:p>
@@ -354,7 +400,15 @@
                 <w:rFonts w:ascii="Arial" w:hAnsi="Arial" w:cs="Arial"/>
                 <w:szCs w:val="24"/>
               </w:rPr>
-              <w:t xml:space="preserve"> ____</w:t>
+              <w:t xml:space="preserve"> </w:t>
+            </w:r>
+            <w:r>
+              <w:rPr>
+                <w:rFonts w:ascii="Arial" w:hAnsi="Arial" w:cs="Arial"/>
+                <w:szCs w:val="24"/>
+                <w:u w:val="single"/>
+              </w:rPr>
+              <w:t>${NUMERO_CUOTA}</w:t>
             </w:r>
           </w:p>
           <w:p>
@@ -383,8 +437,8 @@
         </w:trPr>
         <w:tc>
           <w:tcPr>
-            <w:tcW w:w="9639" w:type="dxa"/>
-            <w:gridSpan w:val="4"/>
+            <w:tcW w:w="5000" w:type="pct"/>
+            <w:gridSpan w:val="3"/>
             <w:tcBorders>
               <w:top w:val="single" w:sz="4" w:space="0" w:color="000000"/>
               <w:left w:val="single" w:sz="4" w:space="0" w:color="000000"/>
@@ -418,7 +472,7 @@
                 <w:rFonts w:ascii="Arial" w:hAnsi="Arial" w:cs="Arial"/>
                 <w:szCs w:val="24"/>
               </w:rPr>
-              <w:t>ASPECTOS GENERALES DE CONTRATO Y SU EJECUCIÓN</w:t>
+              <w:t xml:space="preserve">ASPECTOS GENERALES DE CONTRATO Y SU EJECUCIÓN </w:t>
             </w:r>
           </w:p>
         </w:tc>
@@ -426,342 +480,7 @@
       <w:tr>
         <w:tc>
           <w:tcPr>
-            <w:tcW w:w="9639" w:type="dxa"/>
-            <w:gridSpan w:val="4"/>
-            <w:tcBorders>
-              <w:top w:val="single" w:sz="4" w:space="0" w:color="000000"/>
-              <w:left w:val="single" w:sz="4" w:space="0" w:color="000000"/>
-              <w:bottom w:val="single" w:sz="4" w:space="0" w:color="000000"/>
-              <w:right w:val="single" w:sz="4" w:space="0" w:color="000000"/>
-            </w:tcBorders>
-            <w:shd w:val="clear" w:color="auto" w:fill="auto"/>
-            <w:tcMar>
-              <w:top w:w="0" w:type="dxa"/>
-              <w:left w:w="70" w:type="dxa"/>
-              <w:bottom w:w="0" w:type="dxa"/>
-              <w:right w:w="70" w:type="dxa"/>
-            </w:tcMar>
-          </w:tcPr>
-          <w:p>
-            <w:pPr>
-              <w:pStyle w:val="Textoindependiente2"/>
-              <w:spacing w:line="240" w:lineRule="auto"/>
-              <w:rPr>
-                <w:rFonts w:ascii="Arial" w:hAnsi="Arial" w:cs="Arial"/>
-                <w:szCs w:val="24"/>
-              </w:rPr>
-            </w:pPr>
-            <w:r>
-              <w:rPr>
-                <w:rFonts w:ascii="Arial" w:hAnsi="Arial" w:cs="Arial"/>
-                <w:szCs w:val="24"/>
-              </w:rPr>
-              <w:t>C</w:t>
-            </w:r>
-            <w:r>
-              <w:rPr>
-                <w:rFonts w:ascii="Arial" w:hAnsi="Arial" w:cs="Arial"/>
-                <w:szCs w:val="24"/>
-              </w:rPr>
-              <w:t>ontrato</w:t>
-            </w:r>
-            <w:r>
-              <w:rPr>
-                <w:rFonts w:ascii="Arial" w:hAnsi="Arial" w:cs="Arial"/>
-                <w:szCs w:val="24"/>
-              </w:rPr>
-              <w:t xml:space="preserve"> u Orden de compra y/o servicio</w:t>
-            </w:r>
-            <w:r>
-              <w:rPr>
-                <w:rFonts w:ascii="Arial" w:hAnsi="Arial" w:cs="Arial"/>
-                <w:szCs w:val="24"/>
-              </w:rPr>
-              <w:t xml:space="preserve"> </w:t>
-            </w:r>
-            <w:r>
-              <w:rPr>
-                <w:rFonts w:ascii="Arial" w:hAnsi="Arial" w:cs="Arial"/>
-                <w:szCs w:val="24"/>
-              </w:rPr>
-              <w:t xml:space="preserve">o </w:t>
-            </w:r>
-            <w:r>
-              <w:rPr>
-                <w:rFonts w:ascii="Arial" w:hAnsi="Arial" w:cs="Arial"/>
-                <w:szCs w:val="24"/>
-                <w:lang w:val="es-ES"/>
-              </w:rPr>
-              <w:t>Aceptación</w:t>
-            </w:r>
-            <w:r>
-              <w:rPr>
-                <w:rFonts w:ascii="Arial" w:hAnsi="Arial" w:cs="Arial"/>
-                <w:szCs w:val="24"/>
-              </w:rPr>
-              <w:t xml:space="preserve"> de oferta </w:t>
-            </w:r>
-            <w:r>
-              <w:rPr>
-                <w:rFonts w:ascii="Arial" w:hAnsi="Arial" w:cs="Arial"/>
-                <w:szCs w:val="24"/>
-              </w:rPr>
-              <w:t>No.</w:t>
-            </w:r>
-          </w:p>
-          <w:p>
-            <w:pPr>
-              <w:pStyle w:val="Textoindependiente2"/>
-              <w:spacing w:line="240" w:lineRule="auto"/>
-              <w:rPr>
-                <w:rFonts w:ascii="Arial" w:hAnsi="Arial" w:cs="Arial"/>
-                <w:szCs w:val="24"/>
-              </w:rPr>
-            </w:pPr>
-          </w:p>
-          <w:p>
-            <w:pPr>
-              <w:pStyle w:val="Textoindependiente2"/>
-              <w:tabs>
-                <w:tab w:val="left" w:pos="2475"/>
-              </w:tabs>
-              <w:spacing w:line="240" w:lineRule="auto"/>
-              <w:rPr>
-                <w:rFonts w:ascii="Arial" w:hAnsi="Arial" w:cs="Arial"/>
-                <w:szCs w:val="24"/>
-              </w:rPr>
-            </w:pPr>
-            <w:r>
-              <w:rPr>
-                <w:rFonts w:ascii="Arial" w:hAnsi="Arial" w:cs="Arial"/>
-                <w:szCs w:val="24"/>
-              </w:rPr>
-              <w:tab/>
-            </w:r>
-          </w:p>
-        </w:tc>
-      </w:tr>
-      <w:tr>
-        <w:tc>
-          <w:tcPr>
-            <w:tcW w:w="9639" w:type="dxa"/>
-            <w:gridSpan w:val="4"/>
-            <w:tcBorders>
-              <w:top w:val="single" w:sz="4" w:space="0" w:color="000000"/>
-              <w:left w:val="single" w:sz="4" w:space="0" w:color="000000"/>
-              <w:bottom w:val="single" w:sz="4" w:space="0" w:color="000000"/>
-              <w:right w:val="single" w:sz="4" w:space="0" w:color="000000"/>
-            </w:tcBorders>
-            <w:shd w:val="clear" w:color="auto" w:fill="auto"/>
-            <w:tcMar>
-              <w:top w:w="0" w:type="dxa"/>
-              <w:left w:w="70" w:type="dxa"/>
-              <w:bottom w:w="0" w:type="dxa"/>
-              <w:right w:w="70" w:type="dxa"/>
-            </w:tcMar>
-          </w:tcPr>
-          <w:p>
-            <w:pPr>
-              <w:pStyle w:val="Textoindependiente2"/>
-              <w:spacing w:line="240" w:lineRule="auto"/>
-              <w:jc w:val="left"/>
-              <w:rPr>
-                <w:rFonts w:ascii="Arial" w:hAnsi="Arial" w:cs="Arial"/>
-                <w:szCs w:val="24"/>
-              </w:rPr>
-            </w:pPr>
-            <w:r>
-              <w:rPr>
-                <w:rFonts w:ascii="Arial" w:hAnsi="Arial" w:cs="Arial"/>
-                <w:szCs w:val="24"/>
-              </w:rPr>
-              <w:t>N</w:t>
-            </w:r>
-            <w:r>
-              <w:rPr>
-                <w:rFonts w:ascii="Arial" w:hAnsi="Arial" w:cs="Arial"/>
-                <w:szCs w:val="24"/>
-              </w:rPr>
-              <w:t xml:space="preserve">ombre del contratista: </w:t>
-            </w:r>
-          </w:p>
-          <w:p>
-            <w:pPr>
-              <w:pStyle w:val="Textoindependiente2"/>
-              <w:spacing w:line="240" w:lineRule="auto"/>
-              <w:jc w:val="left"/>
-              <w:rPr>
-                <w:rFonts w:ascii="Arial" w:hAnsi="Arial" w:cs="Arial"/>
-                <w:szCs w:val="24"/>
-              </w:rPr>
-            </w:pPr>
-          </w:p>
-          <w:p>
-            <w:pPr>
-              <w:pStyle w:val="Textoindependiente2"/>
-              <w:spacing w:line="240" w:lineRule="auto"/>
-              <w:jc w:val="left"/>
-              <w:rPr>
-                <w:rFonts w:ascii="Arial" w:hAnsi="Arial" w:cs="Arial"/>
-                <w:szCs w:val="24"/>
-              </w:rPr>
-            </w:pPr>
-          </w:p>
-        </w:tc>
-      </w:tr>
-      <w:tr>
-        <w:trPr>
-          <w:cantSplit/>
-        </w:trPr>
-        <w:tc>
-          <w:tcPr>
-            <w:tcW w:w="9639" w:type="dxa"/>
-            <w:gridSpan w:val="4"/>
-            <w:tcBorders>
-              <w:top w:val="single" w:sz="4" w:space="0" w:color="000000"/>
-              <w:left w:val="single" w:sz="4" w:space="0" w:color="000000"/>
-              <w:bottom w:val="single" w:sz="4" w:space="0" w:color="000000"/>
-              <w:right w:val="single" w:sz="4" w:space="0" w:color="000000"/>
-            </w:tcBorders>
-            <w:shd w:val="clear" w:color="auto" w:fill="auto"/>
-            <w:tcMar>
-              <w:top w:w="0" w:type="dxa"/>
-              <w:left w:w="70" w:type="dxa"/>
-              <w:bottom w:w="0" w:type="dxa"/>
-              <w:right w:w="70" w:type="dxa"/>
-            </w:tcMar>
-          </w:tcPr>
-          <w:p>
-            <w:pPr>
-              <w:pStyle w:val="Textoindependiente2"/>
-              <w:spacing w:line="240" w:lineRule="auto"/>
-              <w:rPr>
-                <w:rFonts w:ascii="Arial" w:hAnsi="Arial" w:cs="Arial"/>
-                <w:szCs w:val="24"/>
-              </w:rPr>
-            </w:pPr>
-            <w:r>
-              <w:rPr>
-                <w:rFonts w:ascii="Arial" w:hAnsi="Arial" w:cs="Arial"/>
-                <w:szCs w:val="24"/>
-              </w:rPr>
-              <w:t xml:space="preserve">Documento de </w:t>
-            </w:r>
-            <w:r>
-              <w:rPr>
-                <w:rFonts w:ascii="Arial" w:hAnsi="Arial" w:cs="Arial"/>
-                <w:szCs w:val="24"/>
-              </w:rPr>
-              <w:t>i</w:t>
-            </w:r>
-            <w:r>
-              <w:rPr>
-                <w:rFonts w:ascii="Arial" w:hAnsi="Arial" w:cs="Arial"/>
-                <w:szCs w:val="24"/>
-              </w:rPr>
-              <w:t>dentificación del Contratista</w:t>
-            </w:r>
-            <w:r>
-              <w:rPr>
-                <w:rFonts w:ascii="Arial" w:hAnsi="Arial" w:cs="Arial"/>
-                <w:szCs w:val="24"/>
-              </w:rPr>
-              <w:t xml:space="preserve">: </w:t>
-            </w:r>
-          </w:p>
-          <w:p>
-            <w:pPr>
-              <w:pStyle w:val="Textoindependiente2"/>
-              <w:spacing w:line="240" w:lineRule="auto"/>
-              <w:rPr>
-                <w:rFonts w:ascii="Arial" w:hAnsi="Arial" w:cs="Arial"/>
-                <w:szCs w:val="24"/>
-              </w:rPr>
-            </w:pPr>
-          </w:p>
-          <w:p>
-            <w:pPr>
-              <w:pStyle w:val="Textoindependiente2"/>
-              <w:spacing w:line="240" w:lineRule="auto"/>
-              <w:rPr>
-                <w:rFonts w:ascii="Arial" w:hAnsi="Arial" w:cs="Arial"/>
-                <w:szCs w:val="24"/>
-              </w:rPr>
-            </w:pPr>
-          </w:p>
-        </w:tc>
-      </w:tr>
-      <w:tr>
-        <w:tc>
-          <w:tcPr>
-            <w:tcW w:w="9639" w:type="dxa"/>
-            <w:gridSpan w:val="4"/>
-            <w:tcBorders>
-              <w:top w:val="single" w:sz="4" w:space="0" w:color="000000"/>
-              <w:left w:val="single" w:sz="4" w:space="0" w:color="000000"/>
-              <w:bottom w:val="single" w:sz="4" w:space="0" w:color="000000"/>
-              <w:right w:val="single" w:sz="4" w:space="0" w:color="000000"/>
-            </w:tcBorders>
-            <w:shd w:val="clear" w:color="auto" w:fill="auto"/>
-            <w:tcMar>
-              <w:top w:w="0" w:type="dxa"/>
-              <w:left w:w="70" w:type="dxa"/>
-              <w:bottom w:w="0" w:type="dxa"/>
-              <w:right w:w="70" w:type="dxa"/>
-            </w:tcMar>
-          </w:tcPr>
-          <w:p>
-            <w:pPr>
-              <w:jc w:val="both"/>
-              <w:rPr>
-                <w:rFonts w:ascii="Arial" w:hAnsi="Arial" w:cs="Arial"/>
-                <w:sz w:val="24"/>
-                <w:szCs w:val="24"/>
-              </w:rPr>
-            </w:pPr>
-            <w:r>
-              <w:rPr>
-                <w:rFonts w:ascii="Arial" w:hAnsi="Arial" w:cs="Arial"/>
-                <w:sz w:val="24"/>
-                <w:szCs w:val="24"/>
-              </w:rPr>
-              <w:t>N</w:t>
-            </w:r>
-            <w:r>
-              <w:rPr>
-                <w:rFonts w:ascii="Arial" w:hAnsi="Arial" w:cs="Arial"/>
-                <w:sz w:val="24"/>
-                <w:szCs w:val="24"/>
-              </w:rPr>
-              <w:t>ombre (s) del supervisor (es):</w:t>
-            </w:r>
-          </w:p>
-          <w:p>
-            <w:pPr>
-              <w:jc w:val="both"/>
-              <w:rPr>
-                <w:rFonts w:ascii="Arial" w:hAnsi="Arial" w:cs="Arial"/>
-                <w:sz w:val="24"/>
-                <w:szCs w:val="24"/>
-              </w:rPr>
-            </w:pPr>
-          </w:p>
-          <w:p>
-            <w:pPr>
-              <w:jc w:val="both"/>
-              <w:rPr>
-                <w:rFonts w:ascii="Arial" w:hAnsi="Arial" w:cs="Arial"/>
-                <w:sz w:val="24"/>
-                <w:szCs w:val="24"/>
-              </w:rPr>
-            </w:pPr>
-          </w:p>
-        </w:tc>
-      </w:tr>
-      <w:tr>
-        <w:tc>
-          <w:tcPr>
-            <w:tcW w:w="5037" w:type="dxa"/>
+            <w:tcW w:w="5000" w:type="pct"/>
             <w:gridSpan w:val="3"/>
             <w:tcBorders>
               <w:top w:val="single" w:sz="4" w:space="0" w:color="000000"/>
@@ -779,34 +498,93 @@
           </w:tcPr>
           <w:p>
             <w:pPr>
-              <w:jc w:val="both"/>
-              <w:rPr>
-                <w:rFonts w:ascii="Arial" w:hAnsi="Arial" w:cs="Arial"/>
-                <w:sz w:val="24"/>
-                <w:szCs w:val="24"/>
-              </w:rPr>
-            </w:pPr>
-            <w:r>
-              <w:rPr>
-                <w:rFonts w:ascii="Arial" w:hAnsi="Arial" w:cs="Arial"/>
-                <w:sz w:val="24"/>
-                <w:szCs w:val="24"/>
-              </w:rPr>
-              <w:t>O</w:t>
-            </w:r>
-            <w:r>
-              <w:rPr>
-                <w:rFonts w:ascii="Arial" w:hAnsi="Arial" w:cs="Arial"/>
-                <w:sz w:val="24"/>
-                <w:szCs w:val="24"/>
-              </w:rPr>
-              <w:t xml:space="preserve">rganismo: </w:t>
+              <w:pStyle w:val="Textoindependiente2"/>
+              <w:spacing w:line="240" w:lineRule="auto"/>
+              <w:rPr>
+                <w:rFonts w:ascii="Arial" w:hAnsi="Arial" w:cs="Arial"/>
+                <w:szCs w:val="24"/>
+              </w:rPr>
+            </w:pPr>
+            <w:r>
+              <w:rPr>
+                <w:rFonts w:ascii="Arial" w:hAnsi="Arial" w:cs="Arial"/>
+                <w:szCs w:val="24"/>
+              </w:rPr>
+              <w:t>C</w:t>
+            </w:r>
+            <w:r>
+              <w:rPr>
+                <w:rFonts w:ascii="Arial" w:hAnsi="Arial" w:cs="Arial"/>
+                <w:szCs w:val="24"/>
+              </w:rPr>
+              <w:t>ontrato</w:t>
+            </w:r>
+            <w:r>
+              <w:rPr>
+                <w:rFonts w:ascii="Arial" w:hAnsi="Arial" w:cs="Arial"/>
+                <w:szCs w:val="24"/>
+              </w:rPr>
+              <w:t xml:space="preserve"> </w:t>
+            </w:r>
+            <w:r>
+              <w:rPr>
+                <w:rFonts w:ascii="Arial" w:hAnsi="Arial" w:cs="Arial"/>
+                <w:szCs w:val="24"/>
+              </w:rPr>
+              <w:t>No.</w:t>
+            </w:r>
+            <w:r>
+              <w:rPr>
+                <w:rFonts w:ascii="Arial" w:hAnsi="Arial" w:cs="Arial"/>
+                <w:szCs w:val="24"/>
+              </w:rPr>
+              <w:t xml:space="preserve"> </w:t>
+            </w:r>
+            <w:r>
+              <w:rPr>
+                <w:rFonts w:ascii="Arial" w:hAnsi="Arial" w:cs="Arial"/>
+                <w:szCs w:val="24"/>
+              </w:rPr>
+              <w:t>${NUMERO_CONTRATO}</w:t>
+            </w:r>
+          </w:p>
+          <w:p>
+            <w:pPr>
+              <w:pStyle w:val="Textoindependiente2"/>
+              <w:spacing w:line="240" w:lineRule="auto"/>
+              <w:rPr>
+                <w:rFonts w:ascii="Arial" w:hAnsi="Arial" w:cs="Arial"/>
+                <w:szCs w:val="24"/>
+              </w:rPr>
+            </w:pPr>
+          </w:p>
+          <w:p>
+            <w:pPr>
+              <w:pStyle w:val="Textoindependiente2"/>
+              <w:tabs>
+                <w:tab w:val="left" w:pos="2475"/>
+              </w:tabs>
+              <w:spacing w:line="240" w:lineRule="auto"/>
+              <w:rPr>
+                <w:rFonts w:ascii="Arial" w:hAnsi="Arial" w:cs="Arial"/>
+                <w:szCs w:val="24"/>
+              </w:rPr>
+            </w:pPr>
+            <w:r>
+              <w:rPr>
+                <w:rFonts w:ascii="Arial" w:hAnsi="Arial" w:cs="Arial"/>
+                <w:szCs w:val="24"/>
+              </w:rPr>
+              <w:tab/>
             </w:r>
           </w:p>
         </w:tc>
+      </w:tr>
+      <w:tr>
         <w:tc>
           <w:tcPr>
-            <w:tcW w:w="4602" w:type="dxa"/>
+            <w:tcW w:w="5000" w:type="pct"/>
+            <w:gridSpan w:val="3"/>
             <w:tcBorders>
               <w:top w:val="single" w:sz="4" w:space="0" w:color="000000"/>
               <w:left w:val="single" w:sz="4" w:space="0" w:color="000000"/>
@@ -823,17 +601,17 @@
           </w:tcPr>
           <w:p>
             <w:pPr>
-              <w:jc w:val="both"/>
-              <w:rPr>
-                <w:rFonts w:ascii="Arial" w:hAnsi="Arial" w:cs="Arial"/>
-                <w:sz w:val="24"/>
-                <w:szCs w:val="24"/>
-              </w:rPr>
-            </w:pPr>
-            <w:r>
-              <w:rPr>
-                <w:rFonts w:ascii="Arial" w:hAnsi="Arial" w:cs="Arial"/>
-                <w:sz w:val="24"/>
+              <w:pStyle w:val="Textoindependiente2"/>
+              <w:spacing w:line="240" w:lineRule="auto"/>
+              <w:jc w:val="left"/>
+              <w:rPr>
+                <w:rFonts w:ascii="Arial" w:hAnsi="Arial" w:cs="Arial"/>
+                <w:szCs w:val="24"/>
+              </w:rPr>
+            </w:pPr>
+            <w:r>
+              <w:rPr>
+                <w:rFonts w:ascii="Arial" w:hAnsi="Arial" w:cs="Arial"/>
                 <w:szCs w:val="24"/>
               </w:rPr>
               <w:t>N</w:t>
@@ -841,44 +619,29 @@
             <w:r>
               <w:rPr>
                 <w:rFonts w:ascii="Arial" w:hAnsi="Arial" w:cs="Arial"/>
-                <w:sz w:val="24"/>
-                <w:szCs w:val="24"/>
-              </w:rPr>
-              <w:t xml:space="preserve">o. </w:t>
-            </w:r>
-            <w:r>
-              <w:rPr>
-                <w:rFonts w:ascii="Arial" w:hAnsi="Arial" w:cs="Arial"/>
-                <w:sz w:val="24"/>
-                <w:szCs w:val="24"/>
-              </w:rPr>
-              <w:t>T</w:t>
-            </w:r>
-            <w:r>
-              <w:rPr>
-                <w:rFonts w:ascii="Arial" w:hAnsi="Arial" w:cs="Arial"/>
-                <w:sz w:val="24"/>
-                <w:szCs w:val="24"/>
-              </w:rPr>
-              <w:t>eléfono:</w:t>
-            </w:r>
-          </w:p>
-          <w:p>
-            <w:pPr>
-              <w:jc w:val="both"/>
-              <w:rPr>
-                <w:rFonts w:ascii="Arial" w:hAnsi="Arial" w:cs="Arial"/>
-                <w:sz w:val="24"/>
-                <w:szCs w:val="24"/>
-              </w:rPr>
-            </w:pPr>
-          </w:p>
-          <w:p>
-            <w:pPr>
-              <w:jc w:val="both"/>
-              <w:rPr>
-                <w:rFonts w:ascii="Arial" w:hAnsi="Arial" w:cs="Arial"/>
-                <w:sz w:val="24"/>
+                <w:szCs w:val="24"/>
+              </w:rPr>
+              <w:t>ombre del contratista:  ${CONTRATISTA_NOMBRE}</w:t>
+            </w:r>
+          </w:p>
+          <w:p>
+            <w:pPr>
+              <w:pStyle w:val="Textoindependiente2"/>
+              <w:spacing w:line="240" w:lineRule="auto"/>
+              <w:jc w:val="left"/>
+              <w:rPr>
+                <w:rFonts w:ascii="Arial" w:hAnsi="Arial" w:cs="Arial"/>
+                <w:szCs w:val="24"/>
+              </w:rPr>
+            </w:pPr>
+          </w:p>
+          <w:p>
+            <w:pPr>
+              <w:pStyle w:val="Textoindependiente2"/>
+              <w:spacing w:line="240" w:lineRule="auto"/>
+              <w:jc w:val="left"/>
+              <w:rPr>
+                <w:rFonts w:ascii="Arial" w:hAnsi="Arial" w:cs="Arial"/>
                 <w:szCs w:val="24"/>
               </w:rPr>
             </w:pPr>
@@ -887,12 +650,12 @@
       </w:tr>
       <w:tr>
         <w:trPr>
-          <w:trHeight w:val="641"/>
+          <w:cantSplit/>
         </w:trPr>
         <w:tc>
           <w:tcPr>
-            <w:tcW w:w="9639" w:type="dxa"/>
-            <w:gridSpan w:val="4"/>
+            <w:tcW w:w="5000" w:type="pct"/>
+            <w:gridSpan w:val="3"/>
             <w:tcBorders>
               <w:top w:val="single" w:sz="4" w:space="0" w:color="000000"/>
               <w:left w:val="single" w:sz="4" w:space="0" w:color="000000"/>
@@ -921,28 +684,235 @@
                 <w:rFonts w:ascii="Arial" w:hAnsi="Arial" w:cs="Arial"/>
                 <w:szCs w:val="24"/>
               </w:rPr>
+              <w:t xml:space="preserve">Documento de </w:t>
+            </w:r>
+            <w:r>
+              <w:rPr>
+                <w:rFonts w:ascii="Arial" w:hAnsi="Arial" w:cs="Arial"/>
+                <w:szCs w:val="24"/>
+              </w:rPr>
+              <w:t>i</w:t>
+            </w:r>
+            <w:r>
+              <w:rPr>
+                <w:rFonts w:ascii="Arial" w:hAnsi="Arial" w:cs="Arial"/>
+                <w:szCs w:val="24"/>
+              </w:rPr>
+              <w:t>dentificación del Contratista</w:t>
+            </w:r>
+            <w:r>
+              <w:rPr>
+                <w:rFonts w:ascii="Arial" w:hAnsi="Arial" w:cs="Arial"/>
+                <w:szCs w:val="24"/>
+              </w:rPr>
+              <w:t xml:space="preserve">: </w:t>
+            </w:r>
+            <w:r>
+              <w:rPr>
+                <w:rFonts w:ascii="Arial" w:hAnsi="Arial" w:cs="Arial"/>
+                <w:szCs w:val="24"/>
+              </w:rPr>
+              <w:t>${CONTRATISTA_CEDULA}</w:t>
+            </w:r>
+          </w:p>
+          <w:p>
+            <w:pPr>
+              <w:pStyle w:val="Textoindependiente2"/>
+              <w:spacing w:line="240" w:lineRule="auto"/>
+              <w:rPr>
+                <w:rFonts w:ascii="Arial" w:hAnsi="Arial" w:cs="Arial"/>
+                <w:szCs w:val="24"/>
+              </w:rPr>
+            </w:pPr>
+          </w:p>
+          <w:p>
+            <w:pPr>
+              <w:pStyle w:val="Textoindependiente2"/>
+              <w:spacing w:line="240" w:lineRule="auto"/>
+              <w:rPr>
+                <w:rFonts w:ascii="Arial" w:hAnsi="Arial" w:cs="Arial"/>
+                <w:szCs w:val="24"/>
+              </w:rPr>
+            </w:pPr>
+          </w:p>
+        </w:tc>
+      </w:tr>
+      <w:tr>
+        <w:tc>
+          <w:tcPr>
+            <w:tcW w:w="5000" w:type="pct"/>
+            <w:gridSpan w:val="3"/>
+            <w:tcBorders>
+              <w:top w:val="single" w:sz="4" w:space="0" w:color="000000"/>
+              <w:left w:val="single" w:sz="4" w:space="0" w:color="000000"/>
+              <w:bottom w:val="single" w:sz="4" w:space="0" w:color="000000"/>
+              <w:right w:val="single" w:sz="4" w:space="0" w:color="000000"/>
+            </w:tcBorders>
+            <w:shd w:val="clear" w:color="auto" w:fill="auto"/>
+            <w:tcMar>
+              <w:top w:w="0" w:type="dxa"/>
+              <w:left w:w="70" w:type="dxa"/>
+              <w:bottom w:w="0" w:type="dxa"/>
+              <w:right w:w="70" w:type="dxa"/>
+            </w:tcMar>
+          </w:tcPr>
+          <w:p>
+            <w:pPr>
+              <w:jc w:val="both"/>
+              <w:rPr>
+                <w:rFonts w:ascii="Arial" w:hAnsi="Arial" w:cs="Arial"/>
+                <w:sz w:val="24"/>
+                <w:szCs w:val="24"/>
+              </w:rPr>
+            </w:pPr>
+            <w:r>
+              <w:rPr>
+                <w:rFonts w:ascii="Arial" w:hAnsi="Arial" w:cs="Arial"/>
+                <w:sz w:val="24"/>
+                <w:szCs w:val="24"/>
+              </w:rPr>
+              <w:t>N</w:t>
+            </w:r>
+            <w:r>
+              <w:rPr>
+                <w:rFonts w:ascii="Arial" w:hAnsi="Arial" w:cs="Arial"/>
+                <w:sz w:val="24"/>
+                <w:szCs w:val="24"/>
+              </w:rPr>
+              <w:t>ombre (s) del supervisor (es): ${NOMBRE_SUPERVISOR}</w:t>
+            </w:r>
+          </w:p>
+          <w:p>
+            <w:pPr>
+              <w:jc w:val="both"/>
+              <w:rPr>
+                <w:rFonts w:ascii="Arial" w:hAnsi="Arial" w:cs="Arial"/>
+                <w:sz w:val="24"/>
+                <w:szCs w:val="24"/>
+              </w:rPr>
+            </w:pPr>
+          </w:p>
+          <w:p>
+            <w:pPr>
+              <w:jc w:val="both"/>
+              <w:rPr>
+                <w:rFonts w:ascii="Arial" w:hAnsi="Arial" w:cs="Arial"/>
+                <w:sz w:val="24"/>
+                <w:szCs w:val="24"/>
+              </w:rPr>
+            </w:pPr>
+          </w:p>
+        </w:tc>
+      </w:tr>
+      <w:tr>
+        <w:tc>
+          <w:tcPr>
+            <w:tcW w:w="5000" w:type="pct"/>
+            <w:gridSpan w:val="3"/>
+            <w:tcBorders>
+              <w:top w:val="single" w:sz="4" w:space="0" w:color="000000"/>
+              <w:left w:val="single" w:sz="4" w:space="0" w:color="000000"/>
+              <w:bottom w:val="single" w:sz="4" w:space="0" w:color="000000"/>
+              <w:right w:val="single" w:sz="4" w:space="0" w:color="000000"/>
+            </w:tcBorders>
+            <w:shd w:val="clear" w:color="auto" w:fill="auto"/>
+            <w:tcMar>
+              <w:top w:w="0" w:type="dxa"/>
+              <w:left w:w="70" w:type="dxa"/>
+              <w:bottom w:w="0" w:type="dxa"/>
+              <w:right w:w="70" w:type="dxa"/>
+            </w:tcMar>
+          </w:tcPr>
+          <w:p>
+            <w:pPr>
+              <w:jc w:val="both"/>
+              <w:rPr>
+                <w:rFonts w:ascii="Arial" w:hAnsi="Arial" w:cs="Arial"/>
+                <w:sz w:val="24"/>
+                <w:szCs w:val="24"/>
+              </w:rPr>
+            </w:pPr>
+            <w:r>
+              <w:rPr>
+                <w:rFonts w:ascii="Arial" w:hAnsi="Arial" w:cs="Arial"/>
+                <w:sz w:val="24"/>
+                <w:szCs w:val="24"/>
+              </w:rPr>
               <w:t>O</w:t>
             </w:r>
             <w:r>
               <w:rPr>
                 <w:rFonts w:ascii="Arial" w:hAnsi="Arial" w:cs="Arial"/>
-                <w:szCs w:val="24"/>
-              </w:rPr>
-              <w:t>bjeto</w:t>
-            </w:r>
-            <w:r>
-              <w:rPr>
-                <w:rFonts w:ascii="Arial" w:hAnsi="Arial" w:cs="Arial"/>
-                <w:szCs w:val="24"/>
-              </w:rPr>
-              <w:t xml:space="preserve"> del contrato</w:t>
-            </w:r>
-            <w:r>
-              <w:rPr>
-                <w:rFonts w:ascii="Arial" w:hAnsi="Arial" w:cs="Arial"/>
-                <w:szCs w:val="24"/>
-              </w:rPr>
-              <w:t xml:space="preserve"> u Orden de compra y/o servicio</w:t>
+                <w:sz w:val="24"/>
+                <w:szCs w:val="24"/>
+              </w:rPr>
+              <w:t xml:space="preserve">rganismo: </w:t>
+            </w:r>
+            <w:r>
+              <w:rPr>
+                <w:rFonts w:ascii="Arial" w:hAnsi="Arial" w:cs="Arial"/>
+                <w:sz w:val="24"/>
+                <w:szCs w:val="24"/>
+              </w:rPr>
+              <w:t>${ORGANISMO}</w:t>
+            </w:r>
+          </w:p>
+          <w:p>
+            <w:pPr>
+              <w:jc w:val="both"/>
+              <w:rPr>
+                <w:rFonts w:ascii="Arial" w:hAnsi="Arial" w:cs="Arial"/>
+                <w:sz w:val="24"/>
+                <w:szCs w:val="24"/>
+              </w:rPr>
+            </w:pPr>
+          </w:p>
+        </w:tc>
+      </w:tr>
+      <w:tr>
+        <w:trPr>
+          <w:trHeight w:val="641"/>
+        </w:trPr>
+        <w:tc>
+          <w:tcPr>
+            <w:tcW w:w="5000" w:type="pct"/>
+            <w:gridSpan w:val="3"/>
+            <w:tcBorders>
+              <w:top w:val="single" w:sz="4" w:space="0" w:color="000000"/>
+              <w:left w:val="single" w:sz="4" w:space="0" w:color="000000"/>
+              <w:bottom w:val="single" w:sz="4" w:space="0" w:color="000000"/>
+              <w:right w:val="single" w:sz="4" w:space="0" w:color="000000"/>
+            </w:tcBorders>
+            <w:shd w:val="clear" w:color="auto" w:fill="auto"/>
+            <w:tcMar>
+              <w:top w:w="0" w:type="dxa"/>
+              <w:left w:w="70" w:type="dxa"/>
+              <w:bottom w:w="0" w:type="dxa"/>
+              <w:right w:w="70" w:type="dxa"/>
+            </w:tcMar>
+          </w:tcPr>
+          <w:p>
+            <w:pPr>
+              <w:pStyle w:val="Textoindependiente2"/>
+              <w:spacing w:line="240" w:lineRule="auto"/>
+              <w:rPr>
+                <w:rFonts w:ascii="Arial" w:hAnsi="Arial" w:cs="Arial"/>
+                <w:szCs w:val="24"/>
+              </w:rPr>
+            </w:pPr>
+            <w:r>
+              <w:rPr>
+                <w:rFonts w:ascii="Arial" w:hAnsi="Arial" w:cs="Arial"/>
+                <w:szCs w:val="24"/>
+              </w:rPr>
+              <w:t>Objeto del contrato</w:t>
+            </w:r>
+            <w:r>
+              <w:rPr>
+                <w:rFonts w:ascii="Arial" w:hAnsi="Arial" w:cs="Arial"/>
+                <w:szCs w:val="24"/>
+              </w:rPr>
+              <w:t>:</w:t>
             </w:r>
             <w:r>
               <w:rPr>
@@ -956,28 +926,7 @@
                 <w:rFonts w:ascii="Arial" w:hAnsi="Arial" w:cs="Arial"/>
                 <w:szCs w:val="24"/>
               </w:rPr>
-              <w:t>o A</w:t>
-            </w:r>
-            <w:r>
-              <w:rPr>
-                <w:rFonts w:ascii="Arial" w:hAnsi="Arial" w:cs="Arial"/>
-                <w:szCs w:val="24"/>
-              </w:rPr>
-              <w:t xml:space="preserve">ceptación de oferta </w:t>
-            </w:r>
-            <w:r>
-              <w:rPr>
-                <w:rFonts w:ascii="Arial" w:hAnsi="Arial" w:cs="Arial"/>
-                <w:szCs w:val="24"/>
-              </w:rPr>
-              <w:t>No.</w:t>
-            </w:r>
-            <w:r>
-              <w:rPr>
-                <w:rFonts w:ascii="Arial" w:hAnsi="Arial" w:cs="Arial"/>
-                <w:szCs w:val="24"/>
-              </w:rPr>
-              <w:t>:</w:t>
+              <w:t>${OBJETO_CONTRACTUAL}</w:t>
             </w:r>
           </w:p>
           <w:p>
@@ -998,8 +947,8 @@
         </w:trPr>
         <w:tc>
           <w:tcPr>
-            <w:tcW w:w="9639" w:type="dxa"/>
-            <w:gridSpan w:val="4"/>
+            <w:tcW w:w="5000" w:type="pct"/>
+            <w:gridSpan w:val="3"/>
             <w:tcBorders>
               <w:top w:val="single" w:sz="4" w:space="0" w:color="000000"/>
               <w:left w:val="single" w:sz="4" w:space="0" w:color="000000"/>
@@ -1051,7 +1000,7 @@
         </w:trPr>
         <w:tc>
           <w:tcPr>
-            <w:tcW w:w="4962" w:type="dxa"/>
+            <w:tcW w:w="2613" w:type="pct"/>
             <w:gridSpan w:val="2"/>
             <w:tcBorders>
               <w:top w:val="single" w:sz="4" w:space="0" w:color="000000"/>
@@ -1098,14 +1047,14 @@
             <w:r>
               <w:rPr>
                 <w:rFonts w:ascii="Arial" w:eastAsia="Arial" w:hAnsi="Arial" w:cs="Arial"/>
-                <w:sz w:val="22"/>
+                <w:szCs w:val="24"/>
               </w:rPr>
               <w:t>${FECHA_INICIO_PERIODO}</w:t>
             </w:r>
             <w:r>
               <w:rPr>
                 <w:rFonts w:ascii="Arial" w:eastAsia="Arial" w:hAnsi="Arial" w:cs="Arial"/>
-                <w:sz w:val="22"/>
+                <w:szCs w:val="24"/>
               </w:rPr>
               <w:t xml:space="preserve"> </w:t>
             </w:r>
@@ -1113,8 +1062,7 @@
         </w:tc>
         <w:tc>
           <w:tcPr>
-            <w:tcW w:w="4677" w:type="dxa"/>
-            <w:gridSpan w:val="2"/>
+            <w:tcW w:w="2387" w:type="pct"/>
             <w:tcBorders>
               <w:top w:val="single" w:sz="4" w:space="0" w:color="000000"/>
               <w:left w:val="single" w:sz="4" w:space="0" w:color="000000"/>
@@ -1161,13 +1109,31 @@
               <w:t>erminación</w:t>
             </w:r>
           </w:p>
+          <w:p>
+            <w:pPr>
+              <w:pStyle w:val="Textoindependiente2"/>
+              <w:spacing w:line="240" w:lineRule="auto"/>
+              <w:jc w:val="center"/>
+              <w:rPr>
+                <w:rFonts w:ascii="Arial" w:hAnsi="Arial" w:cs="Arial"/>
+                <w:szCs w:val="24"/>
+              </w:rPr>
+            </w:pPr>
+            <w:r>
+              <w:rPr>
+                <w:rFonts w:ascii="Arial" w:hAnsi="Arial" w:cs="Arial"/>
+                <w:szCs w:val="24"/>
+              </w:rPr>
+              <w:t>${FECHA_FIN_PERIODO}</w:t>
+            </w:r>
+          </w:p>
         </w:tc>
       </w:tr>
       <w:tr>
         <w:tc>
           <w:tcPr>
-            <w:tcW w:w="9639" w:type="dxa"/>
-            <w:gridSpan w:val="4"/>
+            <w:tcW w:w="5000" w:type="pct"/>
+            <w:gridSpan w:val="3"/>
             <w:tcBorders>
               <w:top w:val="single" w:sz="4" w:space="0" w:color="000000"/>
               <w:left w:val="single" w:sz="4" w:space="0" w:color="000000"/>
@@ -1221,8 +1187,8 @@
       <w:tr>
         <w:tc>
           <w:tcPr>
-            <w:tcW w:w="9639" w:type="dxa"/>
-            <w:gridSpan w:val="4"/>
+            <w:tcW w:w="5000" w:type="pct"/>
+            <w:gridSpan w:val="3"/>
             <w:tcBorders>
               <w:top w:val="single" w:sz="4" w:space="0" w:color="000000"/>
               <w:left w:val="single" w:sz="4" w:space="0" w:color="000000"/>
@@ -1276,8 +1242,8 @@
       <w:tr>
         <w:tc>
           <w:tcPr>
-            <w:tcW w:w="9639" w:type="dxa"/>
-            <w:gridSpan w:val="4"/>
+            <w:tcW w:w="5000" w:type="pct"/>
+            <w:gridSpan w:val="3"/>
             <w:tcBorders>
               <w:top w:val="single" w:sz="4" w:space="0" w:color="000000"/>
               <w:left w:val="single" w:sz="4" w:space="0" w:color="000000"/>
@@ -1331,8 +1297,8 @@
       <w:tr>
         <w:tc>
           <w:tcPr>
-            <w:tcW w:w="9639" w:type="dxa"/>
-            <w:gridSpan w:val="4"/>
+            <w:tcW w:w="5000" w:type="pct"/>
+            <w:gridSpan w:val="3"/>
             <w:tcBorders>
               <w:top w:val="single" w:sz="4" w:space="0" w:color="000000"/>
               <w:left w:val="single" w:sz="4" w:space="0" w:color="000000"/>
@@ -1386,8 +1352,8 @@
       <w:tr>
         <w:tc>
           <w:tcPr>
-            <w:tcW w:w="9639" w:type="dxa"/>
-            <w:gridSpan w:val="4"/>
+            <w:tcW w:w="5000" w:type="pct"/>
+            <w:gridSpan w:val="3"/>
             <w:tcBorders>
               <w:top w:val="single" w:sz="4" w:space="0" w:color="000000"/>
               <w:left w:val="single" w:sz="4" w:space="0" w:color="000000"/>
@@ -1441,8 +1407,8 @@
       <w:tr>
         <w:tc>
           <w:tcPr>
-            <w:tcW w:w="9639" w:type="dxa"/>
-            <w:gridSpan w:val="4"/>
+            <w:tcW w:w="5000" w:type="pct"/>
+            <w:gridSpan w:val="3"/>
             <w:tcBorders>
               <w:top w:val="single" w:sz="4" w:space="0" w:color="000000"/>
               <w:left w:val="single" w:sz="4" w:space="0" w:color="000000"/>
@@ -1488,7 +1454,6 @@
                 <w:rFonts w:ascii="Arial" w:hAnsi="Arial" w:cs="Arial"/>
                 <w:szCs w:val="24"/>
               </w:rPr>
-              <w:lastRenderedPageBreak/>
               <w:t>INFORME CONTABLE Y FINANCIERO</w:t>
             </w:r>
           </w:p>
@@ -1509,8 +1474,8 @@
       <w:tr>
         <w:tc>
           <w:tcPr>
-            <w:tcW w:w="9639" w:type="dxa"/>
-            <w:gridSpan w:val="4"/>
+            <w:tcW w:w="5000" w:type="pct"/>
+            <w:gridSpan w:val="3"/>
             <w:tcBorders>
               <w:top w:val="single" w:sz="4" w:space="0" w:color="000000"/>
               <w:left w:val="single" w:sz="4" w:space="0" w:color="000000"/>
@@ -1563,6 +1528,34 @@
               </w:rPr>
               <w:t xml:space="preserve"> del contrato:</w:t>
             </w:r>
+            <w:r>
+              <w:rPr>
+                <w:rFonts w:ascii="Arial" w:hAnsi="Arial" w:cs="Arial"/>
+                <w:szCs w:val="24"/>
+              </w:rPr>
+              <w:t xml:space="preserve"> </w:t>
+            </w:r>
+            <w:r>
+              <w:rPr>
+                <w:rFonts w:ascii="Arial" w:hAnsi="Arial" w:cs="Arial"/>
+                <w:szCs w:val="24"/>
+              </w:rPr>
+              <w:t>Es hasta por la suma de</w:t>
+            </w:r>
+            <w:r>
+              <w:rPr>
+                <w:rFonts w:ascii="Arial" w:hAnsi="Arial" w:cs="Arial"/>
+                <w:szCs w:val="24"/>
+              </w:rPr>
+              <w:t xml:space="preserve"> </w:t>
+            </w:r>
+            <w:r>
+              <w:rPr>
+                <w:rFonts w:ascii="Arial" w:hAnsi="Arial" w:cs="Arial"/>
+                <w:szCs w:val="24"/>
+              </w:rPr>
+              <w:t>${VALOR_INICIAL_LETRAS} M/CTE ($${VALOR_INICIAL_NUMEROS}).</w:t>
+            </w:r>
           </w:p>
           <w:p>
             <w:pPr>
@@ -1579,8 +1572,8 @@
       <w:tr>
         <w:tc>
           <w:tcPr>
-            <w:tcW w:w="9639" w:type="dxa"/>
-            <w:gridSpan w:val="4"/>
+            <w:tcW w:w="5000" w:type="pct"/>
+            <w:gridSpan w:val="3"/>
             <w:tcBorders>
               <w:top w:val="single" w:sz="4" w:space="0" w:color="000000"/>
               <w:left w:val="single" w:sz="4" w:space="0" w:color="000000"/>
@@ -1642,8 +1635,8 @@
       <w:tr>
         <w:tc>
           <w:tcPr>
-            <w:tcW w:w="9639" w:type="dxa"/>
-            <w:gridSpan w:val="4"/>
+            <w:tcW w:w="5000" w:type="pct"/>
+            <w:gridSpan w:val="3"/>
             <w:tcBorders>
               <w:top w:val="single" w:sz="4" w:space="0" w:color="000000"/>
               <w:left w:val="single" w:sz="4" w:space="0" w:color="000000"/>
@@ -1697,8 +1690,8 @@
       <w:tr>
         <w:tc>
           <w:tcPr>
-            <w:tcW w:w="9639" w:type="dxa"/>
-            <w:gridSpan w:val="4"/>
+            <w:tcW w:w="5000" w:type="pct"/>
+            <w:gridSpan w:val="3"/>
             <w:tcBorders>
               <w:top w:val="single" w:sz="4" w:space="0" w:color="000000"/>
               <w:left w:val="single" w:sz="4" w:space="0" w:color="000000"/>
@@ -1750,8 +1743,8 @@
         </w:trPr>
         <w:tc>
           <w:tcPr>
-            <w:tcW w:w="9639" w:type="dxa"/>
-            <w:gridSpan w:val="4"/>
+            <w:tcW w:w="5000" w:type="pct"/>
+            <w:gridSpan w:val="3"/>
             <w:tcBorders>
               <w:top w:val="single" w:sz="4" w:space="0" w:color="000000"/>
               <w:left w:val="single" w:sz="4" w:space="0" w:color="000000"/>
@@ -1783,7 +1776,7 @@
               <w:tblLook w:val="0000" w:firstRow="0" w:lastRow="0" w:firstColumn="0" w:lastColumn="0" w:noHBand="0" w:noVBand="0"/>
             </w:tblPr>
             <w:tblGrid>
-              <w:gridCol w:w="8470"/>
+              <w:gridCol w:w="8377"/>
               <w:gridCol w:w="443"/>
               <w:gridCol w:w="576"/>
             </w:tblGrid>
@@ -1983,7 +1976,7 @@
                       <w:sz w:val="24"/>
                       <w:szCs w:val="24"/>
                     </w:rPr>
-                    <w:t>Recibo de consignación en mi cuenta de Apoyo al Fomento de la Constru</w:t>
+                    <w:t>Recibo de consignación en mi cuenta de Apoyo al Fomento de la Con</w:t>
                   </w:r>
                   <w:r>
                     <w:rPr>
@@ -1992,7 +1985,7 @@
                       <w:sz w:val="24"/>
                       <w:szCs w:val="24"/>
                     </w:rPr>
-                    <w:t>c</w:t>
+                    <w:t>s</w:t>
                   </w:r>
                   <w:r>
                     <w:rPr>
@@ -2001,7 +1994,7 @@
                       <w:sz w:val="24"/>
                       <w:szCs w:val="24"/>
                     </w:rPr>
-                    <w:t>ción AFC del periodo de la cuota.</w:t>
+                    <w:t>trucción AFC del periodo de la cuota.</w:t>
                   </w:r>
                 </w:p>
               </w:tc>
@@ -2143,25 +2136,7 @@
                       <w:sz w:val="24"/>
                       <w:szCs w:val="24"/>
                     </w:rPr>
-                    <w:t>Recibo de consignación en mi cuenta del Fondo de Pensiones volunt</w:t>
-                  </w:r>
-                  <w:r>
-                    <w:rPr>
-                      <w:rFonts w:ascii="Arial" w:eastAsia="Arial" w:hAnsi="Arial" w:cs="Arial"/>
-                      <w:color w:val="000000"/>
-                      <w:sz w:val="24"/>
-                      <w:szCs w:val="24"/>
-                    </w:rPr>
-                    <w:t>a</w:t>
-                  </w:r>
-                  <w:r>
-                    <w:rPr>
-                      <w:rFonts w:ascii="Arial" w:eastAsia="Arial" w:hAnsi="Arial" w:cs="Arial"/>
-                      <w:color w:val="000000"/>
-                      <w:sz w:val="24"/>
-                      <w:szCs w:val="24"/>
-                    </w:rPr>
-                    <w:t>rias del periodo de la cuota.</w:t>
+                    <w:t>Recibo de consignación en mi cuenta del Fondo de Pensiones voluntarias del periodo de la cuota.</w:t>
                   </w:r>
                 </w:p>
               </w:tc>
@@ -2267,8 +2242,8 @@
         </w:trPr>
         <w:tc>
           <w:tcPr>
-            <w:tcW w:w="9639" w:type="dxa"/>
-            <w:gridSpan w:val="4"/>
+            <w:tcW w:w="5000" w:type="pct"/>
+            <w:gridSpan w:val="3"/>
             <w:tcBorders>
               <w:top w:val="single" w:sz="4" w:space="0" w:color="000000"/>
               <w:left w:val="single" w:sz="4" w:space="0" w:color="000000"/>
@@ -2325,10 +2300,10 @@
               <w:tblLook w:val="0000" w:firstRow="0" w:lastRow="0" w:firstColumn="0" w:lastColumn="0" w:noHBand="0" w:noVBand="0"/>
             </w:tblPr>
             <w:tblGrid>
-              <w:gridCol w:w="2480"/>
-              <w:gridCol w:w="2410"/>
-              <w:gridCol w:w="2409"/>
-              <w:gridCol w:w="2064"/>
+              <w:gridCol w:w="2758"/>
+              <w:gridCol w:w="2472"/>
+              <w:gridCol w:w="2069"/>
+              <w:gridCol w:w="2097"/>
             </w:tblGrid>
             <w:tr>
               <w:trPr>
@@ -2487,7 +2462,7 @@
                       <w:rFonts w:ascii="Arial" w:hAnsi="Arial" w:cs="Arial"/>
                       <w:szCs w:val="24"/>
                     </w:rPr>
-                    <w:t>Saldo por Cancelar</w:t>
+                    <w:t xml:space="preserve">Saldo por Cancelar </w:t>
                   </w:r>
                 </w:p>
               </w:tc>
@@ -2518,7 +2493,16 @@
                     <w:pStyle w:val="Textoindependiente2"/>
                     <w:spacing w:line="240" w:lineRule="auto"/>
                     <w:jc w:val="center"/>
+                    <w:rPr>
+                      <w:rFonts w:ascii="Arial" w:hAnsi="Arial" w:cs="Arial"/>
+                    </w:rPr>
                   </w:pPr>
+                  <w:r>
+                    <w:rPr>
+                      <w:rFonts w:ascii="Arial" w:hAnsi="Arial" w:cs="Arial"/>
+                    </w:rPr>
+                    <w:t>${VALOR_INICIAL_NUMEROS}</w:t>
+                  </w:r>
                 </w:p>
               </w:tc>
               <w:tc>
@@ -2543,7 +2527,16 @@
                     <w:pStyle w:val="Textoindependiente2"/>
                     <w:spacing w:line="240" w:lineRule="auto"/>
                     <w:jc w:val="center"/>
+                    <w:rPr>
+                      <w:rFonts w:ascii="Arial" w:hAnsi="Arial" w:cs="Arial"/>
+                    </w:rPr>
                   </w:pPr>
+                  <w:r>
+                    <w:rPr>
+                      <w:rFonts w:ascii="Arial" w:hAnsi="Arial" w:cs="Arial"/>
+                    </w:rPr>
+                    <w:t>${VALOR_CUOTA_PAGAR}</w:t>
+                  </w:r>
                 </w:p>
               </w:tc>
               <w:tc>
@@ -2562,7 +2555,16 @@
                     <w:pStyle w:val="Textoindependiente2"/>
                     <w:spacing w:line="240" w:lineRule="auto"/>
                     <w:jc w:val="center"/>
+                    <w:rPr>
+                      <w:rFonts w:ascii="Arial" w:hAnsi="Arial" w:cs="Arial"/>
+                    </w:rPr>
                   </w:pPr>
+                  <w:r>
+                    <w:rPr>
+                      <w:rFonts w:ascii="Arial" w:hAnsi="Arial" w:cs="Arial"/>
+                    </w:rPr>
+                    <w:t>${VALOR_ACUMULADO}</w:t>
+                  </w:r>
                 </w:p>
               </w:tc>
               <w:tc>
@@ -2593,6 +2595,13 @@
                       <w:szCs w:val="24"/>
                     </w:rPr>
                   </w:pPr>
+                  <w:r>
+                    <w:rPr>
+                      <w:rFonts w:ascii="Arial" w:hAnsi="Arial" w:cs="Arial"/>
+                      <w:szCs w:val="24"/>
+                    </w:rPr>
+                    <w:t>${SALDO_CANCELAR}</w:t>
+                  </w:r>
                 </w:p>
               </w:tc>
             </w:tr>
@@ -2652,7 +2661,7 @@
         </w:trPr>
         <w:tc>
           <w:tcPr>
-            <w:tcW w:w="2627" w:type="dxa"/>
+            <w:tcW w:w="1903" w:type="pct"/>
             <w:tcBorders>
               <w:top w:val="single" w:sz="4" w:space="0" w:color="000000"/>
               <w:left w:val="single" w:sz="4" w:space="0" w:color="000000"/>
@@ -2688,8 +2697,8 @@
         </w:tc>
         <w:tc>
           <w:tcPr>
-            <w:tcW w:w="7012" w:type="dxa"/>
-            <w:gridSpan w:val="3"/>
+            <w:tcW w:w="3097" w:type="pct"/>
+            <w:gridSpan w:val="2"/>
             <w:tcBorders>
               <w:top w:val="single" w:sz="4" w:space="0" w:color="000000"/>
               <w:left w:val="single" w:sz="4" w:space="0" w:color="000000"/>
@@ -2727,7 +2736,7 @@
         </w:trPr>
         <w:tc>
           <w:tcPr>
-            <w:tcW w:w="2627" w:type="dxa"/>
+            <w:tcW w:w="1903" w:type="pct"/>
             <w:tcBorders>
               <w:top w:val="single" w:sz="4" w:space="0" w:color="000000"/>
               <w:left w:val="single" w:sz="4" w:space="0" w:color="000000"/>
@@ -2756,24 +2765,14 @@
                 <w:sz w:val="24"/>
                 <w:szCs w:val="24"/>
               </w:rPr>
-              <w:t xml:space="preserve">Sistema de Salud, </w:t>
-            </w:r>
-            <w:bookmarkStart w:id="0" w:name="_GoBack"/>
-            <w:bookmarkEnd w:id="0"/>
-            <w:r>
-              <w:rPr>
-                <w:rFonts w:ascii="Arial" w:eastAsia="Arial" w:hAnsi="Arial" w:cs="Arial"/>
-                <w:sz w:val="24"/>
-                <w:szCs w:val="24"/>
-              </w:rPr>
-              <w:t>Sistema de Pensiones y Riesgos Laborales</w:t>
+              <w:t>Sistema de Salud, Sistema de Pensiones y Riesgos Laborales</w:t>
             </w:r>
           </w:p>
         </w:tc>
         <w:tc>
           <w:tcPr>
-            <w:tcW w:w="7012" w:type="dxa"/>
-            <w:gridSpan w:val="3"/>
+            <w:tcW w:w="3097" w:type="pct"/>
+            <w:gridSpan w:val="2"/>
             <w:tcBorders>
               <w:top w:val="single" w:sz="4" w:space="0" w:color="000000"/>
               <w:left w:val="single" w:sz="4" w:space="0" w:color="000000"/>
@@ -2804,7 +2803,7 @@
                 <w:sz w:val="24"/>
                 <w:szCs w:val="24"/>
               </w:rPr>
-              <w:t>5799153</w:t>
+              <w:t>${PLANILLA_NUMERO}</w:t>
             </w:r>
           </w:p>
           <w:p>
@@ -2829,7 +2828,7 @@
                 <w:sz w:val="22"/>
                 <w:szCs w:val="22"/>
               </w:rPr>
-              <w:t>2097133658</w:t>
+              <w:t>${PLANILLA_PIN}</w:t>
             </w:r>
           </w:p>
           <w:p>
@@ -2846,24 +2845,48 @@
                 <w:sz w:val="24"/>
                 <w:szCs w:val="24"/>
               </w:rPr>
-              <w:t>Operador: Mi planilla</w:t>
-            </w:r>
-          </w:p>
-          <w:p>
-            <w:pPr>
+              <w:t xml:space="preserve">Operador: </w:t>
+            </w:r>
+            <w:r>
               <w:rPr>
                 <w:rFonts w:ascii="Arial" w:eastAsia="Arial" w:hAnsi="Arial" w:cs="Arial"/>
                 <w:sz w:val="24"/>
                 <w:szCs w:val="24"/>
               </w:rPr>
-            </w:pPr>
-            <w:r>
+              <w:t>${PLANILLA_OPERADOR}</w:t>
+            </w:r>
+          </w:p>
+          <w:p>
+            <w:pPr>
               <w:rPr>
                 <w:rFonts w:ascii="Arial" w:eastAsia="Arial" w:hAnsi="Arial" w:cs="Arial"/>
                 <w:sz w:val="24"/>
                 <w:szCs w:val="24"/>
               </w:rPr>
-              <w:t xml:space="preserve">Fecha de Pago: 20 de enero de 2026 </w:t>
+            </w:pPr>
+            <w:r>
+              <w:rPr>
+                <w:rFonts w:ascii="Arial" w:eastAsia="Arial" w:hAnsi="Arial" w:cs="Arial"/>
+                <w:sz w:val="24"/>
+                <w:szCs w:val="24"/>
+              </w:rPr>
+              <w:t xml:space="preserve">Fecha de Pago: </w:t>
+            </w:r>
+            <w:r>
+              <w:rPr>
+                <w:rFonts w:ascii="Arial" w:eastAsia="Arial" w:hAnsi="Arial" w:cs="Arial"/>
+                <w:sz w:val="24"/>
+                <w:szCs w:val="24"/>
+              </w:rPr>
+              <w:t>${PLANILLA_FECHA_PAGO}</w:t>
+            </w:r>
+            <w:r>
+              <w:rPr>
+                <w:rFonts w:ascii="Arial" w:eastAsia="Arial" w:hAnsi="Arial" w:cs="Arial"/>
+                <w:sz w:val="24"/>
+                <w:szCs w:val="24"/>
+              </w:rPr>
+              <w:t xml:space="preserve"> </w:t>
             </w:r>
           </w:p>
           <w:p>
@@ -2884,8 +2907,34 @@
                 <w:sz w:val="24"/>
                 <w:szCs w:val="24"/>
               </w:rPr>
-              <w:t>Periodo de pago de la seguridad social: Enero 2026</w:t>
-            </w:r>
+              <w:t xml:space="preserve">Periodo de pago de la seguridad social: </w:t>
+            </w:r>
+            <w:r>
+              <w:rPr>
+                <w:rFonts w:ascii="Arial" w:eastAsia="Arial" w:hAnsi="Arial" w:cs="Arial"/>
+                <w:sz w:val="24"/>
+                <w:szCs w:val="24"/>
+              </w:rPr>
+              <w:t>${PLAN</w:t>
+            </w:r>
+            <w:r>
+              <w:rPr>
+                <w:rFonts w:ascii="Arial" w:eastAsia="Arial" w:hAnsi="Arial" w:cs="Arial"/>
+                <w:sz w:val="24"/>
+                <w:szCs w:val="24"/>
+              </w:rPr>
+              <w:t>I</w:t>
+            </w:r>
+            <w:r>
+              <w:rPr>
+                <w:rFonts w:ascii="Arial" w:eastAsia="Arial" w:hAnsi="Arial" w:cs="Arial"/>
+                <w:sz w:val="24"/>
+                <w:szCs w:val="24"/>
+              </w:rPr>
+              <w:t>LLA_PERIODO}</w:t>
+            </w:r>
+            <w:bookmarkStart w:id="0" w:name="_GoBack"/>
+            <w:bookmarkEnd w:id="0"/>
           </w:p>
         </w:tc>
       </w:tr>
@@ -2895,8 +2944,8 @@
         </w:trPr>
         <w:tc>
           <w:tcPr>
-            <w:tcW w:w="9639" w:type="dxa"/>
-            <w:gridSpan w:val="4"/>
+            <w:tcW w:w="5000" w:type="pct"/>
+            <w:gridSpan w:val="3"/>
             <w:tcBorders>
               <w:top w:val="single" w:sz="4" w:space="0" w:color="000000"/>
               <w:left w:val="single" w:sz="4" w:space="0" w:color="000000"/>
@@ -2950,8 +2999,8 @@
         </w:trPr>
         <w:tc>
           <w:tcPr>
-            <w:tcW w:w="9639" w:type="dxa"/>
-            <w:gridSpan w:val="4"/>
+            <w:tcW w:w="5000" w:type="pct"/>
+            <w:gridSpan w:val="3"/>
             <w:tcBorders>
               <w:top w:val="single" w:sz="4" w:space="0" w:color="000000"/>
               <w:left w:val="single" w:sz="4" w:space="0" w:color="000000"/>
@@ -3032,8 +3081,8 @@
         </w:trPr>
         <w:tc>
           <w:tcPr>
-            <w:tcW w:w="9639" w:type="dxa"/>
-            <w:gridSpan w:val="4"/>
+            <w:tcW w:w="5000" w:type="pct"/>
+            <w:gridSpan w:val="3"/>
             <w:tcBorders>
               <w:top w:val="single" w:sz="4" w:space="0" w:color="000000"/>
               <w:left w:val="single" w:sz="4" w:space="0" w:color="000000"/>
@@ -3084,8 +3133,8 @@
         </w:trPr>
         <w:tc>
           <w:tcPr>
-            <w:tcW w:w="9639" w:type="dxa"/>
-            <w:gridSpan w:val="4"/>
+            <w:tcW w:w="5000" w:type="pct"/>
+            <w:gridSpan w:val="3"/>
             <w:tcBorders>
               <w:top w:val="single" w:sz="4" w:space="0" w:color="000000"/>
               <w:left w:val="single" w:sz="4" w:space="0" w:color="000000"/>
@@ -3115,7 +3164,6 @@
                 <w:rFonts w:ascii="Arial" w:hAnsi="Arial" w:cs="Arial"/>
                 <w:szCs w:val="24"/>
               </w:rPr>
-              <w:lastRenderedPageBreak/>
               <w:t>Observaciones al informe técnico:</w:t>
             </w:r>
           </w:p>
@@ -3147,8 +3195,8 @@
         </w:trPr>
         <w:tc>
           <w:tcPr>
-            <w:tcW w:w="9639" w:type="dxa"/>
-            <w:gridSpan w:val="4"/>
+            <w:tcW w:w="5000" w:type="pct"/>
+            <w:gridSpan w:val="3"/>
             <w:tcBorders>
               <w:top w:val="single" w:sz="4" w:space="0" w:color="000000"/>
               <w:left w:val="single" w:sz="4" w:space="0" w:color="000000"/>
@@ -3234,8 +3282,8 @@
         </w:trPr>
         <w:tc>
           <w:tcPr>
-            <w:tcW w:w="9639" w:type="dxa"/>
-            <w:gridSpan w:val="4"/>
+            <w:tcW w:w="5000" w:type="pct"/>
+            <w:gridSpan w:val="3"/>
             <w:tcBorders>
               <w:top w:val="single" w:sz="4" w:space="0" w:color="000000"/>
               <w:left w:val="single" w:sz="4" w:space="0" w:color="000000"/>
@@ -3287,8 +3335,8 @@
         </w:trPr>
         <w:tc>
           <w:tcPr>
-            <w:tcW w:w="9639" w:type="dxa"/>
-            <w:gridSpan w:val="4"/>
+            <w:tcW w:w="5000" w:type="pct"/>
+            <w:gridSpan w:val="3"/>
             <w:tcBorders>
               <w:top w:val="single" w:sz="4" w:space="0" w:color="000000"/>
               <w:left w:val="single" w:sz="4" w:space="0" w:color="000000"/>
@@ -3358,8 +3406,8 @@
         </w:trPr>
         <w:tc>
           <w:tcPr>
-            <w:tcW w:w="9639" w:type="dxa"/>
-            <w:gridSpan w:val="4"/>
+            <w:tcW w:w="5000" w:type="pct"/>
+            <w:gridSpan w:val="3"/>
             <w:tcBorders>
               <w:top w:val="single" w:sz="4" w:space="0" w:color="000000"/>
               <w:left w:val="single" w:sz="4" w:space="0" w:color="000000"/>
@@ -3555,8 +3603,8 @@
         </w:trPr>
         <w:tc>
           <w:tcPr>
-            <w:tcW w:w="9639" w:type="dxa"/>
-            <w:gridSpan w:val="4"/>
+            <w:tcW w:w="5000" w:type="pct"/>
+            <w:gridSpan w:val="3"/>
             <w:tcBorders>
               <w:top w:val="single" w:sz="4" w:space="0" w:color="000000"/>
               <w:left w:val="single" w:sz="4" w:space="0" w:color="000000"/>
@@ -6030,7 +6078,7 @@
 </file>
 
 <file path=customXml/itemProps1.xml><?xml version="1.0" encoding="utf-8"?>
-<ds:datastoreItem xmlns:ds="http://schemas.openxmlformats.org/officeDocument/2006/customXml" ds:itemID="{07792063-9FCB-402C-AAC8-747CA242C5B0}">
+<ds:datastoreItem xmlns:ds="http://schemas.openxmlformats.org/officeDocument/2006/customXml" ds:itemID="{824CB805-2DD7-4792-B516-0EFED0AC2C06}">
   <ds:schemaRefs>
     <ds:schemaRef ds:uri="http://schemas.openxmlformats.org/officeDocument/2006/bibliography"/>
   </ds:schemaRefs>

</xml_diff>

<commit_message>
feat: implementar opcion B con tabla de obligaciones y parseo inteligente
</commit_message>
<xml_diff>
--- a/plantillas/INFORME_SUPERVISION_TEMPLATE.docx
+++ b/plantillas/INFORME_SUPERVISION_TEMPLATE.docx
@@ -4,7 +4,7 @@
   <w:body>
     <w:tbl>
       <w:tblPr>
-        <w:tblW w:w="5000" w:type="pct"/>
+        <w:tblW w:w="10110" w:type="dxa"/>
         <w:tblCellMar>
           <w:left w:w="10" w:type="dxa"/>
           <w:right w:w="10" w:type="dxa"/>
@@ -12,9 +12,9 @@
         <w:tblLook w:val="04A0" w:firstRow="1" w:lastRow="0" w:firstColumn="1" w:lastColumn="0" w:noHBand="0" w:noVBand="1"/>
       </w:tblPr>
       <w:tblGrid>
-        <w:gridCol w:w="3136"/>
-        <w:gridCol w:w="1694"/>
-        <w:gridCol w:w="5284"/>
+        <w:gridCol w:w="3826"/>
+        <w:gridCol w:w="1415"/>
+        <w:gridCol w:w="4873"/>
       </w:tblGrid>
       <w:tr>
         <w:trPr>
@@ -23,7 +23,7 @@
         </w:trPr>
         <w:tc>
           <w:tcPr>
-            <w:tcW w:w="5000" w:type="pct"/>
+            <w:tcW w:w="10114" w:type="dxa"/>
             <w:gridSpan w:val="3"/>
             <w:tcBorders>
               <w:top w:val="single" w:sz="4" w:space="0" w:color="000000"/>
@@ -72,7 +72,7 @@
         </w:trPr>
         <w:tc>
           <w:tcPr>
-            <w:tcW w:w="5000" w:type="pct"/>
+            <w:tcW w:w="10114" w:type="dxa"/>
             <w:gridSpan w:val="3"/>
             <w:tcBorders>
               <w:top w:val="single" w:sz="4" w:space="0" w:color="000000"/>
@@ -107,7 +107,7 @@
               <mc:AlternateContent>
                 <mc:Choice Requires="wps">
                   <w:drawing>
-                    <wp:anchor distT="0" distB="0" distL="114300" distR="114300" simplePos="0" relativeHeight="251659264" behindDoc="0" locked="0" layoutInCell="1" allowOverlap="1" wp14:anchorId="66C8D232" wp14:editId="4134B5C9">
+                    <wp:anchor distT="0" distB="0" distL="114300" distR="114300" simplePos="0" relativeHeight="251659264" behindDoc="0" locked="0" layoutInCell="1" allowOverlap="1" wp14:anchorId="2FA6E240" wp14:editId="30427270">
                       <wp:simplePos x="0" y="0"/>
                       <wp:positionH relativeFrom="column">
                         <wp:posOffset>4511675</wp:posOffset>
@@ -243,7 +243,7 @@
               <mc:AlternateContent>
                 <mc:Choice Requires="wps">
                   <w:drawing>
-                    <wp:anchor distT="0" distB="0" distL="114300" distR="114300" simplePos="0" relativeHeight="251657216" behindDoc="0" locked="0" layoutInCell="1" allowOverlap="1" wp14:anchorId="1E2EAFE5" wp14:editId="001EAFCC">
+                    <wp:anchor distT="0" distB="0" distL="114300" distR="114300" simplePos="0" relativeHeight="251657216" behindDoc="0" locked="0" layoutInCell="1" allowOverlap="1" wp14:anchorId="002D0D94" wp14:editId="5B6EA6E7">
                       <wp:simplePos x="0" y="0"/>
                       <wp:positionH relativeFrom="column">
                         <wp:posOffset>1579245</wp:posOffset>
@@ -437,7 +437,7 @@
         </w:trPr>
         <w:tc>
           <w:tcPr>
-            <w:tcW w:w="5000" w:type="pct"/>
+            <w:tcW w:w="10114" w:type="dxa"/>
             <w:gridSpan w:val="3"/>
             <w:tcBorders>
               <w:top w:val="single" w:sz="4" w:space="0" w:color="000000"/>
@@ -483,7 +483,7 @@
         </w:trPr>
         <w:tc>
           <w:tcPr>
-            <w:tcW w:w="5000" w:type="pct"/>
+            <w:tcW w:w="10114" w:type="dxa"/>
             <w:gridSpan w:val="3"/>
             <w:tcBorders>
               <w:top w:val="single" w:sz="4" w:space="0" w:color="000000"/>
@@ -553,29 +553,15 @@
               <w:t>${NUMERO_CONTRATO}</w:t>
             </w:r>
           </w:p>
-          <w:p>
-            <w:pPr>
-              <w:pStyle w:val="Textoindependiente2"/>
-              <w:tabs>
-                <w:tab w:val="left" w:pos="2475"/>
-              </w:tabs>
-              <w:spacing w:line="240" w:lineRule="auto"/>
-              <w:jc w:val="left"/>
-              <w:rPr>
-                <w:rFonts w:ascii="Arial" w:hAnsi="Arial" w:cs="Arial"/>
-                <w:szCs w:val="24"/>
-              </w:rPr>
-            </w:pPr>
-          </w:p>
         </w:tc>
       </w:tr>
       <w:tr>
         <w:trPr>
-          <w:trHeight w:val="437"/>
+          <w:trHeight w:val="567"/>
         </w:trPr>
         <w:tc>
           <w:tcPr>
-            <w:tcW w:w="5000" w:type="pct"/>
+            <w:tcW w:w="10114" w:type="dxa"/>
             <w:gridSpan w:val="3"/>
             <w:tcBorders>
               <w:top w:val="single" w:sz="4" w:space="0" w:color="000000"/>
@@ -617,26 +603,15 @@
               <w:t>ombre del contratista:  ${CONTRATISTA_NOMBRE}</w:t>
             </w:r>
           </w:p>
-          <w:p>
-            <w:pPr>
-              <w:pStyle w:val="Textoindependiente2"/>
-              <w:spacing w:line="240" w:lineRule="auto"/>
-              <w:jc w:val="left"/>
-              <w:rPr>
-                <w:rFonts w:ascii="Arial" w:hAnsi="Arial" w:cs="Arial"/>
-                <w:szCs w:val="24"/>
-              </w:rPr>
-            </w:pPr>
-          </w:p>
         </w:tc>
       </w:tr>
       <w:tr>
         <w:trPr>
-          <w:trHeight w:val="437"/>
+          <w:trHeight w:val="567"/>
         </w:trPr>
         <w:tc>
           <w:tcPr>
-            <w:tcW w:w="5000" w:type="pct"/>
+            <w:tcW w:w="10114" w:type="dxa"/>
             <w:gridSpan w:val="3"/>
             <w:tcBorders>
               <w:top w:val="single" w:sz="4" w:space="0" w:color="000000"/>
@@ -699,26 +674,15 @@
               <w:t>${CONTRATISTA_CEDULA}</w:t>
             </w:r>
           </w:p>
-          <w:p>
-            <w:pPr>
-              <w:pStyle w:val="Textoindependiente2"/>
-              <w:spacing w:line="240" w:lineRule="auto"/>
-              <w:jc w:val="left"/>
-              <w:rPr>
-                <w:rFonts w:ascii="Arial" w:hAnsi="Arial" w:cs="Arial"/>
-                <w:szCs w:val="24"/>
-              </w:rPr>
-            </w:pPr>
-          </w:p>
         </w:tc>
       </w:tr>
       <w:tr>
         <w:trPr>
-          <w:trHeight w:val="437"/>
+          <w:trHeight w:val="567"/>
         </w:trPr>
         <w:tc>
           <w:tcPr>
-            <w:tcW w:w="5000" w:type="pct"/>
+            <w:tcW w:w="10114" w:type="dxa"/>
             <w:gridSpan w:val="3"/>
             <w:tcBorders>
               <w:top w:val="single" w:sz="4" w:space="0" w:color="000000"/>
@@ -760,24 +724,15 @@
               <w:t>ombre (s) del supervisor (es): ${NOMBRE_SUPERVISOR}</w:t>
             </w:r>
           </w:p>
-          <w:p>
-            <w:pPr>
-              <w:rPr>
-                <w:rFonts w:ascii="Arial" w:hAnsi="Arial" w:cs="Arial"/>
-                <w:sz w:val="24"/>
-                <w:szCs w:val="24"/>
-              </w:rPr>
-            </w:pPr>
-          </w:p>
         </w:tc>
       </w:tr>
       <w:tr>
         <w:trPr>
-          <w:trHeight w:val="437"/>
+          <w:trHeight w:val="567"/>
         </w:trPr>
         <w:tc>
           <w:tcPr>
-            <w:tcW w:w="5000" w:type="pct"/>
+            <w:tcW w:w="10114" w:type="dxa"/>
             <w:gridSpan w:val="3"/>
             <w:tcBorders>
               <w:top w:val="single" w:sz="4" w:space="0" w:color="000000"/>
@@ -827,24 +782,15 @@
               <w:t>${ORGANISMO}</w:t>
             </w:r>
           </w:p>
-          <w:p>
-            <w:pPr>
-              <w:rPr>
-                <w:rFonts w:ascii="Arial" w:hAnsi="Arial" w:cs="Arial"/>
-                <w:sz w:val="24"/>
-                <w:szCs w:val="24"/>
-              </w:rPr>
-            </w:pPr>
-          </w:p>
         </w:tc>
       </w:tr>
       <w:tr>
         <w:trPr>
-          <w:trHeight w:val="437"/>
+          <w:trHeight w:val="567"/>
         </w:trPr>
         <w:tc>
           <w:tcPr>
-            <w:tcW w:w="5000" w:type="pct"/>
+            <w:tcW w:w="10114" w:type="dxa"/>
             <w:gridSpan w:val="3"/>
             <w:tcBorders>
               <w:top w:val="single" w:sz="4" w:space="0" w:color="000000"/>
@@ -899,17 +845,6 @@
               <w:t>${OBJETO_CONTRACTUAL}</w:t>
             </w:r>
           </w:p>
-          <w:p>
-            <w:pPr>
-              <w:pStyle w:val="Textoindependiente2"/>
-              <w:spacing w:line="240" w:lineRule="auto"/>
-              <w:jc w:val="left"/>
-              <w:rPr>
-                <w:rFonts w:ascii="Arial" w:hAnsi="Arial" w:cs="Arial"/>
-                <w:szCs w:val="24"/>
-              </w:rPr>
-            </w:pPr>
-          </w:p>
         </w:tc>
       </w:tr>
       <w:tr>
@@ -918,7 +853,7 @@
         </w:trPr>
         <w:tc>
           <w:tcPr>
-            <w:tcW w:w="5000" w:type="pct"/>
+            <w:tcW w:w="10114" w:type="dxa"/>
             <w:gridSpan w:val="3"/>
             <w:tcBorders>
               <w:top w:val="single" w:sz="4" w:space="0" w:color="000000"/>
@@ -967,11 +902,11 @@
       </w:tr>
       <w:tr>
         <w:trPr>
-          <w:trHeight w:val="424"/>
+          <w:trHeight w:val="714"/>
         </w:trPr>
         <w:tc>
           <w:tcPr>
-            <w:tcW w:w="2347" w:type="pct"/>
+            <w:tcW w:w="5222" w:type="dxa"/>
             <w:gridSpan w:val="2"/>
             <w:tcBorders>
               <w:top w:val="single" w:sz="4" w:space="0" w:color="000000"/>
@@ -1002,7 +937,14 @@
                 <w:rFonts w:ascii="Arial" w:eastAsia="Arial" w:hAnsi="Arial" w:cs="Arial"/>
                 <w:sz w:val="22"/>
               </w:rPr>
-              <w:t>Fecha de Inicio</w:t>
+              <w:t>Fecha de i</w:t>
+            </w:r>
+            <w:r>
+              <w:rPr>
+                <w:rFonts w:ascii="Arial" w:eastAsia="Arial" w:hAnsi="Arial" w:cs="Arial"/>
+                <w:sz w:val="22"/>
+              </w:rPr>
+              <w:t>nicio</w:t>
             </w:r>
           </w:p>
           <w:p>
@@ -1033,7 +975,7 @@
         </w:tc>
         <w:tc>
           <w:tcPr>
-            <w:tcW w:w="2653" w:type="pct"/>
+            <w:tcW w:w="5203" w:type="dxa"/>
             <w:tcBorders>
               <w:top w:val="single" w:sz="4" w:space="0" w:color="000000"/>
               <w:left w:val="single" w:sz="4" w:space="0" w:color="000000"/>
@@ -1070,7 +1012,7 @@
                 <w:rFonts w:ascii="Arial" w:hAnsi="Arial" w:cs="Arial"/>
                 <w:szCs w:val="24"/>
               </w:rPr>
-              <w:t>T</w:t>
+              <w:t>t</w:t>
             </w:r>
             <w:r>
               <w:rPr>
@@ -1097,13 +1039,608 @@
               </w:rPr>
               <w:t>${FECHA_FIN_PERIODO}</w:t>
             </w:r>
+          </w:p>
+        </w:tc>
+      </w:tr>
+      <w:tr>
+        <w:trPr>
+          <w:trHeight w:val="153"/>
+        </w:trPr>
+        <w:tc>
+          <w:tcPr>
+            <w:tcW w:w="10114" w:type="dxa"/>
+            <w:gridSpan w:val="3"/>
+            <w:tcBorders>
+              <w:top w:val="single" w:sz="4" w:space="0" w:color="000000"/>
+              <w:left w:val="single" w:sz="4" w:space="0" w:color="000000"/>
+              <w:bottom w:val="single" w:sz="4" w:space="0" w:color="000000"/>
+              <w:right w:val="single" w:sz="4" w:space="0" w:color="000000"/>
+            </w:tcBorders>
+            <w:shd w:val="clear" w:color="auto" w:fill="auto"/>
+            <w:tcMar>
+              <w:top w:w="0" w:type="dxa"/>
+              <w:left w:w="70" w:type="dxa"/>
+              <w:bottom w:w="0" w:type="dxa"/>
+              <w:right w:w="70" w:type="dxa"/>
+            </w:tcMar>
+            <w:vAlign w:val="center"/>
+          </w:tcPr>
+          <w:p>
+            <w:pPr>
+              <w:pStyle w:val="Textoindependiente2"/>
+              <w:spacing w:line="240" w:lineRule="auto"/>
+              <w:rPr>
+                <w:rFonts w:ascii="Arial" w:hAnsi="Arial" w:cs="Arial"/>
+                <w:szCs w:val="24"/>
+              </w:rPr>
+            </w:pPr>
+            <w:r>
+              <w:rPr>
+                <w:rFonts w:ascii="Arial" w:eastAsia="Arial" w:hAnsi="Arial" w:cs="Arial"/>
+                <w:szCs w:val="24"/>
+              </w:rPr>
+              <w:t>Modificación(es) al contrato</w:t>
+            </w:r>
+            <w:r>
+              <w:rPr>
+                <w:rFonts w:ascii="Arial" w:eastAsia="Arial" w:hAnsi="Arial" w:cs="Arial"/>
+                <w:szCs w:val="24"/>
+              </w:rPr>
+              <w:t>: ${MODIFICACIONES}</w:t>
+            </w:r>
+          </w:p>
+          <w:p>
+            <w:pPr>
+              <w:pStyle w:val="Textoindependiente2"/>
+              <w:spacing w:line="240" w:lineRule="auto"/>
+              <w:rPr>
+                <w:rFonts w:ascii="Arial" w:hAnsi="Arial" w:cs="Arial"/>
+                <w:szCs w:val="24"/>
+              </w:rPr>
+            </w:pPr>
+          </w:p>
+        </w:tc>
+      </w:tr>
+      <w:tr>
+        <w:trPr>
+          <w:trHeight w:val="153"/>
+        </w:trPr>
+        <w:tc>
+          <w:tcPr>
+            <w:tcW w:w="10114" w:type="dxa"/>
+            <w:gridSpan w:val="3"/>
+            <w:tcBorders>
+              <w:top w:val="single" w:sz="4" w:space="0" w:color="000000"/>
+              <w:left w:val="single" w:sz="4" w:space="0" w:color="000000"/>
+              <w:bottom w:val="single" w:sz="4" w:space="0" w:color="000000"/>
+              <w:right w:val="single" w:sz="4" w:space="0" w:color="000000"/>
+            </w:tcBorders>
+            <w:shd w:val="clear" w:color="auto" w:fill="auto"/>
+            <w:tcMar>
+              <w:top w:w="0" w:type="dxa"/>
+              <w:left w:w="70" w:type="dxa"/>
+              <w:bottom w:w="0" w:type="dxa"/>
+              <w:right w:w="70" w:type="dxa"/>
+            </w:tcMar>
+            <w:vAlign w:val="center"/>
+          </w:tcPr>
+          <w:p>
+            <w:pPr>
+              <w:pStyle w:val="Textoindependiente2"/>
+              <w:spacing w:line="240" w:lineRule="auto"/>
+              <w:rPr>
+                <w:rFonts w:ascii="Arial" w:hAnsi="Arial" w:cs="Arial"/>
+                <w:szCs w:val="24"/>
+              </w:rPr>
+            </w:pPr>
+            <w:r>
+              <w:rPr>
+                <w:rFonts w:ascii="Arial" w:eastAsia="Arial" w:hAnsi="Arial" w:cs="Arial"/>
+                <w:szCs w:val="24"/>
+              </w:rPr>
+              <w:t>Suspensión</w:t>
+            </w:r>
+            <w:r>
+              <w:rPr>
+                <w:rFonts w:ascii="Arial" w:eastAsia="Arial" w:hAnsi="Arial" w:cs="Arial"/>
+                <w:szCs w:val="24"/>
+              </w:rPr>
+              <w:t>: ${SUSPENSIONES}</w:t>
+            </w:r>
+          </w:p>
+          <w:p>
+            <w:pPr>
+              <w:pStyle w:val="Textoindependiente2"/>
+              <w:spacing w:line="240" w:lineRule="auto"/>
+              <w:rPr>
+                <w:rFonts w:ascii="Arial" w:hAnsi="Arial" w:cs="Arial"/>
+                <w:szCs w:val="24"/>
+              </w:rPr>
+            </w:pPr>
+          </w:p>
+        </w:tc>
+      </w:tr>
+      <w:tr>
+        <w:trPr>
+          <w:trHeight w:val="153"/>
+        </w:trPr>
+        <w:tc>
+          <w:tcPr>
+            <w:tcW w:w="10114" w:type="dxa"/>
+            <w:gridSpan w:val="3"/>
+            <w:tcBorders>
+              <w:top w:val="single" w:sz="4" w:space="0" w:color="000000"/>
+              <w:left w:val="single" w:sz="4" w:space="0" w:color="000000"/>
+              <w:bottom w:val="single" w:sz="4" w:space="0" w:color="000000"/>
+              <w:right w:val="single" w:sz="4" w:space="0" w:color="000000"/>
+            </w:tcBorders>
+            <w:shd w:val="clear" w:color="auto" w:fill="auto"/>
+            <w:tcMar>
+              <w:top w:w="0" w:type="dxa"/>
+              <w:left w:w="70" w:type="dxa"/>
+              <w:bottom w:w="0" w:type="dxa"/>
+              <w:right w:w="70" w:type="dxa"/>
+            </w:tcMar>
+            <w:vAlign w:val="center"/>
+          </w:tcPr>
+          <w:p>
+            <w:pPr>
+              <w:pStyle w:val="Textoindependiente2"/>
+              <w:spacing w:line="240" w:lineRule="auto"/>
+              <w:rPr>
+                <w:rFonts w:ascii="Arial" w:hAnsi="Arial" w:cs="Arial"/>
+                <w:szCs w:val="24"/>
+              </w:rPr>
+            </w:pPr>
+            <w:r>
+              <w:rPr>
+                <w:rFonts w:ascii="Arial" w:eastAsia="Arial" w:hAnsi="Arial" w:cs="Arial"/>
+                <w:szCs w:val="24"/>
+              </w:rPr>
+              <w:t>Reanudación</w:t>
+            </w:r>
+            <w:r>
+              <w:rPr>
+                <w:rFonts w:ascii="Arial" w:eastAsia="Arial" w:hAnsi="Arial" w:cs="Arial"/>
+                <w:szCs w:val="24"/>
+              </w:rPr>
+              <w:t>: ${REANUDACIONES}</w:t>
+            </w:r>
+          </w:p>
+          <w:p>
+            <w:pPr>
+              <w:pStyle w:val="Textoindependiente2"/>
+              <w:spacing w:line="240" w:lineRule="auto"/>
+              <w:rPr>
+                <w:rFonts w:ascii="Arial" w:hAnsi="Arial" w:cs="Arial"/>
+                <w:szCs w:val="24"/>
+              </w:rPr>
+            </w:pPr>
+          </w:p>
+        </w:tc>
+      </w:tr>
+      <w:tr>
+        <w:trPr>
+          <w:trHeight w:val="153"/>
+        </w:trPr>
+        <w:tc>
+          <w:tcPr>
+            <w:tcW w:w="10114" w:type="dxa"/>
+            <w:gridSpan w:val="3"/>
+            <w:tcBorders>
+              <w:top w:val="single" w:sz="4" w:space="0" w:color="000000"/>
+              <w:left w:val="single" w:sz="4" w:space="0" w:color="000000"/>
+              <w:bottom w:val="single" w:sz="4" w:space="0" w:color="000000"/>
+              <w:right w:val="single" w:sz="4" w:space="0" w:color="000000"/>
+            </w:tcBorders>
+            <w:shd w:val="clear" w:color="auto" w:fill="auto"/>
+            <w:tcMar>
+              <w:top w:w="0" w:type="dxa"/>
+              <w:left w:w="70" w:type="dxa"/>
+              <w:bottom w:w="0" w:type="dxa"/>
+              <w:right w:w="70" w:type="dxa"/>
+            </w:tcMar>
+            <w:vAlign w:val="center"/>
+          </w:tcPr>
+          <w:p>
+            <w:pPr>
+              <w:pStyle w:val="Textoindependiente2"/>
+              <w:spacing w:line="240" w:lineRule="auto"/>
+              <w:rPr>
+                <w:rFonts w:ascii="Arial" w:hAnsi="Arial" w:cs="Arial"/>
+                <w:szCs w:val="24"/>
+              </w:rPr>
+            </w:pPr>
+            <w:r>
+              <w:rPr>
+                <w:rFonts w:ascii="Arial" w:eastAsia="Arial" w:hAnsi="Arial" w:cs="Arial"/>
+                <w:szCs w:val="24"/>
+              </w:rPr>
+              <w:t>Cesión</w:t>
+            </w:r>
+            <w:r>
+              <w:rPr>
+                <w:rFonts w:ascii="Arial" w:eastAsia="Arial" w:hAnsi="Arial" w:cs="Arial"/>
+                <w:szCs w:val="24"/>
+              </w:rPr>
+              <w:t>: ${CESIONES}</w:t>
+            </w:r>
+          </w:p>
+          <w:p>
+            <w:pPr>
+              <w:pStyle w:val="Textoindependiente2"/>
+              <w:spacing w:line="240" w:lineRule="auto"/>
+              <w:rPr>
+                <w:rFonts w:ascii="Arial" w:hAnsi="Arial" w:cs="Arial"/>
+                <w:szCs w:val="24"/>
+              </w:rPr>
+            </w:pPr>
+          </w:p>
+        </w:tc>
+      </w:tr>
+      <w:tr>
+        <w:trPr>
+          <w:trHeight w:val="153"/>
+        </w:trPr>
+        <w:tc>
+          <w:tcPr>
+            <w:tcW w:w="10114" w:type="dxa"/>
+            <w:gridSpan w:val="3"/>
+            <w:tcBorders>
+              <w:top w:val="single" w:sz="4" w:space="0" w:color="000000"/>
+              <w:left w:val="single" w:sz="4" w:space="0" w:color="000000"/>
+              <w:bottom w:val="single" w:sz="4" w:space="0" w:color="000000"/>
+              <w:right w:val="single" w:sz="4" w:space="0" w:color="000000"/>
+            </w:tcBorders>
+            <w:shd w:val="clear" w:color="auto" w:fill="auto"/>
+            <w:tcMar>
+              <w:top w:w="0" w:type="dxa"/>
+              <w:left w:w="70" w:type="dxa"/>
+              <w:bottom w:w="0" w:type="dxa"/>
+              <w:right w:w="70" w:type="dxa"/>
+            </w:tcMar>
+            <w:vAlign w:val="center"/>
+          </w:tcPr>
+          <w:p>
+            <w:pPr>
+              <w:pStyle w:val="Textoindependiente2"/>
+              <w:spacing w:line="240" w:lineRule="auto"/>
+              <w:rPr>
+                <w:rFonts w:ascii="Arial" w:hAnsi="Arial" w:cs="Arial"/>
+                <w:szCs w:val="24"/>
+              </w:rPr>
+            </w:pPr>
+            <w:r>
+              <w:rPr>
+                <w:rFonts w:ascii="Arial" w:eastAsia="Arial" w:hAnsi="Arial" w:cs="Arial"/>
+                <w:szCs w:val="24"/>
+              </w:rPr>
+              <w:t>Terminación anticipada</w:t>
+            </w:r>
+            <w:r>
+              <w:rPr>
+                <w:rFonts w:ascii="Arial" w:eastAsia="Arial" w:hAnsi="Arial" w:cs="Arial"/>
+                <w:szCs w:val="24"/>
+              </w:rPr>
+              <w:t>: ${TERMINACION_ANTICIPADA}</w:t>
+            </w:r>
+          </w:p>
+          <w:p>
+            <w:pPr>
+              <w:pStyle w:val="Textoindependiente2"/>
+              <w:spacing w:line="240" w:lineRule="auto"/>
+              <w:rPr>
+                <w:rFonts w:ascii="Arial" w:hAnsi="Arial" w:cs="Arial"/>
+                <w:szCs w:val="24"/>
+              </w:rPr>
+            </w:pPr>
           </w:p>
         </w:tc>
       </w:tr>
       <w:tr>
         <w:tc>
           <w:tcPr>
-            <w:tcW w:w="5000" w:type="pct"/>
+            <w:tcW w:w="10114" w:type="dxa"/>
+            <w:gridSpan w:val="3"/>
+            <w:tcBorders>
+              <w:top w:val="single" w:sz="4" w:space="0" w:color="000000"/>
+              <w:left w:val="single" w:sz="4" w:space="0" w:color="000000"/>
+              <w:bottom w:val="single" w:sz="4" w:space="0" w:color="000000"/>
+              <w:right w:val="single" w:sz="4" w:space="0" w:color="000000"/>
+            </w:tcBorders>
+            <w:shd w:val="clear" w:color="auto" w:fill="D9D9D9" w:themeFill="background1" w:themeFillShade="D9"/>
+            <w:tcMar>
+              <w:top w:w="0" w:type="dxa"/>
+              <w:left w:w="70" w:type="dxa"/>
+              <w:bottom w:w="0" w:type="dxa"/>
+              <w:right w:w="70" w:type="dxa"/>
+            </w:tcMar>
+          </w:tcPr>
+          <w:p>
+            <w:pPr>
+              <w:pStyle w:val="Textoindependiente2"/>
+              <w:spacing w:line="240" w:lineRule="auto"/>
+              <w:ind w:left="720"/>
+              <w:rPr>
+                <w:rFonts w:ascii="Arial" w:hAnsi="Arial" w:cs="Arial"/>
+                <w:sz w:val="8"/>
+                <w:szCs w:val="8"/>
+              </w:rPr>
+            </w:pPr>
+          </w:p>
+          <w:p>
+            <w:pPr>
+              <w:pStyle w:val="Textoindependiente2"/>
+              <w:numPr>
+                <w:ilvl w:val="0"/>
+                <w:numId w:val="1"/>
+              </w:numPr>
+              <w:spacing w:line="240" w:lineRule="auto"/>
+              <w:jc w:val="center"/>
+              <w:rPr>
+                <w:rFonts w:ascii="Arial" w:hAnsi="Arial" w:cs="Arial"/>
+                <w:szCs w:val="24"/>
+              </w:rPr>
+            </w:pPr>
+            <w:r>
+              <w:rPr>
+                <w:rFonts w:ascii="Arial" w:hAnsi="Arial" w:cs="Arial"/>
+                <w:szCs w:val="24"/>
+              </w:rPr>
+              <w:t>INFORME CONTABLE Y FINANCIERO</w:t>
+            </w:r>
+          </w:p>
+          <w:p>
+            <w:pPr>
+              <w:pStyle w:val="Textoindependiente2"/>
+              <w:spacing w:line="240" w:lineRule="auto"/>
+              <w:ind w:left="720"/>
+              <w:rPr>
+                <w:rFonts w:ascii="Arial" w:hAnsi="Arial" w:cs="Arial"/>
+                <w:sz w:val="8"/>
+                <w:szCs w:val="8"/>
+              </w:rPr>
+            </w:pPr>
+          </w:p>
+        </w:tc>
+      </w:tr>
+      <w:tr>
+        <w:trPr>
+          <w:trHeight w:val="397"/>
+        </w:trPr>
+        <w:tc>
+          <w:tcPr>
+            <w:tcW w:w="10114" w:type="dxa"/>
+            <w:gridSpan w:val="3"/>
+            <w:tcBorders>
+              <w:top w:val="single" w:sz="4" w:space="0" w:color="000000"/>
+              <w:left w:val="single" w:sz="4" w:space="0" w:color="000000"/>
+              <w:bottom w:val="single" w:sz="4" w:space="0" w:color="000000"/>
+              <w:right w:val="single" w:sz="4" w:space="0" w:color="000000"/>
+            </w:tcBorders>
+            <w:shd w:val="clear" w:color="auto" w:fill="auto"/>
+            <w:tcMar>
+              <w:top w:w="0" w:type="dxa"/>
+              <w:left w:w="70" w:type="dxa"/>
+              <w:bottom w:w="0" w:type="dxa"/>
+              <w:right w:w="70" w:type="dxa"/>
+            </w:tcMar>
+            <w:vAlign w:val="center"/>
+          </w:tcPr>
+          <w:p>
+            <w:pPr>
+              <w:pStyle w:val="Textoindependiente2"/>
+              <w:spacing w:line="240" w:lineRule="auto"/>
+              <w:rPr>
+                <w:rFonts w:ascii="Arial" w:hAnsi="Arial" w:cs="Arial"/>
+                <w:szCs w:val="24"/>
+              </w:rPr>
+            </w:pPr>
+            <w:r>
+              <w:rPr>
+                <w:rFonts w:ascii="Arial" w:hAnsi="Arial" w:cs="Arial"/>
+                <w:szCs w:val="24"/>
+              </w:rPr>
+              <w:t>V</w:t>
+            </w:r>
+            <w:r>
+              <w:rPr>
+                <w:rFonts w:ascii="Arial" w:hAnsi="Arial" w:cs="Arial"/>
+                <w:szCs w:val="24"/>
+              </w:rPr>
+              <w:t>alor</w:t>
+            </w:r>
+            <w:r>
+              <w:rPr>
+                <w:rFonts w:ascii="Arial" w:hAnsi="Arial" w:cs="Arial"/>
+                <w:szCs w:val="24"/>
+              </w:rPr>
+              <w:t xml:space="preserve"> inicial</w:t>
+            </w:r>
+            <w:r>
+              <w:rPr>
+                <w:rFonts w:ascii="Arial" w:hAnsi="Arial" w:cs="Arial"/>
+                <w:szCs w:val="24"/>
+              </w:rPr>
+              <w:t xml:space="preserve"> del contrato:</w:t>
+            </w:r>
+            <w:r>
+              <w:rPr>
+                <w:rFonts w:ascii="Arial" w:hAnsi="Arial" w:cs="Arial"/>
+                <w:szCs w:val="24"/>
+              </w:rPr>
+              <w:t xml:space="preserve"> </w:t>
+            </w:r>
+            <w:r>
+              <w:rPr>
+                <w:rFonts w:ascii="Arial" w:hAnsi="Arial" w:cs="Arial"/>
+                <w:szCs w:val="24"/>
+              </w:rPr>
+              <w:t>Es hasta por la suma de</w:t>
+            </w:r>
+            <w:r>
+              <w:rPr>
+                <w:rFonts w:ascii="Arial" w:hAnsi="Arial" w:cs="Arial"/>
+                <w:szCs w:val="24"/>
+              </w:rPr>
+              <w:t xml:space="preserve"> </w:t>
+            </w:r>
+            <w:r>
+              <w:rPr>
+                <w:rFonts w:ascii="Arial" w:hAnsi="Arial" w:cs="Arial"/>
+                <w:szCs w:val="24"/>
+              </w:rPr>
+              <w:t>${VALOR_INICIAL_LETRAS} M/CTE ($${VALOR_INICIAL_NUMEROS}).</w:t>
+            </w:r>
+          </w:p>
+          <w:p>
+            <w:pPr>
+              <w:pStyle w:val="Textoindependiente2"/>
+              <w:spacing w:line="240" w:lineRule="auto"/>
+              <w:rPr>
+                <w:rFonts w:ascii="Arial" w:hAnsi="Arial" w:cs="Arial"/>
+                <w:szCs w:val="24"/>
+              </w:rPr>
+            </w:pPr>
+          </w:p>
+        </w:tc>
+      </w:tr>
+      <w:tr>
+        <w:tc>
+          <w:tcPr>
+            <w:tcW w:w="10114" w:type="dxa"/>
+            <w:gridSpan w:val="3"/>
+            <w:tcBorders>
+              <w:top w:val="single" w:sz="4" w:space="0" w:color="000000"/>
+              <w:left w:val="single" w:sz="4" w:space="0" w:color="000000"/>
+              <w:bottom w:val="single" w:sz="4" w:space="0" w:color="000000"/>
+              <w:right w:val="single" w:sz="4" w:space="0" w:color="000000"/>
+            </w:tcBorders>
+            <w:shd w:val="clear" w:color="auto" w:fill="auto"/>
+            <w:tcMar>
+              <w:top w:w="0" w:type="dxa"/>
+              <w:left w:w="70" w:type="dxa"/>
+              <w:bottom w:w="0" w:type="dxa"/>
+              <w:right w:w="70" w:type="dxa"/>
+            </w:tcMar>
+            <w:vAlign w:val="center"/>
+          </w:tcPr>
+          <w:p>
+            <w:pPr>
+              <w:suppressAutoHyphens w:val="0"/>
+              <w:autoSpaceDN/>
+              <w:jc w:val="both"/>
+              <w:textAlignment w:val="auto"/>
+              <w:rPr>
+                <w:rFonts w:ascii="Arial" w:hAnsi="Arial" w:cs="Arial"/>
+                <w:szCs w:val="24"/>
+              </w:rPr>
+            </w:pPr>
+            <w:r>
+              <w:rPr>
+                <w:rFonts w:ascii="Arial" w:eastAsia="Arial" w:hAnsi="Arial" w:cs="Arial"/>
+                <w:color w:val="000000"/>
+                <w:sz w:val="24"/>
+                <w:szCs w:val="24"/>
+                <w:lang w:val="es" w:eastAsia="es-CO"/>
+              </w:rPr>
+              <w:lastRenderedPageBreak/>
+              <w:t>Adición</w:t>
+            </w:r>
+            <w:r>
+              <w:rPr>
+                <w:rFonts w:ascii="Arial" w:hAnsi="Arial" w:cs="Arial"/>
+                <w:i/>
+                <w:szCs w:val="24"/>
+              </w:rPr>
+              <w:t xml:space="preserve">: </w:t>
+            </w:r>
+            <w:r>
+              <w:t xml:space="preserve"> </w:t>
+            </w:r>
+            <w:r>
+              <w:rPr>
+                <w:rFonts w:ascii="Arial" w:hAnsi="Arial" w:cs="Arial"/>
+                <w:sz w:val="24"/>
+                <w:szCs w:val="24"/>
+              </w:rPr>
+              <w:t>${ADICIONES}</w:t>
+            </w:r>
+          </w:p>
+          <w:p>
+            <w:pPr>
+              <w:pStyle w:val="Textoindependiente2"/>
+              <w:spacing w:line="240" w:lineRule="auto"/>
+              <w:rPr>
+                <w:rFonts w:ascii="Arial" w:hAnsi="Arial" w:cs="Arial"/>
+                <w:szCs w:val="24"/>
+              </w:rPr>
+            </w:pPr>
+          </w:p>
+        </w:tc>
+      </w:tr>
+      <w:tr>
+        <w:tc>
+          <w:tcPr>
+            <w:tcW w:w="10114" w:type="dxa"/>
+            <w:gridSpan w:val="3"/>
+            <w:tcBorders>
+              <w:top w:val="single" w:sz="4" w:space="0" w:color="000000"/>
+              <w:left w:val="single" w:sz="4" w:space="0" w:color="000000"/>
+              <w:bottom w:val="single" w:sz="4" w:space="0" w:color="000000"/>
+              <w:right w:val="single" w:sz="4" w:space="0" w:color="000000"/>
+            </w:tcBorders>
+            <w:shd w:val="clear" w:color="auto" w:fill="auto"/>
+            <w:tcMar>
+              <w:top w:w="0" w:type="dxa"/>
+              <w:left w:w="70" w:type="dxa"/>
+              <w:bottom w:w="0" w:type="dxa"/>
+              <w:right w:w="70" w:type="dxa"/>
+            </w:tcMar>
+            <w:vAlign w:val="center"/>
+          </w:tcPr>
+          <w:p>
+            <w:pPr>
+              <w:suppressAutoHyphens w:val="0"/>
+              <w:autoSpaceDN/>
+              <w:jc w:val="both"/>
+              <w:textAlignment w:val="auto"/>
+              <w:rPr>
+                <w:rFonts w:ascii="Arial" w:hAnsi="Arial" w:cs="Arial"/>
+                <w:sz w:val="24"/>
+                <w:szCs w:val="24"/>
+              </w:rPr>
+            </w:pPr>
+            <w:r>
+              <w:rPr>
+                <w:rFonts w:ascii="Arial" w:hAnsi="Arial" w:cs="Arial"/>
+                <w:sz w:val="24"/>
+                <w:szCs w:val="24"/>
+              </w:rPr>
+              <w:t>Prórroga:  ${PRORROGAS}</w:t>
+            </w:r>
+          </w:p>
+          <w:p>
+            <w:pPr>
+              <w:suppressAutoHyphens w:val="0"/>
+              <w:autoSpaceDN/>
+              <w:jc w:val="both"/>
+              <w:textAlignment w:val="auto"/>
+              <w:rPr>
+                <w:rFonts w:ascii="Arial" w:eastAsia="Arial" w:hAnsi="Arial" w:cs="Arial"/>
+                <w:color w:val="000000"/>
+                <w:sz w:val="24"/>
+                <w:szCs w:val="24"/>
+                <w:lang w:val="es" w:eastAsia="es-CO"/>
+              </w:rPr>
+            </w:pPr>
+          </w:p>
+        </w:tc>
+      </w:tr>
+      <w:tr>
+        <w:tc>
+          <w:tcPr>
+            <w:tcW w:w="10114" w:type="dxa"/>
             <w:gridSpan w:val="3"/>
             <w:tcBorders>
               <w:top w:val="single" w:sz="4" w:space="0" w:color="000000"/>
@@ -1124,564 +1661,6 @@
               <w:pStyle w:val="Textoindependiente2"/>
               <w:spacing w:line="240" w:lineRule="auto"/>
               <w:rPr>
-                <w:rFonts w:ascii="Arial" w:hAnsi="Arial" w:cs="Arial"/>
-                <w:szCs w:val="24"/>
-              </w:rPr>
-            </w:pPr>
-            <w:r>
-              <w:rPr>
-                <w:rFonts w:ascii="Arial" w:eastAsia="Arial" w:hAnsi="Arial" w:cs="Arial"/>
-                <w:sz w:val="22"/>
-              </w:rPr>
-              <w:t>Modificación(es) al contrato</w:t>
-            </w:r>
-            <w:r>
-              <w:rPr>
-                <w:rFonts w:ascii="Arial" w:eastAsia="Arial" w:hAnsi="Arial" w:cs="Arial"/>
-                <w:sz w:val="22"/>
-              </w:rPr>
-              <w:t>: ${MODIFICACIONES}</w:t>
-            </w:r>
-          </w:p>
-          <w:p>
-            <w:pPr>
-              <w:pStyle w:val="Textoindependiente2"/>
-              <w:spacing w:line="240" w:lineRule="auto"/>
-              <w:rPr>
-                <w:rFonts w:ascii="Arial" w:hAnsi="Arial" w:cs="Arial"/>
-                <w:szCs w:val="24"/>
-              </w:rPr>
-            </w:pPr>
-          </w:p>
-        </w:tc>
-      </w:tr>
-      <w:tr>
-        <w:tc>
-          <w:tcPr>
-            <w:tcW w:w="5000" w:type="pct"/>
-            <w:gridSpan w:val="3"/>
-            <w:tcBorders>
-              <w:top w:val="single" w:sz="4" w:space="0" w:color="000000"/>
-              <w:left w:val="single" w:sz="4" w:space="0" w:color="000000"/>
-              <w:bottom w:val="single" w:sz="4" w:space="0" w:color="000000"/>
-              <w:right w:val="single" w:sz="4" w:space="0" w:color="000000"/>
-            </w:tcBorders>
-            <w:shd w:val="clear" w:color="auto" w:fill="auto"/>
-            <w:tcMar>
-              <w:top w:w="0" w:type="dxa"/>
-              <w:left w:w="70" w:type="dxa"/>
-              <w:bottom w:w="0" w:type="dxa"/>
-              <w:right w:w="70" w:type="dxa"/>
-            </w:tcMar>
-          </w:tcPr>
-          <w:p>
-            <w:pPr>
-              <w:pStyle w:val="Textoindependiente2"/>
-              <w:spacing w:line="240" w:lineRule="auto"/>
-              <w:rPr>
-                <w:rFonts w:ascii="Arial" w:hAnsi="Arial" w:cs="Arial"/>
-                <w:szCs w:val="24"/>
-              </w:rPr>
-            </w:pPr>
-            <w:r>
-              <w:rPr>
-                <w:rFonts w:ascii="Arial" w:eastAsia="Arial" w:hAnsi="Arial" w:cs="Arial"/>
-                <w:sz w:val="22"/>
-              </w:rPr>
-              <w:t>Suspensión</w:t>
-            </w:r>
-            <w:r>
-              <w:rPr>
-                <w:rFonts w:ascii="Arial" w:eastAsia="Arial" w:hAnsi="Arial" w:cs="Arial"/>
-                <w:sz w:val="22"/>
-              </w:rPr>
-              <w:t>: ${SUSPENSIONES}</w:t>
-            </w:r>
-          </w:p>
-          <w:p>
-            <w:pPr>
-              <w:pStyle w:val="Textoindependiente2"/>
-              <w:spacing w:line="240" w:lineRule="auto"/>
-              <w:rPr>
-                <w:rFonts w:ascii="Arial" w:hAnsi="Arial" w:cs="Arial"/>
-                <w:szCs w:val="24"/>
-              </w:rPr>
-            </w:pPr>
-          </w:p>
-        </w:tc>
-      </w:tr>
-      <w:tr>
-        <w:tc>
-          <w:tcPr>
-            <w:tcW w:w="5000" w:type="pct"/>
-            <w:gridSpan w:val="3"/>
-            <w:tcBorders>
-              <w:top w:val="single" w:sz="4" w:space="0" w:color="000000"/>
-              <w:left w:val="single" w:sz="4" w:space="0" w:color="000000"/>
-              <w:bottom w:val="single" w:sz="4" w:space="0" w:color="000000"/>
-              <w:right w:val="single" w:sz="4" w:space="0" w:color="000000"/>
-            </w:tcBorders>
-            <w:shd w:val="clear" w:color="auto" w:fill="auto"/>
-            <w:tcMar>
-              <w:top w:w="0" w:type="dxa"/>
-              <w:left w:w="70" w:type="dxa"/>
-              <w:bottom w:w="0" w:type="dxa"/>
-              <w:right w:w="70" w:type="dxa"/>
-            </w:tcMar>
-          </w:tcPr>
-          <w:p>
-            <w:pPr>
-              <w:pStyle w:val="Textoindependiente2"/>
-              <w:spacing w:line="240" w:lineRule="auto"/>
-              <w:rPr>
-                <w:rFonts w:ascii="Arial" w:hAnsi="Arial" w:cs="Arial"/>
-                <w:szCs w:val="24"/>
-              </w:rPr>
-            </w:pPr>
-            <w:r>
-              <w:rPr>
-                <w:rFonts w:ascii="Arial" w:eastAsia="Arial" w:hAnsi="Arial" w:cs="Arial"/>
-                <w:sz w:val="22"/>
-              </w:rPr>
-              <w:t>Reanudación</w:t>
-            </w:r>
-            <w:r>
-              <w:rPr>
-                <w:rFonts w:ascii="Arial" w:eastAsia="Arial" w:hAnsi="Arial" w:cs="Arial"/>
-                <w:sz w:val="22"/>
-              </w:rPr>
-              <w:t>: ${REANUDACIONES}</w:t>
-            </w:r>
-          </w:p>
-          <w:p>
-            <w:pPr>
-              <w:pStyle w:val="Textoindependiente2"/>
-              <w:spacing w:line="240" w:lineRule="auto"/>
-              <w:rPr>
-                <w:rFonts w:ascii="Arial" w:hAnsi="Arial" w:cs="Arial"/>
-                <w:szCs w:val="24"/>
-              </w:rPr>
-            </w:pPr>
-          </w:p>
-        </w:tc>
-      </w:tr>
-      <w:tr>
-        <w:tc>
-          <w:tcPr>
-            <w:tcW w:w="5000" w:type="pct"/>
-            <w:gridSpan w:val="3"/>
-            <w:tcBorders>
-              <w:top w:val="single" w:sz="4" w:space="0" w:color="000000"/>
-              <w:left w:val="single" w:sz="4" w:space="0" w:color="000000"/>
-              <w:bottom w:val="single" w:sz="4" w:space="0" w:color="000000"/>
-              <w:right w:val="single" w:sz="4" w:space="0" w:color="000000"/>
-            </w:tcBorders>
-            <w:shd w:val="clear" w:color="auto" w:fill="auto"/>
-            <w:tcMar>
-              <w:top w:w="0" w:type="dxa"/>
-              <w:left w:w="70" w:type="dxa"/>
-              <w:bottom w:w="0" w:type="dxa"/>
-              <w:right w:w="70" w:type="dxa"/>
-            </w:tcMar>
-          </w:tcPr>
-          <w:p>
-            <w:pPr>
-              <w:pStyle w:val="Textoindependiente2"/>
-              <w:spacing w:line="240" w:lineRule="auto"/>
-              <w:rPr>
-                <w:rFonts w:ascii="Arial" w:hAnsi="Arial" w:cs="Arial"/>
-                <w:szCs w:val="24"/>
-              </w:rPr>
-            </w:pPr>
-            <w:r>
-              <w:rPr>
-                <w:rFonts w:ascii="Arial" w:eastAsia="Arial" w:hAnsi="Arial" w:cs="Arial"/>
-                <w:sz w:val="22"/>
-              </w:rPr>
-              <w:t>Cesión</w:t>
-            </w:r>
-            <w:r>
-              <w:rPr>
-                <w:rFonts w:ascii="Arial" w:eastAsia="Arial" w:hAnsi="Arial" w:cs="Arial"/>
-                <w:sz w:val="22"/>
-              </w:rPr>
-              <w:t>: ${CESIONES}</w:t>
-            </w:r>
-          </w:p>
-          <w:p>
-            <w:pPr>
-              <w:pStyle w:val="Textoindependiente2"/>
-              <w:spacing w:line="240" w:lineRule="auto"/>
-              <w:rPr>
-                <w:rFonts w:ascii="Arial" w:hAnsi="Arial" w:cs="Arial"/>
-                <w:szCs w:val="24"/>
-              </w:rPr>
-            </w:pPr>
-          </w:p>
-        </w:tc>
-      </w:tr>
-      <w:tr>
-        <w:tc>
-          <w:tcPr>
-            <w:tcW w:w="5000" w:type="pct"/>
-            <w:gridSpan w:val="3"/>
-            <w:tcBorders>
-              <w:top w:val="single" w:sz="4" w:space="0" w:color="000000"/>
-              <w:left w:val="single" w:sz="4" w:space="0" w:color="000000"/>
-              <w:bottom w:val="single" w:sz="4" w:space="0" w:color="000000"/>
-              <w:right w:val="single" w:sz="4" w:space="0" w:color="000000"/>
-            </w:tcBorders>
-            <w:shd w:val="clear" w:color="auto" w:fill="auto"/>
-            <w:tcMar>
-              <w:top w:w="0" w:type="dxa"/>
-              <w:left w:w="70" w:type="dxa"/>
-              <w:bottom w:w="0" w:type="dxa"/>
-              <w:right w:w="70" w:type="dxa"/>
-            </w:tcMar>
-          </w:tcPr>
-          <w:p>
-            <w:pPr>
-              <w:pStyle w:val="Textoindependiente2"/>
-              <w:spacing w:line="240" w:lineRule="auto"/>
-              <w:rPr>
-                <w:rFonts w:ascii="Arial" w:hAnsi="Arial" w:cs="Arial"/>
-                <w:szCs w:val="24"/>
-              </w:rPr>
-            </w:pPr>
-            <w:r>
-              <w:rPr>
-                <w:rFonts w:ascii="Arial" w:eastAsia="Arial" w:hAnsi="Arial" w:cs="Arial"/>
-                <w:sz w:val="22"/>
-              </w:rPr>
-              <w:t>Terminación anticipada</w:t>
-            </w:r>
-            <w:r>
-              <w:rPr>
-                <w:rFonts w:ascii="Arial" w:eastAsia="Arial" w:hAnsi="Arial" w:cs="Arial"/>
-                <w:sz w:val="22"/>
-              </w:rPr>
-              <w:t>: ${TERMINACION_ANTICIPADA}</w:t>
-            </w:r>
-          </w:p>
-          <w:p>
-            <w:pPr>
-              <w:pStyle w:val="Textoindependiente2"/>
-              <w:spacing w:line="240" w:lineRule="auto"/>
-              <w:rPr>
-                <w:rFonts w:ascii="Arial" w:hAnsi="Arial" w:cs="Arial"/>
-                <w:szCs w:val="24"/>
-              </w:rPr>
-            </w:pPr>
-          </w:p>
-        </w:tc>
-      </w:tr>
-      <w:tr>
-        <w:tc>
-          <w:tcPr>
-            <w:tcW w:w="5000" w:type="pct"/>
-            <w:gridSpan w:val="3"/>
-            <w:tcBorders>
-              <w:top w:val="single" w:sz="4" w:space="0" w:color="000000"/>
-              <w:left w:val="single" w:sz="4" w:space="0" w:color="000000"/>
-              <w:bottom w:val="single" w:sz="4" w:space="0" w:color="000000"/>
-              <w:right w:val="single" w:sz="4" w:space="0" w:color="000000"/>
-            </w:tcBorders>
-            <w:shd w:val="clear" w:color="auto" w:fill="D9D9D9" w:themeFill="background1" w:themeFillShade="D9"/>
-            <w:tcMar>
-              <w:top w:w="0" w:type="dxa"/>
-              <w:left w:w="70" w:type="dxa"/>
-              <w:bottom w:w="0" w:type="dxa"/>
-              <w:right w:w="70" w:type="dxa"/>
-            </w:tcMar>
-          </w:tcPr>
-          <w:p>
-            <w:pPr>
-              <w:pStyle w:val="Textoindependiente2"/>
-              <w:spacing w:line="240" w:lineRule="auto"/>
-              <w:ind w:left="720"/>
-              <w:rPr>
-                <w:rFonts w:ascii="Arial" w:hAnsi="Arial" w:cs="Arial"/>
-                <w:sz w:val="8"/>
-                <w:szCs w:val="8"/>
-              </w:rPr>
-            </w:pPr>
-          </w:p>
-          <w:p>
-            <w:pPr>
-              <w:pStyle w:val="Textoindependiente2"/>
-              <w:numPr>
-                <w:ilvl w:val="0"/>
-                <w:numId w:val="1"/>
-              </w:numPr>
-              <w:spacing w:line="240" w:lineRule="auto"/>
-              <w:jc w:val="center"/>
-              <w:rPr>
-                <w:rFonts w:ascii="Arial" w:hAnsi="Arial" w:cs="Arial"/>
-                <w:szCs w:val="24"/>
-              </w:rPr>
-            </w:pPr>
-            <w:r>
-              <w:rPr>
-                <w:rFonts w:ascii="Arial" w:hAnsi="Arial" w:cs="Arial"/>
-                <w:szCs w:val="24"/>
-              </w:rPr>
-              <w:t>INFORME CONTABLE Y FINANCIERO</w:t>
-            </w:r>
-          </w:p>
-          <w:p>
-            <w:pPr>
-              <w:pStyle w:val="Textoindependiente2"/>
-              <w:spacing w:line="240" w:lineRule="auto"/>
-              <w:ind w:left="720"/>
-              <w:rPr>
-                <w:rFonts w:ascii="Arial" w:hAnsi="Arial" w:cs="Arial"/>
-                <w:sz w:val="8"/>
-                <w:szCs w:val="8"/>
-              </w:rPr>
-            </w:pPr>
-          </w:p>
-        </w:tc>
-      </w:tr>
-      <w:tr>
-        <w:tc>
-          <w:tcPr>
-            <w:tcW w:w="5000" w:type="pct"/>
-            <w:gridSpan w:val="3"/>
-            <w:tcBorders>
-              <w:top w:val="single" w:sz="4" w:space="0" w:color="000000"/>
-              <w:left w:val="single" w:sz="4" w:space="0" w:color="000000"/>
-              <w:bottom w:val="single" w:sz="4" w:space="0" w:color="000000"/>
-              <w:right w:val="single" w:sz="4" w:space="0" w:color="000000"/>
-            </w:tcBorders>
-            <w:shd w:val="clear" w:color="auto" w:fill="auto"/>
-            <w:tcMar>
-              <w:top w:w="0" w:type="dxa"/>
-              <w:left w:w="70" w:type="dxa"/>
-              <w:bottom w:w="0" w:type="dxa"/>
-              <w:right w:w="70" w:type="dxa"/>
-            </w:tcMar>
-          </w:tcPr>
-          <w:p>
-            <w:pPr>
-              <w:pStyle w:val="Textoindependiente2"/>
-              <w:spacing w:line="240" w:lineRule="auto"/>
-              <w:rPr>
-                <w:rFonts w:ascii="Arial" w:hAnsi="Arial" w:cs="Arial"/>
-                <w:szCs w:val="24"/>
-              </w:rPr>
-            </w:pPr>
-            <w:r>
-              <w:rPr>
-                <w:rFonts w:ascii="Arial" w:hAnsi="Arial" w:cs="Arial"/>
-                <w:szCs w:val="24"/>
-              </w:rPr>
-              <w:t>V</w:t>
-            </w:r>
-            <w:r>
-              <w:rPr>
-                <w:rFonts w:ascii="Arial" w:hAnsi="Arial" w:cs="Arial"/>
-                <w:szCs w:val="24"/>
-              </w:rPr>
-              <w:t>alor</w:t>
-            </w:r>
-            <w:r>
-              <w:rPr>
-                <w:rFonts w:ascii="Arial" w:hAnsi="Arial" w:cs="Arial"/>
-                <w:szCs w:val="24"/>
-              </w:rPr>
-              <w:t xml:space="preserve"> inicial</w:t>
-            </w:r>
-            <w:r>
-              <w:rPr>
-                <w:rFonts w:ascii="Arial" w:hAnsi="Arial" w:cs="Arial"/>
-                <w:szCs w:val="24"/>
-              </w:rPr>
-              <w:t xml:space="preserve"> del contrato:</w:t>
-            </w:r>
-            <w:r>
-              <w:rPr>
-                <w:rFonts w:ascii="Arial" w:hAnsi="Arial" w:cs="Arial"/>
-                <w:szCs w:val="24"/>
-              </w:rPr>
-              <w:t xml:space="preserve"> </w:t>
-            </w:r>
-            <w:r>
-              <w:rPr>
-                <w:rFonts w:ascii="Arial" w:hAnsi="Arial" w:cs="Arial"/>
-                <w:szCs w:val="24"/>
-              </w:rPr>
-              <w:t>Es hasta por la suma de</w:t>
-            </w:r>
-            <w:r>
-              <w:rPr>
-                <w:rFonts w:ascii="Arial" w:hAnsi="Arial" w:cs="Arial"/>
-                <w:szCs w:val="24"/>
-              </w:rPr>
-              <w:t xml:space="preserve"> </w:t>
-            </w:r>
-            <w:r>
-              <w:rPr>
-                <w:rFonts w:ascii="Arial" w:hAnsi="Arial" w:cs="Arial"/>
-                <w:szCs w:val="24"/>
-              </w:rPr>
-              <w:t>${VALOR_INICIAL_LETRAS} M/CTE ($${VALOR_INICIAL_NUMEROS}).</w:t>
-            </w:r>
-          </w:p>
-          <w:p>
-            <w:pPr>
-              <w:pStyle w:val="Textoindependiente2"/>
-              <w:spacing w:line="240" w:lineRule="auto"/>
-              <w:rPr>
-                <w:rFonts w:ascii="Arial" w:hAnsi="Arial" w:cs="Arial"/>
-                <w:szCs w:val="24"/>
-              </w:rPr>
-            </w:pPr>
-          </w:p>
-        </w:tc>
-      </w:tr>
-      <w:tr>
-        <w:tc>
-          <w:tcPr>
-            <w:tcW w:w="5000" w:type="pct"/>
-            <w:gridSpan w:val="3"/>
-            <w:tcBorders>
-              <w:top w:val="single" w:sz="4" w:space="0" w:color="000000"/>
-              <w:left w:val="single" w:sz="4" w:space="0" w:color="000000"/>
-              <w:bottom w:val="single" w:sz="4" w:space="0" w:color="000000"/>
-              <w:right w:val="single" w:sz="4" w:space="0" w:color="000000"/>
-            </w:tcBorders>
-            <w:shd w:val="clear" w:color="auto" w:fill="auto"/>
-            <w:tcMar>
-              <w:top w:w="0" w:type="dxa"/>
-              <w:left w:w="70" w:type="dxa"/>
-              <w:bottom w:w="0" w:type="dxa"/>
-              <w:right w:w="70" w:type="dxa"/>
-            </w:tcMar>
-          </w:tcPr>
-          <w:p>
-            <w:pPr>
-              <w:pStyle w:val="Textoindependiente2"/>
-              <w:spacing w:line="240" w:lineRule="auto"/>
-              <w:rPr>
-                <w:rFonts w:ascii="Arial" w:hAnsi="Arial" w:cs="Arial"/>
-                <w:szCs w:val="24"/>
-              </w:rPr>
-            </w:pPr>
-            <w:r>
-              <w:rPr>
-                <w:rFonts w:ascii="Arial" w:hAnsi="Arial" w:cs="Arial"/>
-                <w:szCs w:val="24"/>
-              </w:rPr>
-              <w:t>A</w:t>
-            </w:r>
-            <w:r>
-              <w:rPr>
-                <w:rFonts w:ascii="Arial" w:hAnsi="Arial" w:cs="Arial"/>
-                <w:szCs w:val="24"/>
-              </w:rPr>
-              <w:t>dición</w:t>
-            </w:r>
-            <w:r>
-              <w:rPr>
-                <w:rFonts w:ascii="Arial" w:hAnsi="Arial" w:cs="Arial"/>
-                <w:i/>
-                <w:szCs w:val="24"/>
-              </w:rPr>
-              <w:t xml:space="preserve">: </w:t>
-            </w:r>
-          </w:p>
-          <w:p>
-            <w:pPr>
-              <w:pStyle w:val="Textoindependiente2"/>
-              <w:spacing w:line="240" w:lineRule="auto"/>
-              <w:rPr>
-                <w:rFonts w:ascii="Arial" w:hAnsi="Arial" w:cs="Arial"/>
-                <w:szCs w:val="24"/>
-              </w:rPr>
-            </w:pPr>
-          </w:p>
-        </w:tc>
-      </w:tr>
-      <w:tr>
-        <w:tc>
-          <w:tcPr>
-            <w:tcW w:w="5000" w:type="pct"/>
-            <w:gridSpan w:val="3"/>
-            <w:tcBorders>
-              <w:top w:val="single" w:sz="4" w:space="0" w:color="000000"/>
-              <w:left w:val="single" w:sz="4" w:space="0" w:color="000000"/>
-              <w:bottom w:val="single" w:sz="4" w:space="0" w:color="000000"/>
-              <w:right w:val="single" w:sz="4" w:space="0" w:color="000000"/>
-            </w:tcBorders>
-            <w:shd w:val="clear" w:color="auto" w:fill="auto"/>
-            <w:tcMar>
-              <w:top w:w="0" w:type="dxa"/>
-              <w:left w:w="70" w:type="dxa"/>
-              <w:bottom w:w="0" w:type="dxa"/>
-              <w:right w:w="70" w:type="dxa"/>
-            </w:tcMar>
-          </w:tcPr>
-          <w:p>
-            <w:pPr>
-              <w:pStyle w:val="Textoindependiente2"/>
-              <w:spacing w:line="240" w:lineRule="auto"/>
-              <w:rPr>
-                <w:rFonts w:ascii="Arial" w:hAnsi="Arial" w:cs="Arial"/>
-                <w:szCs w:val="24"/>
-              </w:rPr>
-            </w:pPr>
-            <w:r>
-              <w:rPr>
-                <w:rFonts w:ascii="Arial" w:hAnsi="Arial" w:cs="Arial"/>
-                <w:szCs w:val="24"/>
-              </w:rPr>
-              <w:lastRenderedPageBreak/>
-              <w:t>P</w:t>
-            </w:r>
-            <w:r>
-              <w:rPr>
-                <w:rFonts w:ascii="Arial" w:hAnsi="Arial" w:cs="Arial"/>
-                <w:szCs w:val="24"/>
-              </w:rPr>
-              <w:t xml:space="preserve">rórroga: </w:t>
-            </w:r>
-          </w:p>
-          <w:p>
-            <w:pPr>
-              <w:pStyle w:val="Textoindependiente2"/>
-              <w:spacing w:line="240" w:lineRule="auto"/>
-              <w:rPr>
-                <w:rFonts w:ascii="Arial" w:hAnsi="Arial" w:cs="Arial"/>
-                <w:szCs w:val="24"/>
-              </w:rPr>
-            </w:pPr>
-          </w:p>
-        </w:tc>
-      </w:tr>
-      <w:tr>
-        <w:tc>
-          <w:tcPr>
-            <w:tcW w:w="5000" w:type="pct"/>
-            <w:gridSpan w:val="3"/>
-            <w:tcBorders>
-              <w:top w:val="single" w:sz="4" w:space="0" w:color="000000"/>
-              <w:left w:val="single" w:sz="4" w:space="0" w:color="000000"/>
-              <w:bottom w:val="single" w:sz="4" w:space="0" w:color="000000"/>
-              <w:right w:val="single" w:sz="4" w:space="0" w:color="000000"/>
-            </w:tcBorders>
-            <w:shd w:val="clear" w:color="auto" w:fill="auto"/>
-            <w:tcMar>
-              <w:top w:w="0" w:type="dxa"/>
-              <w:left w:w="70" w:type="dxa"/>
-              <w:bottom w:w="0" w:type="dxa"/>
-              <w:right w:w="70" w:type="dxa"/>
-            </w:tcMar>
-          </w:tcPr>
-          <w:p>
-            <w:pPr>
-              <w:pStyle w:val="Textoindependiente2"/>
-              <w:spacing w:line="240" w:lineRule="auto"/>
-              <w:rPr>
                 <w:rFonts w:ascii="Arial" w:eastAsia="Arial" w:hAnsi="Arial" w:cs="Arial"/>
                 <w:color w:val="000000"/>
                 <w:szCs w:val="24"/>
@@ -1714,7 +1693,7 @@
         </w:trPr>
         <w:tc>
           <w:tcPr>
-            <w:tcW w:w="5000" w:type="pct"/>
+            <w:tcW w:w="10114" w:type="dxa"/>
             <w:gridSpan w:val="3"/>
             <w:tcBorders>
               <w:top w:val="single" w:sz="4" w:space="0" w:color="000000"/>
@@ -2195,7 +2174,7 @@
         </w:trPr>
         <w:tc>
           <w:tcPr>
-            <w:tcW w:w="5000" w:type="pct"/>
+            <w:tcW w:w="10114" w:type="dxa"/>
             <w:gridSpan w:val="3"/>
             <w:tcBorders>
               <w:top w:val="single" w:sz="4" w:space="0" w:color="000000"/>
@@ -2595,8 +2574,6 @@
               </w:rPr>
               <w:t>:</w:t>
             </w:r>
-            <w:bookmarkStart w:id="0" w:name="_GoBack"/>
-            <w:bookmarkEnd w:id="0"/>
           </w:p>
           <w:p>
             <w:pPr>
@@ -2616,7 +2593,7 @@
         </w:trPr>
         <w:tc>
           <w:tcPr>
-            <w:tcW w:w="1494" w:type="pct"/>
+            <w:tcW w:w="3247" w:type="dxa"/>
             <w:tcBorders>
               <w:top w:val="single" w:sz="4" w:space="0" w:color="000000"/>
               <w:left w:val="single" w:sz="4" w:space="0" w:color="000000"/>
@@ -2652,7 +2629,7 @@
         </w:tc>
         <w:tc>
           <w:tcPr>
-            <w:tcW w:w="3506" w:type="pct"/>
+            <w:tcW w:w="6867" w:type="dxa"/>
             <w:gridSpan w:val="2"/>
             <w:tcBorders>
               <w:top w:val="single" w:sz="4" w:space="0" w:color="000000"/>
@@ -2691,7 +2668,7 @@
         </w:trPr>
         <w:tc>
           <w:tcPr>
-            <w:tcW w:w="1494" w:type="pct"/>
+            <w:tcW w:w="3247" w:type="dxa"/>
             <w:tcBorders>
               <w:top w:val="single" w:sz="4" w:space="0" w:color="000000"/>
               <w:left w:val="single" w:sz="4" w:space="0" w:color="000000"/>
@@ -2726,7 +2703,7 @@
         </w:tc>
         <w:tc>
           <w:tcPr>
-            <w:tcW w:w="3506" w:type="pct"/>
+            <w:tcW w:w="6867" w:type="dxa"/>
             <w:gridSpan w:val="2"/>
             <w:tcBorders>
               <w:top w:val="single" w:sz="4" w:space="0" w:color="000000"/>
@@ -2870,7 +2847,23 @@
                 <w:sz w:val="24"/>
                 <w:szCs w:val="24"/>
               </w:rPr>
-              <w:t>${PLANILLA_PERIODO}</w:t>
+              <w:t>${PLAN</w:t>
+            </w:r>
+            <w:r>
+              <w:rPr>
+                <w:rFonts w:ascii="Arial" w:eastAsia="Arial" w:hAnsi="Arial" w:cs="Arial"/>
+                <w:sz w:val="24"/>
+                <w:szCs w:val="24"/>
+              </w:rPr>
+              <w:t>I</w:t>
+            </w:r>
+            <w:r>
+              <w:rPr>
+                <w:rFonts w:ascii="Arial" w:eastAsia="Arial" w:hAnsi="Arial" w:cs="Arial"/>
+                <w:sz w:val="24"/>
+                <w:szCs w:val="24"/>
+              </w:rPr>
+              <w:t>LLA_PERIODO}</w:t>
             </w:r>
           </w:p>
         </w:tc>
@@ -2881,7 +2874,7 @@
         </w:trPr>
         <w:tc>
           <w:tcPr>
-            <w:tcW w:w="5000" w:type="pct"/>
+            <w:tcW w:w="10114" w:type="dxa"/>
             <w:gridSpan w:val="3"/>
             <w:tcBorders>
               <w:top w:val="single" w:sz="4" w:space="0" w:color="000000"/>
@@ -2936,7 +2929,7 @@
         </w:trPr>
         <w:tc>
           <w:tcPr>
-            <w:tcW w:w="5000" w:type="pct"/>
+            <w:tcW w:w="10114" w:type="dxa"/>
             <w:gridSpan w:val="3"/>
             <w:tcBorders>
               <w:top w:val="single" w:sz="4" w:space="0" w:color="000000"/>
@@ -3018,7 +3011,7 @@
         </w:trPr>
         <w:tc>
           <w:tcPr>
-            <w:tcW w:w="5000" w:type="pct"/>
+            <w:tcW w:w="10114" w:type="dxa"/>
             <w:gridSpan w:val="3"/>
             <w:tcBorders>
               <w:top w:val="single" w:sz="4" w:space="0" w:color="000000"/>
@@ -3049,7 +3042,26 @@
                 <w:rFonts w:ascii="Arial" w:hAnsi="Arial" w:cs="Arial"/>
                 <w:szCs w:val="24"/>
               </w:rPr>
-              <w:t>Concepto Supervisor:</w:t>
+              <w:t xml:space="preserve">Concepto Supervisor: </w:t>
+            </w:r>
+          </w:p>
+          <w:p>
+            <w:pPr>
+              <w:pStyle w:val="Textoindependiente2"/>
+              <w:spacing w:line="240" w:lineRule="auto"/>
+              <w:rPr>
+                <w:rFonts w:ascii="Arial" w:hAnsi="Arial" w:cs="Arial"/>
+                <w:szCs w:val="24"/>
+              </w:rPr>
+            </w:pPr>
+            <w:bookmarkStart w:id="0" w:name="_GoBack"/>
+            <w:bookmarkEnd w:id="0"/>
+            <w:r>
+              <w:rPr>
+                <w:rFonts w:ascii="Arial" w:hAnsi="Arial" w:cs="Arial"/>
+                <w:szCs w:val="24"/>
+              </w:rPr>
+              <w:t>${CONCEPTO_SUPERVISOR}</w:t>
             </w:r>
           </w:p>
           <w:p>
@@ -3066,11 +3078,11 @@
       </w:tr>
       <w:tr>
         <w:trPr>
-          <w:trHeight w:val="537"/>
+          <w:trHeight w:val="227"/>
         </w:trPr>
         <w:tc>
           <w:tcPr>
-            <w:tcW w:w="5000" w:type="pct"/>
+            <w:tcW w:w="10114" w:type="dxa"/>
             <w:gridSpan w:val="3"/>
             <w:tcBorders>
               <w:top w:val="single" w:sz="4" w:space="0" w:color="000000"/>
@@ -3101,18 +3113,23 @@
                 <w:rFonts w:ascii="Arial" w:hAnsi="Arial" w:cs="Arial"/>
                 <w:szCs w:val="24"/>
               </w:rPr>
-              <w:t>Observaciones al informe técnico:</w:t>
-            </w:r>
-          </w:p>
-          <w:p>
-            <w:pPr>
-              <w:pStyle w:val="Textoindependiente2"/>
-              <w:spacing w:line="240" w:lineRule="auto"/>
-              <w:rPr>
-                <w:rFonts w:ascii="Arial" w:hAnsi="Arial" w:cs="Arial"/>
-                <w:szCs w:val="24"/>
-              </w:rPr>
-            </w:pPr>
+              <w:lastRenderedPageBreak/>
+              <w:t>Recibo a Satisfacción de Servicios:</w:t>
+            </w:r>
+            <w:r>
+              <w:rPr>
+                <w:rFonts w:ascii="Arial" w:hAnsi="Arial" w:cs="Arial"/>
+                <w:szCs w:val="24"/>
+              </w:rPr>
+              <w:t xml:space="preserve"> </w:t>
+            </w:r>
+            <w:r>
+              <w:rPr>
+                <w:rFonts w:ascii="Arial" w:hAnsi="Arial" w:cs="Arial"/>
+                <w:szCs w:val="24"/>
+              </w:rPr>
+              <w:t>${RECIBO_SATISFACCION}</w:t>
+            </w:r>
           </w:p>
           <w:p>
             <w:pPr>
@@ -3132,7 +3149,135 @@
         </w:trPr>
         <w:tc>
           <w:tcPr>
-            <w:tcW w:w="5000" w:type="pct"/>
+            <w:tcW w:w="10114" w:type="dxa"/>
+            <w:gridSpan w:val="3"/>
+            <w:tcBorders>
+              <w:top w:val="single" w:sz="4" w:space="0" w:color="000000"/>
+              <w:left w:val="single" w:sz="4" w:space="0" w:color="000000"/>
+              <w:bottom w:val="single" w:sz="4" w:space="0" w:color="000000"/>
+              <w:right w:val="single" w:sz="4" w:space="0" w:color="000000"/>
+            </w:tcBorders>
+            <w:shd w:val="clear" w:color="auto" w:fill="auto"/>
+            <w:tcMar>
+              <w:top w:w="0" w:type="dxa"/>
+              <w:left w:w="70" w:type="dxa"/>
+              <w:bottom w:w="0" w:type="dxa"/>
+              <w:right w:w="70" w:type="dxa"/>
+            </w:tcMar>
+            <w:vAlign w:val="center"/>
+          </w:tcPr>
+          <w:p>
+            <w:pPr>
+              <w:pStyle w:val="Textoindependiente2"/>
+              <w:spacing w:line="240" w:lineRule="auto"/>
+              <w:rPr>
+                <w:rFonts w:ascii="Arial" w:hAnsi="Arial" w:cs="Arial"/>
+                <w:szCs w:val="24"/>
+              </w:rPr>
+            </w:pPr>
+            <w:r>
+              <w:rPr>
+                <w:rFonts w:ascii="Arial" w:hAnsi="Arial" w:cs="Arial"/>
+                <w:szCs w:val="24"/>
+              </w:rPr>
+              <w:t>Constancia de Paz y Salvo:</w:t>
+            </w:r>
+            <w:r>
+              <w:rPr>
+                <w:rFonts w:ascii="Arial" w:hAnsi="Arial" w:cs="Arial"/>
+                <w:szCs w:val="24"/>
+              </w:rPr>
+              <w:t xml:space="preserve"> </w:t>
+            </w:r>
+            <w:r>
+              <w:rPr>
+                <w:rFonts w:ascii="Arial" w:hAnsi="Arial" w:cs="Arial"/>
+                <w:szCs w:val="24"/>
+              </w:rPr>
+              <w:t>${CONSTANCIA_PAZ_SALVO}</w:t>
+            </w:r>
+          </w:p>
+          <w:p>
+            <w:pPr>
+              <w:pStyle w:val="Textoindependiente2"/>
+              <w:spacing w:line="240" w:lineRule="auto"/>
+              <w:rPr>
+                <w:rFonts w:ascii="Arial" w:hAnsi="Arial" w:cs="Arial"/>
+                <w:szCs w:val="24"/>
+              </w:rPr>
+            </w:pPr>
+          </w:p>
+        </w:tc>
+      </w:tr>
+      <w:tr>
+        <w:trPr>
+          <w:trHeight w:val="537"/>
+        </w:trPr>
+        <w:tc>
+          <w:tcPr>
+            <w:tcW w:w="10114" w:type="dxa"/>
+            <w:gridSpan w:val="3"/>
+            <w:tcBorders>
+              <w:top w:val="single" w:sz="4" w:space="0" w:color="000000"/>
+              <w:left w:val="single" w:sz="4" w:space="0" w:color="000000"/>
+              <w:bottom w:val="single" w:sz="4" w:space="0" w:color="000000"/>
+              <w:right w:val="single" w:sz="4" w:space="0" w:color="000000"/>
+            </w:tcBorders>
+            <w:shd w:val="clear" w:color="auto" w:fill="auto"/>
+            <w:tcMar>
+              <w:top w:w="0" w:type="dxa"/>
+              <w:left w:w="70" w:type="dxa"/>
+              <w:bottom w:w="0" w:type="dxa"/>
+              <w:right w:w="70" w:type="dxa"/>
+            </w:tcMar>
+            <w:vAlign w:val="center"/>
+          </w:tcPr>
+          <w:p>
+            <w:pPr>
+              <w:pStyle w:val="Textoindependiente2"/>
+              <w:spacing w:line="240" w:lineRule="auto"/>
+              <w:rPr>
+                <w:rFonts w:ascii="Arial" w:hAnsi="Arial" w:cs="Arial"/>
+                <w:szCs w:val="24"/>
+              </w:rPr>
+            </w:pPr>
+            <w:r>
+              <w:rPr>
+                <w:rFonts w:ascii="Arial" w:hAnsi="Arial" w:cs="Arial"/>
+                <w:szCs w:val="24"/>
+              </w:rPr>
+              <w:t>Observaciones al informe técnico:</w:t>
+            </w:r>
+          </w:p>
+          <w:p>
+            <w:pPr>
+              <w:pStyle w:val="Textoindependiente2"/>
+              <w:spacing w:line="240" w:lineRule="auto"/>
+              <w:rPr>
+                <w:rFonts w:ascii="Arial" w:hAnsi="Arial" w:cs="Arial"/>
+                <w:szCs w:val="24"/>
+              </w:rPr>
+            </w:pPr>
+          </w:p>
+          <w:p>
+            <w:pPr>
+              <w:pStyle w:val="Textoindependiente2"/>
+              <w:spacing w:line="240" w:lineRule="auto"/>
+              <w:rPr>
+                <w:rFonts w:ascii="Arial" w:hAnsi="Arial" w:cs="Arial"/>
+                <w:szCs w:val="24"/>
+              </w:rPr>
+            </w:pPr>
+          </w:p>
+        </w:tc>
+      </w:tr>
+      <w:tr>
+        <w:trPr>
+          <w:trHeight w:val="227"/>
+        </w:trPr>
+        <w:tc>
+          <w:tcPr>
+            <w:tcW w:w="10114" w:type="dxa"/>
             <w:gridSpan w:val="3"/>
             <w:tcBorders>
               <w:top w:val="single" w:sz="4" w:space="0" w:color="000000"/>
@@ -3219,7 +3364,7 @@
         </w:trPr>
         <w:tc>
           <w:tcPr>
-            <w:tcW w:w="5000" w:type="pct"/>
+            <w:tcW w:w="10114" w:type="dxa"/>
             <w:gridSpan w:val="3"/>
             <w:tcBorders>
               <w:top w:val="single" w:sz="4" w:space="0" w:color="000000"/>
@@ -3272,7 +3417,7 @@
         </w:trPr>
         <w:tc>
           <w:tcPr>
-            <w:tcW w:w="5000" w:type="pct"/>
+            <w:tcW w:w="10114" w:type="dxa"/>
             <w:gridSpan w:val="3"/>
             <w:tcBorders>
               <w:top w:val="single" w:sz="4" w:space="0" w:color="000000"/>
@@ -3343,7 +3488,7 @@
         </w:trPr>
         <w:tc>
           <w:tcPr>
-            <w:tcW w:w="5000" w:type="pct"/>
+            <w:tcW w:w="10114" w:type="dxa"/>
             <w:gridSpan w:val="3"/>
             <w:tcBorders>
               <w:top w:val="single" w:sz="4" w:space="0" w:color="000000"/>
@@ -3425,6 +3570,24 @@
                 <w:rFonts w:ascii="Arial" w:hAnsi="Arial" w:cs="Arial"/>
                 <w:szCs w:val="24"/>
               </w:rPr>
+              <w:t>${NOMBRE_SUPERVISOR}</w:t>
+            </w:r>
+          </w:p>
+          <w:p>
+            <w:pPr>
+              <w:pStyle w:val="Textoindependiente2"/>
+              <w:spacing w:line="240" w:lineRule="auto"/>
+              <w:jc w:val="left"/>
+              <w:rPr>
+                <w:rFonts w:ascii="Arial" w:hAnsi="Arial" w:cs="Arial"/>
+                <w:szCs w:val="24"/>
+              </w:rPr>
+            </w:pPr>
+            <w:r>
+              <w:rPr>
+                <w:rFonts w:ascii="Arial" w:hAnsi="Arial" w:cs="Arial"/>
+                <w:szCs w:val="24"/>
+              </w:rPr>
               <w:t xml:space="preserve">Nombre y firma del Supervisor </w:t>
             </w:r>
           </w:p>
@@ -3540,7 +3703,7 @@
         </w:trPr>
         <w:tc>
           <w:tcPr>
-            <w:tcW w:w="5000" w:type="pct"/>
+            <w:tcW w:w="10114" w:type="dxa"/>
             <w:gridSpan w:val="3"/>
             <w:tcBorders>
               <w:top w:val="single" w:sz="4" w:space="0" w:color="000000"/>
@@ -5969,7 +6132,7 @@
 </file>
 
 <file path=customXml/itemProps1.xml><?xml version="1.0" encoding="utf-8"?>
-<ds:datastoreItem xmlns:ds="http://schemas.openxmlformats.org/officeDocument/2006/customXml" ds:itemID="{0E19973C-B353-4F42-B877-52564E8FD9C4}">
+<ds:datastoreItem xmlns:ds="http://schemas.openxmlformats.org/officeDocument/2006/customXml" ds:itemID="{45F63DD3-0C33-4672-8948-1CF9F17B2A1C}">
   <ds:schemaRefs>
     <ds:schemaRef ds:uri="http://schemas.openxmlformats.org/officeDocument/2006/bibliography"/>
   </ds:schemaRefs>

</xml_diff>

<commit_message>
Automatización de cuotas, arreglos UI con SweetAlert2, validaciones en tiempo real, corrección de permisos de descarga, justificación y fuente Arial en exportador Word
</commit_message>
<xml_diff>
--- a/plantillas/INFORME_SUPERVISION_TEMPLATE.docx
+++ b/plantillas/INFORME_SUPERVISION_TEMPLATE.docx
@@ -657,7 +657,7 @@
                 <w:rFonts w:ascii="Arial" w:hAnsi="Arial" w:cs="Arial"/>
                 <w:szCs w:val="24"/>
               </w:rPr>
-              <w:t>dentificación del ${CARGO_REVISO}</w:t>
+              <w:t>dentificación</w:t>
             </w:r>
             <w:r>
               <w:rPr>
@@ -3054,8 +3054,16 @@
                 <w:szCs w:val="24"/>
               </w:rPr>
             </w:pPr>
-            <w:bookmarkStart w:id="0" w:name="_GoBack"/>
-            <w:bookmarkEnd w:id="0"/>
+          </w:p>
+          <w:p>
+            <w:pPr>
+              <w:pStyle w:val="Textoindependiente2"/>
+              <w:spacing w:line="240" w:lineRule="auto"/>
+              <w:rPr>
+                <w:rFonts w:ascii="Arial" w:hAnsi="Arial" w:cs="Arial"/>
+                <w:szCs w:val="24"/>
+              </w:rPr>
+            </w:pPr>
             <w:r>
               <w:rPr>
                 <w:rFonts w:ascii="Arial" w:hAnsi="Arial" w:cs="Arial"/>
@@ -3390,6 +3398,7 @@
                 <w:szCs w:val="24"/>
               </w:rPr>
             </w:pPr>
+            <w:bookmarkStart w:id="0" w:name="_GoBack"/>
             <w:r>
               <w:rPr>
                 <w:rFonts w:ascii="Arial" w:eastAsia="Arial" w:hAnsi="Arial" w:cs="Arial"/>
@@ -3398,6 +3407,7 @@
               <w:t>${RECOMENDACIONES}</w:t>
             </w:r>
           </w:p>
+          <w:bookmarkEnd w:id="0"/>
           <w:p>
             <w:pPr>
               <w:pStyle w:val="Textoindependiente2"/>
@@ -3876,7 +3886,7 @@
         <w:sz w:val="16"/>
         <w:szCs w:val="16"/>
       </w:rPr>
-      <w:t>2</w:t>
+      <w:t>1</w:t>
     </w:r>
     <w:r>
       <w:rPr>
@@ -6132,7 +6142,7 @@
 </file>
 
 <file path=customXml/itemProps1.xml><?xml version="1.0" encoding="utf-8"?>
-<ds:datastoreItem xmlns:ds="http://schemas.openxmlformats.org/officeDocument/2006/customXml" ds:itemID="{45F63DD3-0C33-4672-8948-1CF9F17B2A1C}">
+<ds:datastoreItem xmlns:ds="http://schemas.openxmlformats.org/officeDocument/2006/customXml" ds:itemID="{26B78867-3B37-4EBA-93F2-D7FB9D465007}">
   <ds:schemaRefs>
     <ds:schemaRef ds:uri="http://schemas.openxmlformats.org/officeDocument/2006/bibliography"/>
   </ds:schemaRefs>

</xml_diff>

<commit_message>
Ajustes en informe supervision: viñetas automaticas por linea y firma opcional de apoyo
</commit_message>
<xml_diff>
--- a/plantillas/INFORME_SUPERVISION_TEMPLATE.docx
+++ b/plantillas/INFORME_SUPERVISION_TEMPLATE.docx
@@ -3398,7 +3398,6 @@
                 <w:szCs w:val="24"/>
               </w:rPr>
             </w:pPr>
-            <w:bookmarkStart w:id="0" w:name="_GoBack"/>
             <w:r>
               <w:rPr>
                 <w:rFonts w:ascii="Arial" w:eastAsia="Arial" w:hAnsi="Arial" w:cs="Arial"/>
@@ -3407,7 +3406,6 @@
               <w:t>${RECOMENDACIONES}</w:t>
             </w:r>
           </w:p>
-          <w:bookmarkEnd w:id="0"/>
           <w:p>
             <w:pPr>
               <w:pStyle w:val="Textoindependiente2"/>
@@ -3622,6 +3620,8 @@
                 <w:szCs w:val="24"/>
               </w:rPr>
             </w:pPr>
+            <w:bookmarkStart w:id="0" w:name="_GoBack"/>
+            <w:bookmarkEnd w:id="0"/>
           </w:p>
           <w:p>
             <w:pPr>
@@ -3633,67 +3633,13 @@
                 <w:szCs w:val="24"/>
               </w:rPr>
             </w:pPr>
-          </w:p>
-          <w:p>
-            <w:pPr>
-              <w:pStyle w:val="Textoindependiente2"/>
-              <w:spacing w:line="240" w:lineRule="auto"/>
-              <w:jc w:val="left"/>
-              <w:rPr>
-                <w:rFonts w:ascii="Arial" w:hAnsi="Arial" w:cs="Arial"/>
-                <w:szCs w:val="24"/>
-              </w:rPr>
-            </w:pPr>
-            <w:r>
-              <w:rPr>
-                <w:rFonts w:ascii="Arial" w:hAnsi="Arial" w:cs="Arial"/>
-                <w:szCs w:val="24"/>
-              </w:rPr>
-              <w:t>__________________________________________</w:t>
-            </w:r>
-          </w:p>
-          <w:p>
-            <w:pPr>
-              <w:pStyle w:val="Textoindependiente2"/>
-              <w:spacing w:line="240" w:lineRule="auto"/>
-              <w:jc w:val="left"/>
-              <w:rPr>
-                <w:rFonts w:ascii="Arial" w:hAnsi="Arial" w:cs="Arial"/>
-                <w:szCs w:val="24"/>
-              </w:rPr>
-            </w:pPr>
-            <w:r>
-              <w:rPr>
-                <w:rFonts w:ascii="Arial" w:hAnsi="Arial" w:cs="Arial"/>
-                <w:szCs w:val="24"/>
-              </w:rPr>
-              <w:t>Nombre y firma del Apoyo a la Supervisión (</w:t>
-            </w:r>
-            <w:r>
-              <w:rPr>
-                <w:rFonts w:ascii="Arial" w:hAnsi="Arial" w:cs="Arial"/>
-                <w:szCs w:val="24"/>
-              </w:rPr>
-              <w:t>Incluir c</w:t>
-            </w:r>
-            <w:r>
-              <w:rPr>
-                <w:rFonts w:ascii="Arial" w:hAnsi="Arial" w:cs="Arial"/>
-                <w:szCs w:val="24"/>
-              </w:rPr>
-              <w:t>uando aplique)</w:t>
-            </w:r>
-          </w:p>
-          <w:p>
-            <w:pPr>
-              <w:pStyle w:val="Textoindependiente2"/>
-              <w:spacing w:line="240" w:lineRule="auto"/>
-              <w:jc w:val="left"/>
-              <w:rPr>
-                <w:rFonts w:ascii="Arial" w:hAnsi="Arial" w:cs="Arial"/>
-                <w:szCs w:val="24"/>
-              </w:rPr>
-            </w:pPr>
+            <w:r>
+              <w:rPr>
+                <w:rFonts w:ascii="Arial" w:hAnsi="Arial" w:cs="Arial"/>
+                <w:szCs w:val="24"/>
+              </w:rPr>
+              <w:t>${LINEA_APOYO} ${NOMBRE_APOYO} ${TEXTO_APOYO}</w:t>
+            </w:r>
           </w:p>
           <w:p>
             <w:pPr>
@@ -3886,7 +3832,7 @@
         <w:sz w:val="16"/>
         <w:szCs w:val="16"/>
       </w:rPr>
-      <w:t>1</w:t>
+      <w:t>3</w:t>
     </w:r>
     <w:r>
       <w:rPr>
@@ -6142,7 +6088,7 @@
 </file>
 
 <file path=customXml/itemProps1.xml><?xml version="1.0" encoding="utf-8"?>
-<ds:datastoreItem xmlns:ds="http://schemas.openxmlformats.org/officeDocument/2006/customXml" ds:itemID="{26B78867-3B37-4EBA-93F2-D7FB9D465007}">
+<ds:datastoreItem xmlns:ds="http://schemas.openxmlformats.org/officeDocument/2006/customXml" ds:itemID="{6812F483-FB08-4994-AD8C-E0340F9AFE28}">
   <ds:schemaRefs>
     <ds:schemaRef ds:uri="http://schemas.openxmlformats.org/officeDocument/2006/bibliography"/>
   </ds:schemaRefs>

</xml_diff>

<commit_message>
Fix template generation for Apoyo block
</commit_message>
<xml_diff>
--- a/plantillas/INFORME_SUPERVISION_TEMPLATE.docx
+++ b/plantillas/INFORME_SUPERVISION_TEMPLATE.docx
@@ -3620,6 +3620,17 @@
                 <w:szCs w:val="24"/>
               </w:rPr>
             </w:pPr>
+          </w:p>
+          <w:p>
+            <w:pPr>
+              <w:pStyle w:val="Textoindependiente2"/>
+              <w:spacing w:line="240" w:lineRule="auto"/>
+              <w:jc w:val="left"/>
+              <w:rPr>
+                <w:rFonts w:ascii="Arial" w:hAnsi="Arial" w:cs="Arial"/>
+                <w:szCs w:val="24"/>
+              </w:rPr>
+            </w:pPr>
             <w:bookmarkStart w:id="0" w:name="_GoBack"/>
             <w:bookmarkEnd w:id="0"/>
           </w:p>
@@ -3638,7 +3649,43 @@
                 <w:rFonts w:ascii="Arial" w:hAnsi="Arial" w:cs="Arial"/>
                 <w:szCs w:val="24"/>
               </w:rPr>
-              <w:t>${LINEA_APOYO} ${NOMBRE_APOYO} ${TEXTO_APOYO}</w:t>
+              <w:t xml:space="preserve">${LINEA_APOYO} </w:t>
+            </w:r>
+          </w:p>
+          <w:p>
+            <w:pPr>
+              <w:pStyle w:val="Textoindependiente2"/>
+              <w:spacing w:line="240" w:lineRule="auto"/>
+              <w:jc w:val="left"/>
+              <w:rPr>
+                <w:rFonts w:ascii="Arial" w:hAnsi="Arial" w:cs="Arial"/>
+                <w:szCs w:val="24"/>
+              </w:rPr>
+            </w:pPr>
+            <w:r>
+              <w:rPr>
+                <w:rFonts w:ascii="Arial" w:hAnsi="Arial" w:cs="Arial"/>
+                <w:szCs w:val="24"/>
+              </w:rPr>
+              <w:t xml:space="preserve">${NOMBRE_APOYO} </w:t>
+            </w:r>
+          </w:p>
+          <w:p>
+            <w:pPr>
+              <w:pStyle w:val="Textoindependiente2"/>
+              <w:spacing w:line="240" w:lineRule="auto"/>
+              <w:jc w:val="left"/>
+              <w:rPr>
+                <w:rFonts w:ascii="Arial" w:hAnsi="Arial" w:cs="Arial"/>
+                <w:szCs w:val="24"/>
+              </w:rPr>
+            </w:pPr>
+            <w:r>
+              <w:rPr>
+                <w:rFonts w:ascii="Arial" w:hAnsi="Arial" w:cs="Arial"/>
+                <w:szCs w:val="24"/>
+              </w:rPr>
+              <w:t>${TEXTO_APOYO}</w:t>
             </w:r>
           </w:p>
           <w:p>
@@ -6088,7 +6135,7 @@
 </file>
 
 <file path=customXml/itemProps1.xml><?xml version="1.0" encoding="utf-8"?>
-<ds:datastoreItem xmlns:ds="http://schemas.openxmlformats.org/officeDocument/2006/customXml" ds:itemID="{6812F483-FB08-4994-AD8C-E0340F9AFE28}">
+<ds:datastoreItem xmlns:ds="http://schemas.openxmlformats.org/officeDocument/2006/customXml" ds:itemID="{21EEFF2D-23E6-4B32-8A6E-460B478E8870}">
   <ds:schemaRefs>
     <ds:schemaRef ds:uri="http://schemas.openxmlformats.org/officeDocument/2006/bibliography"/>
   </ds:schemaRefs>

</xml_diff>

<commit_message>
Ajustes de bugs en radicacion, observaciones_tecnicas por defecto en N/A, limpiezas de HTML
</commit_message>
<xml_diff>
--- a/plantillas/INFORME_SUPERVISION_TEMPLATE.docx
+++ b/plantillas/INFORME_SUPERVISION_TEMPLATE.docx
@@ -1,6 +1,6 @@
 
 <file path=word/document.xml><?xml version="1.0" encoding="utf-8"?>
-<w:document xmlns:wpc="http://schemas.microsoft.com/office/word/2010/wordprocessingCanvas" xmlns:mc="http://schemas.openxmlformats.org/markup-compatibility/2006" xmlns:o="urn:schemas-microsoft-com:office:office" xmlns:r="http://schemas.openxmlformats.org/officeDocument/2006/relationships" xmlns:m="http://schemas.openxmlformats.org/officeDocument/2006/math" xmlns:v="urn:schemas-microsoft-com:vml" xmlns:wp14="http://schemas.microsoft.com/office/word/2010/wordprocessingDrawing" xmlns:wp="http://schemas.openxmlformats.org/drawingml/2006/wordprocessingDrawing" xmlns:w10="urn:schemas-microsoft-com:office:word" xmlns:w="http://schemas.openxmlformats.org/wordprocessingml/2006/main" xmlns:w14="http://schemas.microsoft.com/office/word/2010/wordml" xmlns:wpg="http://schemas.microsoft.com/office/word/2010/wordprocessingGroup" xmlns:wpi="http://schemas.microsoft.com/office/word/2010/wordprocessingInk" xmlns:wne="http://schemas.microsoft.com/office/word/2006/wordml" xmlns:wps="http://schemas.microsoft.com/office/word/2010/wordprocessingShape" mc:Ignorable="w14 wp14">
+<w:document xmlns:wpc="http://schemas.microsoft.com/office/word/2010/wordprocessingCanvas" xmlns:cx="http://schemas.microsoft.com/office/drawing/2014/chartex" xmlns:cx1="http://schemas.microsoft.com/office/drawing/2015/9/8/chartex" xmlns:cx2="http://schemas.microsoft.com/office/drawing/2015/10/21/chartex" xmlns:cx3="http://schemas.microsoft.com/office/drawing/2016/5/9/chartex" xmlns:cx4="http://schemas.microsoft.com/office/drawing/2016/5/10/chartex" xmlns:cx5="http://schemas.microsoft.com/office/drawing/2016/5/11/chartex" xmlns:cx6="http://schemas.microsoft.com/office/drawing/2016/5/12/chartex" xmlns:cx7="http://schemas.microsoft.com/office/drawing/2016/5/13/chartex" xmlns:cx8="http://schemas.microsoft.com/office/drawing/2016/5/14/chartex" xmlns:mc="http://schemas.openxmlformats.org/markup-compatibility/2006" xmlns:aink="http://schemas.microsoft.com/office/drawing/2016/ink" xmlns:am3d="http://schemas.microsoft.com/office/drawing/2017/model3d" xmlns:o="urn:schemas-microsoft-com:office:office" xmlns:oel="http://schemas.microsoft.com/office/2019/extlst" xmlns:r="http://schemas.openxmlformats.org/officeDocument/2006/relationships" xmlns:m="http://schemas.openxmlformats.org/officeDocument/2006/math" xmlns:v="urn:schemas-microsoft-com:vml" xmlns:wp14="http://schemas.microsoft.com/office/word/2010/wordprocessingDrawing" xmlns:wp="http://schemas.openxmlformats.org/drawingml/2006/wordprocessingDrawing" xmlns:w10="urn:schemas-microsoft-com:office:word" xmlns:w="http://schemas.openxmlformats.org/wordprocessingml/2006/main" xmlns:w14="http://schemas.microsoft.com/office/word/2010/wordml" xmlns:w15="http://schemas.microsoft.com/office/word/2012/wordml" xmlns:w16cex="http://schemas.microsoft.com/office/word/2018/wordml/cex" xmlns:w16cid="http://schemas.microsoft.com/office/word/2016/wordml/cid" xmlns:w16="http://schemas.microsoft.com/office/word/2018/wordml" xmlns:w16du="http://schemas.microsoft.com/office/word/2023/wordml/word16du" xmlns:w16sdtdh="http://schemas.microsoft.com/office/word/2020/wordml/sdtdatahash" xmlns:w16sdtfl="http://schemas.microsoft.com/office/word/2024/wordml/sdtformatlock" xmlns:w16se="http://schemas.microsoft.com/office/word/2015/wordml/symex" xmlns:wpg="http://schemas.microsoft.com/office/word/2010/wordprocessingGroup" xmlns:wpi="http://schemas.microsoft.com/office/word/2010/wordprocessingInk" xmlns:wne="http://schemas.microsoft.com/office/word/2006/wordml" xmlns:wps="http://schemas.microsoft.com/office/word/2010/wordprocessingShape" mc:Ignorable="w14 w15 w16se w16cid w16 w16cex w16sdtdh w16sdtfl w16du wp14">
   <w:body>
     <w:tbl>
       <w:tblPr>
@@ -80,7 +80,6 @@
               <w:bottom w:val="single" w:sz="4" w:space="0" w:color="000000"/>
               <w:right w:val="single" w:sz="4" w:space="0" w:color="000000"/>
             </w:tcBorders>
-            <w:shd w:val="clear" w:color="auto" w:fill="auto"/>
             <w:tcMar>
               <w:top w:w="0" w:type="dxa"/>
               <w:left w:w="70" w:type="dxa"/>
@@ -107,7 +106,7 @@
               <mc:AlternateContent>
                 <mc:Choice Requires="wps">
                   <w:drawing>
-                    <wp:anchor distT="0" distB="0" distL="114300" distR="114300" simplePos="0" relativeHeight="251659264" behindDoc="0" locked="0" layoutInCell="1" allowOverlap="1" wp14:anchorId="2FA6E240" wp14:editId="30427270">
+                    <wp:anchor distT="0" distB="0" distL="114300" distR="114300" simplePos="0" relativeHeight="251659264" behindDoc="0" locked="0" layoutInCell="1" allowOverlap="1" wp14:anchorId="6BDD161C" wp14:editId="1BA62A9B">
                       <wp:simplePos x="0" y="0"/>
                       <wp:positionH relativeFrom="column">
                         <wp:posOffset>4511675</wp:posOffset>
@@ -195,7 +194,7 @@
                 </mc:Choice>
                 <mc:Fallback>
                   <w:pict>
-                    <v:rect id="Rectangle 2" o:spid="_x0000_s1026" style="position:absolute;left:0;text-align:left;margin-left:355.25pt;margin-top:11.4pt;width:15.75pt;height:14.25pt;z-index:251659264;visibility:visible;mso-wrap-style:square;mso-width-percent:0;mso-height-percent:0;mso-wrap-distance-left:9pt;mso-wrap-distance-top:0;mso-wrap-distance-right:9pt;mso-wrap-distance-bottom:0;mso-position-horizontal:absolute;mso-position-horizontal-relative:text;mso-position-vertical:absolute;mso-position-vertical-relative:text;mso-width-percent:0;mso-height-percent:0;mso-width-relative:page;mso-height-relative:page;v-text-anchor:top" o:gfxdata="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" strokeweight=".26467mm">
+                    <v:rect w14:anchorId="6BDD161C" id="Rectangle 2" o:spid="_x0000_s1026" style="position:absolute;left:0;text-align:left;margin-left:355.25pt;margin-top:11.4pt;width:15.75pt;height:14.25pt;z-index:251659264;visibility:visible;mso-wrap-style:square;mso-width-percent:0;mso-height-percent:0;mso-wrap-distance-left:9pt;mso-wrap-distance-top:0;mso-wrap-distance-right:9pt;mso-wrap-distance-bottom:0;mso-position-horizontal:absolute;mso-position-horizontal-relative:text;mso-position-vertical:absolute;mso-position-vertical-relative:text;mso-width-percent:0;mso-height-percent:0;mso-width-relative:page;mso-height-relative:page;v-text-anchor:top" o:gfxdata="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" strokeweight=".26467mm">
                       <v:path arrowok="t"/>
                       <v:textbox inset="0,0,0,0">
                         <w:txbxContent>
@@ -243,7 +242,7 @@
               <mc:AlternateContent>
                 <mc:Choice Requires="wps">
                   <w:drawing>
-                    <wp:anchor distT="0" distB="0" distL="114300" distR="114300" simplePos="0" relativeHeight="251657216" behindDoc="0" locked="0" layoutInCell="1" allowOverlap="1" wp14:anchorId="002D0D94" wp14:editId="5B6EA6E7">
+                    <wp:anchor distT="0" distB="0" distL="114300" distR="114300" simplePos="0" relativeHeight="251657216" behindDoc="0" locked="0" layoutInCell="1" allowOverlap="1" wp14:anchorId="50BD4EA7" wp14:editId="097F4E6A">
                       <wp:simplePos x="0" y="0"/>
                       <wp:positionH relativeFrom="column">
                         <wp:posOffset>1579245</wp:posOffset>
@@ -321,7 +320,7 @@
                 </mc:Choice>
                 <mc:Fallback>
                   <w:pict>
-                    <v:rect id="_x0000_s1027" style="position:absolute;left:0;text-align:left;margin-left:124.35pt;margin-top:11.35pt;width:15.75pt;height:14.25pt;z-index:251657216;visibility:visible;mso-wrap-style:square;mso-width-percent:0;mso-height-percent:0;mso-wrap-distance-left:9pt;mso-wrap-distance-top:0;mso-wrap-distance-right:9pt;mso-wrap-distance-bottom:0;mso-position-horizontal:absolute;mso-position-horizontal-relative:text;mso-position-vertical:absolute;mso-position-vertical-relative:text;mso-width-percent:0;mso-height-percent:0;mso-width-relative:page;mso-height-relative:page;v-text-anchor:top" o:gfxdata="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" strokeweight=".26467mm">
+                    <v:rect w14:anchorId="50BD4EA7" id="_x0000_s1027" style="position:absolute;left:0;text-align:left;margin-left:124.35pt;margin-top:11.35pt;width:15.75pt;height:14.25pt;z-index:251657216;visibility:visible;mso-wrap-style:square;mso-width-percent:0;mso-height-percent:0;mso-wrap-distance-left:9pt;mso-wrap-distance-top:0;mso-wrap-distance-right:9pt;mso-wrap-distance-bottom:0;mso-position-horizontal:absolute;mso-position-horizontal-relative:text;mso-position-vertical:absolute;mso-position-vertical-relative:text;mso-width-percent:0;mso-height-percent:0;mso-width-relative:page;mso-height-relative:page;v-text-anchor:top" o:gfxdata="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" strokeweight=".26467mm">
                       <v:path arrowok="t"/>
                       <v:textbox inset="0,0,0,0">
                         <w:txbxContent>
@@ -491,7 +490,6 @@
               <w:bottom w:val="single" w:sz="4" w:space="0" w:color="000000"/>
               <w:right w:val="single" w:sz="4" w:space="0" w:color="000000"/>
             </w:tcBorders>
-            <w:shd w:val="clear" w:color="auto" w:fill="auto"/>
             <w:tcMar>
               <w:top w:w="0" w:type="dxa"/>
               <w:left w:w="70" w:type="dxa"/>
@@ -569,7 +567,6 @@
               <w:bottom w:val="single" w:sz="4" w:space="0" w:color="000000"/>
               <w:right w:val="single" w:sz="4" w:space="0" w:color="000000"/>
             </w:tcBorders>
-            <w:shd w:val="clear" w:color="auto" w:fill="auto"/>
             <w:tcMar>
               <w:top w:w="0" w:type="dxa"/>
               <w:left w:w="70" w:type="dxa"/>
@@ -619,7 +616,6 @@
               <w:bottom w:val="single" w:sz="4" w:space="0" w:color="000000"/>
               <w:right w:val="single" w:sz="4" w:space="0" w:color="000000"/>
             </w:tcBorders>
-            <w:shd w:val="clear" w:color="auto" w:fill="auto"/>
             <w:tcMar>
               <w:top w:w="0" w:type="dxa"/>
               <w:left w:w="70" w:type="dxa"/>
@@ -690,7 +686,6 @@
               <w:bottom w:val="single" w:sz="4" w:space="0" w:color="000000"/>
               <w:right w:val="single" w:sz="4" w:space="0" w:color="000000"/>
             </w:tcBorders>
-            <w:shd w:val="clear" w:color="auto" w:fill="auto"/>
             <w:tcMar>
               <w:top w:w="0" w:type="dxa"/>
               <w:left w:w="70" w:type="dxa"/>
@@ -740,7 +735,6 @@
               <w:bottom w:val="single" w:sz="4" w:space="0" w:color="000000"/>
               <w:right w:val="single" w:sz="4" w:space="0" w:color="000000"/>
             </w:tcBorders>
-            <w:shd w:val="clear" w:color="auto" w:fill="auto"/>
             <w:tcMar>
               <w:top w:w="0" w:type="dxa"/>
               <w:left w:w="70" w:type="dxa"/>
@@ -798,7 +792,6 @@
               <w:bottom w:val="single" w:sz="4" w:space="0" w:color="000000"/>
               <w:right w:val="single" w:sz="4" w:space="0" w:color="000000"/>
             </w:tcBorders>
-            <w:shd w:val="clear" w:color="auto" w:fill="auto"/>
             <w:tcMar>
               <w:top w:w="0" w:type="dxa"/>
               <w:left w:w="70" w:type="dxa"/>
@@ -914,7 +907,6 @@
               <w:bottom w:val="single" w:sz="4" w:space="0" w:color="000000"/>
               <w:right w:val="single" w:sz="4" w:space="0" w:color="000000"/>
             </w:tcBorders>
-            <w:shd w:val="clear" w:color="auto" w:fill="auto"/>
             <w:tcMar>
               <w:top w:w="0" w:type="dxa"/>
               <w:left w:w="70" w:type="dxa"/>
@@ -982,7 +974,6 @@
               <w:bottom w:val="single" w:sz="4" w:space="0" w:color="000000"/>
               <w:right w:val="single" w:sz="4" w:space="0" w:color="000000"/>
             </w:tcBorders>
-            <w:shd w:val="clear" w:color="auto" w:fill="auto"/>
             <w:tcMar>
               <w:top w:w="0" w:type="dxa"/>
               <w:left w:w="70" w:type="dxa"/>
@@ -1056,7 +1047,6 @@
               <w:bottom w:val="single" w:sz="4" w:space="0" w:color="000000"/>
               <w:right w:val="single" w:sz="4" w:space="0" w:color="000000"/>
             </w:tcBorders>
-            <w:shd w:val="clear" w:color="auto" w:fill="auto"/>
             <w:tcMar>
               <w:top w:w="0" w:type="dxa"/>
               <w:left w:w="70" w:type="dxa"/>
@@ -1115,7 +1105,6 @@
               <w:bottom w:val="single" w:sz="4" w:space="0" w:color="000000"/>
               <w:right w:val="single" w:sz="4" w:space="0" w:color="000000"/>
             </w:tcBorders>
-            <w:shd w:val="clear" w:color="auto" w:fill="auto"/>
             <w:tcMar>
               <w:top w:w="0" w:type="dxa"/>
               <w:left w:w="70" w:type="dxa"/>
@@ -1174,7 +1163,6 @@
               <w:bottom w:val="single" w:sz="4" w:space="0" w:color="000000"/>
               <w:right w:val="single" w:sz="4" w:space="0" w:color="000000"/>
             </w:tcBorders>
-            <w:shd w:val="clear" w:color="auto" w:fill="auto"/>
             <w:tcMar>
               <w:top w:w="0" w:type="dxa"/>
               <w:left w:w="70" w:type="dxa"/>
@@ -1233,7 +1221,6 @@
               <w:bottom w:val="single" w:sz="4" w:space="0" w:color="000000"/>
               <w:right w:val="single" w:sz="4" w:space="0" w:color="000000"/>
             </w:tcBorders>
-            <w:shd w:val="clear" w:color="auto" w:fill="auto"/>
             <w:tcMar>
               <w:top w:w="0" w:type="dxa"/>
               <w:left w:w="70" w:type="dxa"/>
@@ -1292,7 +1279,6 @@
               <w:bottom w:val="single" w:sz="4" w:space="0" w:color="000000"/>
               <w:right w:val="single" w:sz="4" w:space="0" w:color="000000"/>
             </w:tcBorders>
-            <w:shd w:val="clear" w:color="auto" w:fill="auto"/>
             <w:tcMar>
               <w:top w:w="0" w:type="dxa"/>
               <w:left w:w="70" w:type="dxa"/>
@@ -1418,7 +1404,6 @@
               <w:bottom w:val="single" w:sz="4" w:space="0" w:color="000000"/>
               <w:right w:val="single" w:sz="4" w:space="0" w:color="000000"/>
             </w:tcBorders>
-            <w:shd w:val="clear" w:color="auto" w:fill="auto"/>
             <w:tcMar>
               <w:top w:w="0" w:type="dxa"/>
               <w:left w:w="70" w:type="dxa"/>
@@ -1516,7 +1501,6 @@
               <w:bottom w:val="single" w:sz="4" w:space="0" w:color="000000"/>
               <w:right w:val="single" w:sz="4" w:space="0" w:color="000000"/>
             </w:tcBorders>
-            <w:shd w:val="clear" w:color="auto" w:fill="auto"/>
             <w:tcMar>
               <w:top w:w="0" w:type="dxa"/>
               <w:left w:w="70" w:type="dxa"/>
@@ -1590,7 +1574,6 @@
               <w:bottom w:val="single" w:sz="4" w:space="0" w:color="000000"/>
               <w:right w:val="single" w:sz="4" w:space="0" w:color="000000"/>
             </w:tcBorders>
-            <w:shd w:val="clear" w:color="auto" w:fill="auto"/>
             <w:tcMar>
               <w:top w:w="0" w:type="dxa"/>
               <w:left w:w="70" w:type="dxa"/>
@@ -1648,7 +1631,6 @@
               <w:bottom w:val="single" w:sz="4" w:space="0" w:color="000000"/>
               <w:right w:val="single" w:sz="4" w:space="0" w:color="000000"/>
             </w:tcBorders>
-            <w:shd w:val="clear" w:color="auto" w:fill="auto"/>
             <w:tcMar>
               <w:top w:w="0" w:type="dxa"/>
               <w:left w:w="70" w:type="dxa"/>
@@ -1701,7 +1683,6 @@
               <w:bottom w:val="single" w:sz="4" w:space="0" w:color="000000"/>
               <w:right w:val="single" w:sz="4" w:space="0" w:color="000000"/>
             </w:tcBorders>
-            <w:shd w:val="clear" w:color="auto" w:fill="auto"/>
             <w:tcMar>
               <w:top w:w="0" w:type="dxa"/>
               <w:left w:w="70" w:type="dxa"/>
@@ -1743,7 +1724,6 @@
                     <w:bottom w:val="single" w:sz="4" w:space="0" w:color="000000"/>
                     <w:right w:val="single" w:sz="4" w:space="0" w:color="000000"/>
                   </w:tcBorders>
-                  <w:shd w:val="clear" w:color="auto" w:fill="auto"/>
                   <w:tcMar>
                     <w:top w:w="0" w:type="dxa"/>
                     <w:left w:w="108" w:type="dxa"/>
@@ -1788,7 +1768,6 @@
                     <w:bottom w:val="single" w:sz="4" w:space="0" w:color="000000"/>
                     <w:right w:val="single" w:sz="4" w:space="0" w:color="000000"/>
                   </w:tcBorders>
-                  <w:shd w:val="clear" w:color="auto" w:fill="auto"/>
                   <w:tcMar>
                     <w:top w:w="0" w:type="dxa"/>
                     <w:left w:w="108" w:type="dxa"/>
@@ -1833,7 +1812,6 @@
                     <w:bottom w:val="single" w:sz="4" w:space="0" w:color="000000"/>
                     <w:right w:val="single" w:sz="4" w:space="0" w:color="000000"/>
                   </w:tcBorders>
-                  <w:shd w:val="clear" w:color="auto" w:fill="auto"/>
                   <w:tcMar>
                     <w:top w:w="0" w:type="dxa"/>
                     <w:left w:w="108" w:type="dxa"/>
@@ -1883,7 +1861,6 @@
                     <w:bottom w:val="single" w:sz="4" w:space="0" w:color="000000"/>
                     <w:right w:val="single" w:sz="4" w:space="0" w:color="000000"/>
                   </w:tcBorders>
-                  <w:shd w:val="clear" w:color="auto" w:fill="auto"/>
                   <w:tcMar>
                     <w:top w:w="0" w:type="dxa"/>
                     <w:left w:w="108" w:type="dxa"/>
@@ -1939,7 +1916,6 @@
                     <w:bottom w:val="single" w:sz="4" w:space="0" w:color="000000"/>
                     <w:right w:val="single" w:sz="4" w:space="0" w:color="000000"/>
                   </w:tcBorders>
-                  <w:shd w:val="clear" w:color="auto" w:fill="auto"/>
                   <w:tcMar>
                     <w:top w:w="0" w:type="dxa"/>
                     <w:left w:w="108" w:type="dxa"/>
@@ -1975,7 +1951,6 @@
                     <w:bottom w:val="single" w:sz="4" w:space="0" w:color="000000"/>
                     <w:right w:val="single" w:sz="4" w:space="0" w:color="000000"/>
                   </w:tcBorders>
-                  <w:shd w:val="clear" w:color="auto" w:fill="auto"/>
                   <w:tcMar>
                     <w:top w:w="0" w:type="dxa"/>
                     <w:left w:w="108" w:type="dxa"/>
@@ -2025,7 +2000,6 @@
                     <w:bottom w:val="single" w:sz="4" w:space="0" w:color="000000"/>
                     <w:right w:val="single" w:sz="4" w:space="0" w:color="000000"/>
                   </w:tcBorders>
-                  <w:shd w:val="clear" w:color="auto" w:fill="auto"/>
                   <w:tcMar>
                     <w:top w:w="0" w:type="dxa"/>
                     <w:left w:w="108" w:type="dxa"/>
@@ -2081,7 +2055,6 @@
                     <w:bottom w:val="single" w:sz="4" w:space="0" w:color="000000"/>
                     <w:right w:val="single" w:sz="4" w:space="0" w:color="000000"/>
                   </w:tcBorders>
-                  <w:shd w:val="clear" w:color="auto" w:fill="auto"/>
                   <w:tcMar>
                     <w:top w:w="0" w:type="dxa"/>
                     <w:left w:w="108" w:type="dxa"/>
@@ -2117,7 +2090,6 @@
                     <w:bottom w:val="single" w:sz="4" w:space="0" w:color="000000"/>
                     <w:right w:val="single" w:sz="4" w:space="0" w:color="000000"/>
                   </w:tcBorders>
-                  <w:shd w:val="clear" w:color="auto" w:fill="auto"/>
                   <w:tcMar>
                     <w:top w:w="0" w:type="dxa"/>
                     <w:left w:w="108" w:type="dxa"/>
@@ -2182,7 +2154,6 @@
               <w:bottom w:val="single" w:sz="4" w:space="0" w:color="000000"/>
               <w:right w:val="single" w:sz="4" w:space="0" w:color="000000"/>
             </w:tcBorders>
-            <w:shd w:val="clear" w:color="auto" w:fill="auto"/>
             <w:tcMar>
               <w:top w:w="0" w:type="dxa"/>
               <w:left w:w="70" w:type="dxa"/>
@@ -2250,7 +2221,6 @@
                     <w:bottom w:val="single" w:sz="4" w:space="0" w:color="000000"/>
                     <w:right w:val="single" w:sz="4" w:space="0" w:color="000000"/>
                   </w:tcBorders>
-                  <w:shd w:val="clear" w:color="auto" w:fill="auto"/>
                   <w:tcMar>
                     <w:top w:w="0" w:type="dxa"/>
                     <w:left w:w="108" w:type="dxa"/>
@@ -2302,7 +2272,6 @@
                     <w:bottom w:val="single" w:sz="4" w:space="0" w:color="000000"/>
                     <w:right w:val="single" w:sz="4" w:space="0" w:color="000000"/>
                   </w:tcBorders>
-                  <w:shd w:val="clear" w:color="auto" w:fill="auto"/>
                   <w:tcMar>
                     <w:top w:w="0" w:type="dxa"/>
                     <w:left w:w="108" w:type="dxa"/>
@@ -2339,7 +2308,6 @@
                     <w:bottom w:val="single" w:sz="4" w:space="0" w:color="000000"/>
                     <w:right w:val="single" w:sz="4" w:space="0" w:color="000000"/>
                   </w:tcBorders>
-                  <w:shd w:val="clear" w:color="auto" w:fill="auto"/>
                   <w:vAlign w:val="center"/>
                 </w:tcPr>
                 <w:p>
@@ -2370,7 +2338,6 @@
                     <w:bottom w:val="single" w:sz="4" w:space="0" w:color="000000"/>
                     <w:right w:val="single" w:sz="4" w:space="0" w:color="000000"/>
                   </w:tcBorders>
-                  <w:shd w:val="clear" w:color="auto" w:fill="auto"/>
                   <w:tcMar>
                     <w:top w:w="0" w:type="dxa"/>
                     <w:left w:w="108" w:type="dxa"/>
@@ -2412,7 +2379,6 @@
                     <w:bottom w:val="single" w:sz="4" w:space="0" w:color="000000"/>
                     <w:right w:val="single" w:sz="4" w:space="0" w:color="000000"/>
                   </w:tcBorders>
-                  <w:shd w:val="clear" w:color="auto" w:fill="auto"/>
                   <w:tcMar>
                     <w:top w:w="0" w:type="dxa"/>
                     <w:left w:w="108" w:type="dxa"/>
@@ -2446,7 +2412,6 @@
                     <w:bottom w:val="single" w:sz="4" w:space="0" w:color="000000"/>
                     <w:right w:val="single" w:sz="4" w:space="0" w:color="000000"/>
                   </w:tcBorders>
-                  <w:shd w:val="clear" w:color="auto" w:fill="auto"/>
                   <w:tcMar>
                     <w:top w:w="0" w:type="dxa"/>
                     <w:left w:w="108" w:type="dxa"/>
@@ -2480,7 +2445,6 @@
                     <w:bottom w:val="single" w:sz="4" w:space="0" w:color="000000"/>
                     <w:right w:val="single" w:sz="4" w:space="0" w:color="000000"/>
                   </w:tcBorders>
-                  <w:shd w:val="clear" w:color="auto" w:fill="auto"/>
                 </w:tcPr>
                 <w:p>
                   <w:pPr>
@@ -2508,7 +2472,6 @@
                     <w:bottom w:val="single" w:sz="4" w:space="0" w:color="000000"/>
                     <w:right w:val="single" w:sz="4" w:space="0" w:color="000000"/>
                   </w:tcBorders>
-                  <w:shd w:val="clear" w:color="auto" w:fill="auto"/>
                   <w:tcMar>
                     <w:top w:w="0" w:type="dxa"/>
                     <w:left w:w="108" w:type="dxa"/>
@@ -2600,7 +2563,6 @@
               <w:bottom w:val="single" w:sz="4" w:space="0" w:color="000000"/>
               <w:right w:val="single" w:sz="4" w:space="0" w:color="000000"/>
             </w:tcBorders>
-            <w:shd w:val="clear" w:color="auto" w:fill="auto"/>
             <w:tcMar>
               <w:top w:w="0" w:type="dxa"/>
               <w:left w:w="70" w:type="dxa"/>
@@ -2637,7 +2599,6 @@
               <w:bottom w:val="single" w:sz="4" w:space="0" w:color="000000"/>
               <w:right w:val="single" w:sz="4" w:space="0" w:color="000000"/>
             </w:tcBorders>
-            <w:shd w:val="clear" w:color="auto" w:fill="auto"/>
           </w:tcPr>
           <w:p>
             <w:pPr>
@@ -2675,7 +2636,6 @@
               <w:bottom w:val="single" w:sz="4" w:space="0" w:color="000000"/>
               <w:right w:val="single" w:sz="4" w:space="0" w:color="000000"/>
             </w:tcBorders>
-            <w:shd w:val="clear" w:color="auto" w:fill="auto"/>
             <w:tcMar>
               <w:top w:w="0" w:type="dxa"/>
               <w:left w:w="70" w:type="dxa"/>
@@ -2711,7 +2671,6 @@
               <w:bottom w:val="single" w:sz="4" w:space="0" w:color="000000"/>
               <w:right w:val="single" w:sz="4" w:space="0" w:color="000000"/>
             </w:tcBorders>
-            <w:shd w:val="clear" w:color="auto" w:fill="auto"/>
           </w:tcPr>
           <w:p>
             <w:pPr>
@@ -2847,23 +2806,7 @@
                 <w:sz w:val="24"/>
                 <w:szCs w:val="24"/>
               </w:rPr>
-              <w:t>${PLAN</w:t>
-            </w:r>
-            <w:r>
-              <w:rPr>
-                <w:rFonts w:ascii="Arial" w:eastAsia="Arial" w:hAnsi="Arial" w:cs="Arial"/>
-                <w:sz w:val="24"/>
-                <w:szCs w:val="24"/>
-              </w:rPr>
-              <w:t>I</w:t>
-            </w:r>
-            <w:r>
-              <w:rPr>
-                <w:rFonts w:ascii="Arial" w:eastAsia="Arial" w:hAnsi="Arial" w:cs="Arial"/>
-                <w:sz w:val="24"/>
-                <w:szCs w:val="24"/>
-              </w:rPr>
-              <w:t>LLA_PERIODO}</w:t>
+              <w:t>${PLANILLA_PERIODO}</w:t>
             </w:r>
           </w:p>
         </w:tc>
@@ -2882,7 +2825,6 @@
               <w:bottom w:val="single" w:sz="4" w:space="0" w:color="000000"/>
               <w:right w:val="single" w:sz="4" w:space="0" w:color="000000"/>
             </w:tcBorders>
-            <w:shd w:val="clear" w:color="auto" w:fill="auto"/>
             <w:tcMar>
               <w:top w:w="0" w:type="dxa"/>
               <w:left w:w="70" w:type="dxa"/>
@@ -3019,7 +2961,6 @@
               <w:bottom w:val="single" w:sz="4" w:space="0" w:color="000000"/>
               <w:right w:val="single" w:sz="4" w:space="0" w:color="000000"/>
             </w:tcBorders>
-            <w:shd w:val="clear" w:color="auto" w:fill="auto"/>
             <w:tcMar>
               <w:top w:w="0" w:type="dxa"/>
               <w:left w:w="70" w:type="dxa"/>
@@ -3098,7 +3039,6 @@
               <w:bottom w:val="single" w:sz="4" w:space="0" w:color="000000"/>
               <w:right w:val="single" w:sz="4" w:space="0" w:color="000000"/>
             </w:tcBorders>
-            <w:shd w:val="clear" w:color="auto" w:fill="auto"/>
             <w:tcMar>
               <w:top w:w="0" w:type="dxa"/>
               <w:left w:w="70" w:type="dxa"/>
@@ -3165,7 +3105,6 @@
               <w:bottom w:val="single" w:sz="4" w:space="0" w:color="000000"/>
               <w:right w:val="single" w:sz="4" w:space="0" w:color="000000"/>
             </w:tcBorders>
-            <w:shd w:val="clear" w:color="auto" w:fill="auto"/>
             <w:tcMar>
               <w:top w:w="0" w:type="dxa"/>
               <w:left w:w="70" w:type="dxa"/>
@@ -3231,7 +3170,6 @@
               <w:bottom w:val="single" w:sz="4" w:space="0" w:color="000000"/>
               <w:right w:val="single" w:sz="4" w:space="0" w:color="000000"/>
             </w:tcBorders>
-            <w:shd w:val="clear" w:color="auto" w:fill="auto"/>
             <w:tcMar>
               <w:top w:w="0" w:type="dxa"/>
               <w:left w:w="70" w:type="dxa"/>
@@ -3255,6 +3193,16 @@
                 <w:szCs w:val="24"/>
               </w:rPr>
               <w:t>Observaciones al informe técnico:</w:t>
+            </w:r>
+            <w:r>
+              <w:t xml:space="preserve"> </w:t>
+            </w:r>
+            <w:r>
+              <w:rPr>
+                <w:rFonts w:ascii="Arial" w:hAnsi="Arial" w:cs="Arial"/>
+                <w:szCs w:val="24"/>
+              </w:rPr>
+              <w:t>${OBSERVACIONES_TECNICAS}</w:t>
             </w:r>
           </w:p>
           <w:p>
@@ -3380,7 +3328,6 @@
               <w:bottom w:val="single" w:sz="4" w:space="0" w:color="000000"/>
               <w:right w:val="single" w:sz="4" w:space="0" w:color="000000"/>
             </w:tcBorders>
-            <w:shd w:val="clear" w:color="auto" w:fill="auto"/>
             <w:tcMar>
               <w:top w:w="0" w:type="dxa"/>
               <w:left w:w="70" w:type="dxa"/>
@@ -3504,7 +3451,6 @@
               <w:bottom w:val="single" w:sz="4" w:space="0" w:color="000000"/>
               <w:right w:val="single" w:sz="4" w:space="0" w:color="000000"/>
             </w:tcBorders>
-            <w:shd w:val="clear" w:color="auto" w:fill="auto"/>
             <w:tcMar>
               <w:top w:w="0" w:type="dxa"/>
               <w:left w:w="70" w:type="dxa"/>
@@ -3631,8 +3577,6 @@
                 <w:szCs w:val="24"/>
               </w:rPr>
             </w:pPr>
-            <w:bookmarkStart w:id="0" w:name="_GoBack"/>
-            <w:bookmarkEnd w:id="0"/>
           </w:p>
           <w:p>
             <w:pPr>
@@ -3714,7 +3658,6 @@
               <w:bottom w:val="single" w:sz="4" w:space="0" w:color="000000"/>
               <w:right w:val="single" w:sz="4" w:space="0" w:color="000000"/>
             </w:tcBorders>
-            <w:shd w:val="clear" w:color="auto" w:fill="auto"/>
             <w:tcMar>
               <w:top w:w="0" w:type="dxa"/>
               <w:left w:w="70" w:type="dxa"/>
@@ -3770,8 +3713,8 @@
       </w:pPr>
     </w:p>
     <w:sectPr>
-      <w:headerReference w:type="default" r:id="rId9"/>
-      <w:footerReference w:type="default" r:id="rId10"/>
+      <w:headerReference w:type="default" r:id="rId8"/>
+      <w:footerReference w:type="default" r:id="rId9"/>
       <w:pgSz w:w="12242" w:h="15842" w:code="1"/>
       <w:pgMar w:top="1134" w:right="1134" w:bottom="1701" w:left="1134" w:header="1134" w:footer="1134" w:gutter="0"/>
       <w:cols w:space="720"/>
@@ -3781,7 +3724,7 @@
 </file>
 
 <file path=word/endnotes.xml><?xml version="1.0" encoding="utf-8"?>
-<w:endnotes xmlns:wpc="http://schemas.microsoft.com/office/word/2010/wordprocessingCanvas" xmlns:mc="http://schemas.openxmlformats.org/markup-compatibility/2006" xmlns:o="urn:schemas-microsoft-com:office:office" xmlns:r="http://schemas.openxmlformats.org/officeDocument/2006/relationships" xmlns:m="http://schemas.openxmlformats.org/officeDocument/2006/math" xmlns:v="urn:schemas-microsoft-com:vml" xmlns:wp14="http://schemas.microsoft.com/office/word/2010/wordprocessingDrawing" xmlns:wp="http://schemas.openxmlformats.org/drawingml/2006/wordprocessingDrawing" xmlns:w10="urn:schemas-microsoft-com:office:word" xmlns:w="http://schemas.openxmlformats.org/wordprocessingml/2006/main" xmlns:w14="http://schemas.microsoft.com/office/word/2010/wordml" xmlns:wpg="http://schemas.microsoft.com/office/word/2010/wordprocessingGroup" xmlns:wpi="http://schemas.microsoft.com/office/word/2010/wordprocessingInk" xmlns:wne="http://schemas.microsoft.com/office/word/2006/wordml" xmlns:wps="http://schemas.microsoft.com/office/word/2010/wordprocessingShape" mc:Ignorable="w14 wp14">
+<w:endnotes xmlns:wpc="http://schemas.microsoft.com/office/word/2010/wordprocessingCanvas" xmlns:cx="http://schemas.microsoft.com/office/drawing/2014/chartex" xmlns:cx1="http://schemas.microsoft.com/office/drawing/2015/9/8/chartex" xmlns:cx2="http://schemas.microsoft.com/office/drawing/2015/10/21/chartex" xmlns:cx3="http://schemas.microsoft.com/office/drawing/2016/5/9/chartex" xmlns:cx4="http://schemas.microsoft.com/office/drawing/2016/5/10/chartex" xmlns:cx5="http://schemas.microsoft.com/office/drawing/2016/5/11/chartex" xmlns:cx6="http://schemas.microsoft.com/office/drawing/2016/5/12/chartex" xmlns:cx7="http://schemas.microsoft.com/office/drawing/2016/5/13/chartex" xmlns:cx8="http://schemas.microsoft.com/office/drawing/2016/5/14/chartex" xmlns:mc="http://schemas.openxmlformats.org/markup-compatibility/2006" xmlns:aink="http://schemas.microsoft.com/office/drawing/2016/ink" xmlns:am3d="http://schemas.microsoft.com/office/drawing/2017/model3d" xmlns:o="urn:schemas-microsoft-com:office:office" xmlns:oel="http://schemas.microsoft.com/office/2019/extlst" xmlns:r="http://schemas.openxmlformats.org/officeDocument/2006/relationships" xmlns:m="http://schemas.openxmlformats.org/officeDocument/2006/math" xmlns:v="urn:schemas-microsoft-com:vml" xmlns:wp14="http://schemas.microsoft.com/office/word/2010/wordprocessingDrawing" xmlns:wp="http://schemas.openxmlformats.org/drawingml/2006/wordprocessingDrawing" xmlns:w10="urn:schemas-microsoft-com:office:word" xmlns:w="http://schemas.openxmlformats.org/wordprocessingml/2006/main" xmlns:w14="http://schemas.microsoft.com/office/word/2010/wordml" xmlns:w15="http://schemas.microsoft.com/office/word/2012/wordml" xmlns:w16cex="http://schemas.microsoft.com/office/word/2018/wordml/cex" xmlns:w16cid="http://schemas.microsoft.com/office/word/2016/wordml/cid" xmlns:w16="http://schemas.microsoft.com/office/word/2018/wordml" xmlns:w16du="http://schemas.microsoft.com/office/word/2023/wordml/word16du" xmlns:w16sdtdh="http://schemas.microsoft.com/office/word/2020/wordml/sdtdatahash" xmlns:w16sdtfl="http://schemas.microsoft.com/office/word/2024/wordml/sdtformatlock" xmlns:w16se="http://schemas.microsoft.com/office/word/2015/wordml/symex" xmlns:wpg="http://schemas.microsoft.com/office/word/2010/wordprocessingGroup" xmlns:wpi="http://schemas.microsoft.com/office/word/2010/wordprocessingInk" xmlns:wne="http://schemas.microsoft.com/office/word/2006/wordml" xmlns:wps="http://schemas.microsoft.com/office/word/2010/wordprocessingShape" mc:Ignorable="w14 w15 w16se w16cid w16 w16cex w16sdtdh w16sdtfl w16du wp14">
   <w:endnote w:type="separator" w:id="-1">
     <w:p>
       <w:r>
@@ -3800,7 +3743,7 @@
 </file>
 
 <file path=word/footer1.xml><?xml version="1.0" encoding="utf-8"?>
-<w:ftr xmlns:wpc="http://schemas.microsoft.com/office/word/2010/wordprocessingCanvas" xmlns:mc="http://schemas.openxmlformats.org/markup-compatibility/2006" xmlns:o="urn:schemas-microsoft-com:office:office" xmlns:r="http://schemas.openxmlformats.org/officeDocument/2006/relationships" xmlns:m="http://schemas.openxmlformats.org/officeDocument/2006/math" xmlns:v="urn:schemas-microsoft-com:vml" xmlns:wp14="http://schemas.microsoft.com/office/word/2010/wordprocessingDrawing" xmlns:wp="http://schemas.openxmlformats.org/drawingml/2006/wordprocessingDrawing" xmlns:w10="urn:schemas-microsoft-com:office:word" xmlns:w="http://schemas.openxmlformats.org/wordprocessingml/2006/main" xmlns:w14="http://schemas.microsoft.com/office/word/2010/wordml" xmlns:wpg="http://schemas.microsoft.com/office/word/2010/wordprocessingGroup" xmlns:wpi="http://schemas.microsoft.com/office/word/2010/wordprocessingInk" xmlns:wne="http://schemas.microsoft.com/office/word/2006/wordml" xmlns:wps="http://schemas.microsoft.com/office/word/2010/wordprocessingShape" mc:Ignorable="w14 wp14">
+<w:ftr xmlns:wpc="http://schemas.microsoft.com/office/word/2010/wordprocessingCanvas" xmlns:cx="http://schemas.microsoft.com/office/drawing/2014/chartex" xmlns:cx1="http://schemas.microsoft.com/office/drawing/2015/9/8/chartex" xmlns:cx2="http://schemas.microsoft.com/office/drawing/2015/10/21/chartex" xmlns:cx3="http://schemas.microsoft.com/office/drawing/2016/5/9/chartex" xmlns:cx4="http://schemas.microsoft.com/office/drawing/2016/5/10/chartex" xmlns:cx5="http://schemas.microsoft.com/office/drawing/2016/5/11/chartex" xmlns:cx6="http://schemas.microsoft.com/office/drawing/2016/5/12/chartex" xmlns:cx7="http://schemas.microsoft.com/office/drawing/2016/5/13/chartex" xmlns:cx8="http://schemas.microsoft.com/office/drawing/2016/5/14/chartex" xmlns:mc="http://schemas.openxmlformats.org/markup-compatibility/2006" xmlns:aink="http://schemas.microsoft.com/office/drawing/2016/ink" xmlns:am3d="http://schemas.microsoft.com/office/drawing/2017/model3d" xmlns:o="urn:schemas-microsoft-com:office:office" xmlns:oel="http://schemas.microsoft.com/office/2019/extlst" xmlns:r="http://schemas.openxmlformats.org/officeDocument/2006/relationships" xmlns:m="http://schemas.openxmlformats.org/officeDocument/2006/math" xmlns:v="urn:schemas-microsoft-com:vml" xmlns:wp14="http://schemas.microsoft.com/office/word/2010/wordprocessingDrawing" xmlns:wp="http://schemas.openxmlformats.org/drawingml/2006/wordprocessingDrawing" xmlns:w10="urn:schemas-microsoft-com:office:word" xmlns:w="http://schemas.openxmlformats.org/wordprocessingml/2006/main" xmlns:w14="http://schemas.microsoft.com/office/word/2010/wordml" xmlns:w15="http://schemas.microsoft.com/office/word/2012/wordml" xmlns:w16cex="http://schemas.microsoft.com/office/word/2018/wordml/cex" xmlns:w16cid="http://schemas.microsoft.com/office/word/2016/wordml/cid" xmlns:w16="http://schemas.microsoft.com/office/word/2018/wordml" xmlns:w16du="http://schemas.microsoft.com/office/word/2023/wordml/word16du" xmlns:w16sdtdh="http://schemas.microsoft.com/office/word/2020/wordml/sdtdatahash" xmlns:w16sdtfl="http://schemas.microsoft.com/office/word/2024/wordml/sdtformatlock" xmlns:w16se="http://schemas.microsoft.com/office/word/2015/wordml/symex" xmlns:wpg="http://schemas.microsoft.com/office/word/2010/wordprocessingGroup" xmlns:wpi="http://schemas.microsoft.com/office/word/2010/wordprocessingInk" xmlns:wne="http://schemas.microsoft.com/office/word/2006/wordml" xmlns:wps="http://schemas.microsoft.com/office/word/2010/wordprocessingShape" mc:Ignorable="w14 w15 w16se w16cid w16 w16cex w16sdtdh w16sdtfl w16du wp14">
   <w:p>
     <w:pPr>
       <w:pStyle w:val="Piedepgina"/>
@@ -3943,7 +3886,7 @@
 </file>
 
 <file path=word/footnotes.xml><?xml version="1.0" encoding="utf-8"?>
-<w:footnotes xmlns:wpc="http://schemas.microsoft.com/office/word/2010/wordprocessingCanvas" xmlns:mc="http://schemas.openxmlformats.org/markup-compatibility/2006" xmlns:o="urn:schemas-microsoft-com:office:office" xmlns:r="http://schemas.openxmlformats.org/officeDocument/2006/relationships" xmlns:m="http://schemas.openxmlformats.org/officeDocument/2006/math" xmlns:v="urn:schemas-microsoft-com:vml" xmlns:wp14="http://schemas.microsoft.com/office/word/2010/wordprocessingDrawing" xmlns:wp="http://schemas.openxmlformats.org/drawingml/2006/wordprocessingDrawing" xmlns:w10="urn:schemas-microsoft-com:office:word" xmlns:w="http://schemas.openxmlformats.org/wordprocessingml/2006/main" xmlns:w14="http://schemas.microsoft.com/office/word/2010/wordml" xmlns:wpg="http://schemas.microsoft.com/office/word/2010/wordprocessingGroup" xmlns:wpi="http://schemas.microsoft.com/office/word/2010/wordprocessingInk" xmlns:wne="http://schemas.microsoft.com/office/word/2006/wordml" xmlns:wps="http://schemas.microsoft.com/office/word/2010/wordprocessingShape" mc:Ignorable="w14 wp14">
+<w:footnotes xmlns:wpc="http://schemas.microsoft.com/office/word/2010/wordprocessingCanvas" xmlns:cx="http://schemas.microsoft.com/office/drawing/2014/chartex" xmlns:cx1="http://schemas.microsoft.com/office/drawing/2015/9/8/chartex" xmlns:cx2="http://schemas.microsoft.com/office/drawing/2015/10/21/chartex" xmlns:cx3="http://schemas.microsoft.com/office/drawing/2016/5/9/chartex" xmlns:cx4="http://schemas.microsoft.com/office/drawing/2016/5/10/chartex" xmlns:cx5="http://schemas.microsoft.com/office/drawing/2016/5/11/chartex" xmlns:cx6="http://schemas.microsoft.com/office/drawing/2016/5/12/chartex" xmlns:cx7="http://schemas.microsoft.com/office/drawing/2016/5/13/chartex" xmlns:cx8="http://schemas.microsoft.com/office/drawing/2016/5/14/chartex" xmlns:mc="http://schemas.openxmlformats.org/markup-compatibility/2006" xmlns:aink="http://schemas.microsoft.com/office/drawing/2016/ink" xmlns:am3d="http://schemas.microsoft.com/office/drawing/2017/model3d" xmlns:o="urn:schemas-microsoft-com:office:office" xmlns:oel="http://schemas.microsoft.com/office/2019/extlst" xmlns:r="http://schemas.openxmlformats.org/officeDocument/2006/relationships" xmlns:m="http://schemas.openxmlformats.org/officeDocument/2006/math" xmlns:v="urn:schemas-microsoft-com:vml" xmlns:wp14="http://schemas.microsoft.com/office/word/2010/wordprocessingDrawing" xmlns:wp="http://schemas.openxmlformats.org/drawingml/2006/wordprocessingDrawing" xmlns:w10="urn:schemas-microsoft-com:office:word" xmlns:w="http://schemas.openxmlformats.org/wordprocessingml/2006/main" xmlns:w14="http://schemas.microsoft.com/office/word/2010/wordml" xmlns:w15="http://schemas.microsoft.com/office/word/2012/wordml" xmlns:w16cex="http://schemas.microsoft.com/office/word/2018/wordml/cex" xmlns:w16cid="http://schemas.microsoft.com/office/word/2016/wordml/cid" xmlns:w16="http://schemas.microsoft.com/office/word/2018/wordml" xmlns:w16du="http://schemas.microsoft.com/office/word/2023/wordml/word16du" xmlns:w16sdtdh="http://schemas.microsoft.com/office/word/2020/wordml/sdtdatahash" xmlns:w16sdtfl="http://schemas.microsoft.com/office/word/2024/wordml/sdtformatlock" xmlns:w16se="http://schemas.microsoft.com/office/word/2015/wordml/symex" xmlns:wpg="http://schemas.microsoft.com/office/word/2010/wordprocessingGroup" xmlns:wpi="http://schemas.microsoft.com/office/word/2010/wordprocessingInk" xmlns:wne="http://schemas.microsoft.com/office/word/2006/wordml" xmlns:wps="http://schemas.microsoft.com/office/word/2010/wordprocessingShape" mc:Ignorable="w14 w15 w16se w16cid w16 w16cex w16sdtdh w16sdtfl w16du wp14">
   <w:footnote w:type="separator" w:id="-1">
     <w:p>
       <w:r>
@@ -3965,7 +3908,7 @@
 </file>
 
 <file path=word/header1.xml><?xml version="1.0" encoding="utf-8"?>
-<w:hdr xmlns:wpc="http://schemas.microsoft.com/office/word/2010/wordprocessingCanvas" xmlns:mc="http://schemas.openxmlformats.org/markup-compatibility/2006" xmlns:o="urn:schemas-microsoft-com:office:office" xmlns:r="http://schemas.openxmlformats.org/officeDocument/2006/relationships" xmlns:m="http://schemas.openxmlformats.org/officeDocument/2006/math" xmlns:v="urn:schemas-microsoft-com:vml" xmlns:wp14="http://schemas.microsoft.com/office/word/2010/wordprocessingDrawing" xmlns:wp="http://schemas.openxmlformats.org/drawingml/2006/wordprocessingDrawing" xmlns:w10="urn:schemas-microsoft-com:office:word" xmlns:w="http://schemas.openxmlformats.org/wordprocessingml/2006/main" xmlns:w14="http://schemas.microsoft.com/office/word/2010/wordml" xmlns:wpg="http://schemas.microsoft.com/office/word/2010/wordprocessingGroup" xmlns:wpi="http://schemas.microsoft.com/office/word/2010/wordprocessingInk" xmlns:wne="http://schemas.microsoft.com/office/word/2006/wordml" xmlns:wps="http://schemas.microsoft.com/office/word/2010/wordprocessingShape" mc:Ignorable="w14 wp14">
+<w:hdr xmlns:wpc="http://schemas.microsoft.com/office/word/2010/wordprocessingCanvas" xmlns:cx="http://schemas.microsoft.com/office/drawing/2014/chartex" xmlns:cx1="http://schemas.microsoft.com/office/drawing/2015/9/8/chartex" xmlns:cx2="http://schemas.microsoft.com/office/drawing/2015/10/21/chartex" xmlns:cx3="http://schemas.microsoft.com/office/drawing/2016/5/9/chartex" xmlns:cx4="http://schemas.microsoft.com/office/drawing/2016/5/10/chartex" xmlns:cx5="http://schemas.microsoft.com/office/drawing/2016/5/11/chartex" xmlns:cx6="http://schemas.microsoft.com/office/drawing/2016/5/12/chartex" xmlns:cx7="http://schemas.microsoft.com/office/drawing/2016/5/13/chartex" xmlns:cx8="http://schemas.microsoft.com/office/drawing/2016/5/14/chartex" xmlns:mc="http://schemas.openxmlformats.org/markup-compatibility/2006" xmlns:aink="http://schemas.microsoft.com/office/drawing/2016/ink" xmlns:am3d="http://schemas.microsoft.com/office/drawing/2017/model3d" xmlns:o="urn:schemas-microsoft-com:office:office" xmlns:oel="http://schemas.microsoft.com/office/2019/extlst" xmlns:r="http://schemas.openxmlformats.org/officeDocument/2006/relationships" xmlns:m="http://schemas.openxmlformats.org/officeDocument/2006/math" xmlns:v="urn:schemas-microsoft-com:vml" xmlns:wp14="http://schemas.microsoft.com/office/word/2010/wordprocessingDrawing" xmlns:wp="http://schemas.openxmlformats.org/drawingml/2006/wordprocessingDrawing" xmlns:w10="urn:schemas-microsoft-com:office:word" xmlns:w="http://schemas.openxmlformats.org/wordprocessingml/2006/main" xmlns:w14="http://schemas.microsoft.com/office/word/2010/wordml" xmlns:w15="http://schemas.microsoft.com/office/word/2012/wordml" xmlns:w16cex="http://schemas.microsoft.com/office/word/2018/wordml/cex" xmlns:w16cid="http://schemas.microsoft.com/office/word/2016/wordml/cid" xmlns:w16="http://schemas.microsoft.com/office/word/2018/wordml" xmlns:w16du="http://schemas.microsoft.com/office/word/2023/wordml/word16du" xmlns:w16sdtdh="http://schemas.microsoft.com/office/word/2020/wordml/sdtdatahash" xmlns:w16sdtfl="http://schemas.microsoft.com/office/word/2024/wordml/sdtformatlock" xmlns:w16se="http://schemas.microsoft.com/office/word/2015/wordml/symex" xmlns:wpg="http://schemas.microsoft.com/office/word/2010/wordprocessingGroup" xmlns:wpi="http://schemas.microsoft.com/office/word/2010/wordprocessingInk" xmlns:wne="http://schemas.microsoft.com/office/word/2006/wordml" xmlns:wps="http://schemas.microsoft.com/office/word/2010/wordprocessingShape" mc:Ignorable="w14 w15 w16se w16cid w16 w16cex w16sdtdh w16sdtfl w16du wp14">
   <w:tbl>
     <w:tblPr>
       <w:tblW w:w="5000" w:type="pct"/>
@@ -4015,7 +3958,7 @@
               <w:lang w:val="es-CO" w:eastAsia="es-CO"/>
             </w:rPr>
             <w:drawing>
-              <wp:inline distT="0" distB="0" distL="0" distR="0" wp14:anchorId="6D1F1E03" wp14:editId="5DCF4E34">
+              <wp:inline distT="0" distB="0" distL="0" distR="0" wp14:anchorId="7F031B6C" wp14:editId="353FF5D2">
                 <wp:extent cx="1080000" cy="831504"/>
                 <wp:effectExtent l="0" t="0" r="6350" b="6985"/>
                 <wp:docPr id="6" name="Imagen 1" descr="escudo"/>
@@ -4325,8 +4268,8 @@
 </file>
 
 <file path=word/numbering.xml><?xml version="1.0" encoding="utf-8"?>
-<w:numbering xmlns:wpc="http://schemas.microsoft.com/office/word/2010/wordprocessingCanvas" xmlns:mc="http://schemas.openxmlformats.org/markup-compatibility/2006" xmlns:o="urn:schemas-microsoft-com:office:office" xmlns:r="http://schemas.openxmlformats.org/officeDocument/2006/relationships" xmlns:m="http://schemas.openxmlformats.org/officeDocument/2006/math" xmlns:v="urn:schemas-microsoft-com:vml" xmlns:wp14="http://schemas.microsoft.com/office/word/2010/wordprocessingDrawing" xmlns:wp="http://schemas.openxmlformats.org/drawingml/2006/wordprocessingDrawing" xmlns:w10="urn:schemas-microsoft-com:office:word" xmlns:w="http://schemas.openxmlformats.org/wordprocessingml/2006/main" xmlns:w14="http://schemas.microsoft.com/office/word/2010/wordml" xmlns:wpg="http://schemas.microsoft.com/office/word/2010/wordprocessingGroup" xmlns:wpi="http://schemas.microsoft.com/office/word/2010/wordprocessingInk" xmlns:wne="http://schemas.microsoft.com/office/word/2006/wordml" xmlns:wps="http://schemas.microsoft.com/office/word/2010/wordprocessingShape" mc:Ignorable="w14 wp14">
-  <w:abstractNum w:abstractNumId="0">
+<w:numbering xmlns:wpc="http://schemas.microsoft.com/office/word/2010/wordprocessingCanvas" xmlns:cx="http://schemas.microsoft.com/office/drawing/2014/chartex" xmlns:cx1="http://schemas.microsoft.com/office/drawing/2015/9/8/chartex" xmlns:cx2="http://schemas.microsoft.com/office/drawing/2015/10/21/chartex" xmlns:cx3="http://schemas.microsoft.com/office/drawing/2016/5/9/chartex" xmlns:cx4="http://schemas.microsoft.com/office/drawing/2016/5/10/chartex" xmlns:cx5="http://schemas.microsoft.com/office/drawing/2016/5/11/chartex" xmlns:cx6="http://schemas.microsoft.com/office/drawing/2016/5/12/chartex" xmlns:cx7="http://schemas.microsoft.com/office/drawing/2016/5/13/chartex" xmlns:cx8="http://schemas.microsoft.com/office/drawing/2016/5/14/chartex" xmlns:mc="http://schemas.openxmlformats.org/markup-compatibility/2006" xmlns:aink="http://schemas.microsoft.com/office/drawing/2016/ink" xmlns:am3d="http://schemas.microsoft.com/office/drawing/2017/model3d" xmlns:o="urn:schemas-microsoft-com:office:office" xmlns:oel="http://schemas.microsoft.com/office/2019/extlst" xmlns:r="http://schemas.openxmlformats.org/officeDocument/2006/relationships" xmlns:m="http://schemas.openxmlformats.org/officeDocument/2006/math" xmlns:v="urn:schemas-microsoft-com:vml" xmlns:wp14="http://schemas.microsoft.com/office/word/2010/wordprocessingDrawing" xmlns:wp="http://schemas.openxmlformats.org/drawingml/2006/wordprocessingDrawing" xmlns:w10="urn:schemas-microsoft-com:office:word" xmlns:w="http://schemas.openxmlformats.org/wordprocessingml/2006/main" xmlns:w14="http://schemas.microsoft.com/office/word/2010/wordml" xmlns:w15="http://schemas.microsoft.com/office/word/2012/wordml" xmlns:w16cex="http://schemas.microsoft.com/office/word/2018/wordml/cex" xmlns:w16cid="http://schemas.microsoft.com/office/word/2016/wordml/cid" xmlns:w16="http://schemas.microsoft.com/office/word/2018/wordml" xmlns:w16du="http://schemas.microsoft.com/office/word/2023/wordml/word16du" xmlns:w16sdtdh="http://schemas.microsoft.com/office/word/2020/wordml/sdtdatahash" xmlns:w16sdtfl="http://schemas.microsoft.com/office/word/2024/wordml/sdtformatlock" xmlns:w16se="http://schemas.microsoft.com/office/word/2015/wordml/symex" xmlns:wpg="http://schemas.microsoft.com/office/word/2010/wordprocessingGroup" xmlns:wpi="http://schemas.microsoft.com/office/word/2010/wordprocessingInk" xmlns:wne="http://schemas.microsoft.com/office/word/2006/wordml" xmlns:wps="http://schemas.microsoft.com/office/word/2010/wordprocessingShape" mc:Ignorable="w14 w15 w16se w16cid w16 w16cex w16sdtdh w16sdtfl w16du wp14">
+  <w:abstractNum w:abstractNumId="0" w15:restartNumberingAfterBreak="0">
     <w:nsid w:val="04683BB4"/>
     <w:multiLevelType w:val="hybridMultilevel"/>
     <w:tmpl w:val="4F8AC1BC"/>
@@ -4415,7 +4358,7 @@
       </w:pPr>
     </w:lvl>
   </w:abstractNum>
-  <w:abstractNum w:abstractNumId="1">
+  <w:abstractNum w:abstractNumId="1" w15:restartNumberingAfterBreak="0">
     <w:nsid w:val="14B7760E"/>
     <w:multiLevelType w:val="hybridMultilevel"/>
     <w:tmpl w:val="769A5DCE"/>
@@ -4528,7 +4471,7 @@
       </w:rPr>
     </w:lvl>
   </w:abstractNum>
-  <w:abstractNum w:abstractNumId="2">
+  <w:abstractNum w:abstractNumId="2" w15:restartNumberingAfterBreak="0">
     <w:nsid w:val="3FF1308E"/>
     <w:multiLevelType w:val="multilevel"/>
     <w:tmpl w:val="FDDEB0EC"/>
@@ -4641,7 +4584,7 @@
       </w:rPr>
     </w:lvl>
   </w:abstractNum>
-  <w:abstractNum w:abstractNumId="3">
+  <w:abstractNum w:abstractNumId="3" w15:restartNumberingAfterBreak="0">
     <w:nsid w:val="571C1BCA"/>
     <w:multiLevelType w:val="hybridMultilevel"/>
     <w:tmpl w:val="795EA340"/>
@@ -4754,7 +4697,7 @@
       </w:rPr>
     </w:lvl>
   </w:abstractNum>
-  <w:abstractNum w:abstractNumId="4">
+  <w:abstractNum w:abstractNumId="4" w15:restartNumberingAfterBreak="0">
     <w:nsid w:val="74356440"/>
     <w:multiLevelType w:val="hybridMultilevel"/>
     <w:tmpl w:val="509A9A72"/>
@@ -4843,26 +4786,26 @@
       </w:pPr>
     </w:lvl>
   </w:abstractNum>
-  <w:num w:numId="1">
+  <w:num w:numId="1" w16cid:durableId="950163657">
     <w:abstractNumId w:val="4"/>
   </w:num>
-  <w:num w:numId="2">
+  <w:num w:numId="2" w16cid:durableId="1764260604">
     <w:abstractNumId w:val="0"/>
   </w:num>
-  <w:num w:numId="3">
+  <w:num w:numId="3" w16cid:durableId="786508646">
     <w:abstractNumId w:val="2"/>
   </w:num>
-  <w:num w:numId="4">
+  <w:num w:numId="4" w16cid:durableId="55669857">
     <w:abstractNumId w:val="3"/>
   </w:num>
-  <w:num w:numId="5">
+  <w:num w:numId="5" w16cid:durableId="1998338990">
     <w:abstractNumId w:val="1"/>
   </w:num>
 </w:numbering>
 </file>
 
 <file path=word/styles.xml><?xml version="1.0" encoding="utf-8"?>
-<w:styles xmlns:mc="http://schemas.openxmlformats.org/markup-compatibility/2006" xmlns:r="http://schemas.openxmlformats.org/officeDocument/2006/relationships" xmlns:w="http://schemas.openxmlformats.org/wordprocessingml/2006/main" xmlns:w14="http://schemas.microsoft.com/office/word/2010/wordml" mc:Ignorable="w14">
+<w:styles xmlns:mc="http://schemas.openxmlformats.org/markup-compatibility/2006" xmlns:r="http://schemas.openxmlformats.org/officeDocument/2006/relationships" xmlns:w="http://schemas.openxmlformats.org/wordprocessingml/2006/main" xmlns:w14="http://schemas.microsoft.com/office/word/2010/wordml" xmlns:w15="http://schemas.microsoft.com/office/word/2012/wordml" xmlns:w16cex="http://schemas.microsoft.com/office/word/2018/wordml/cex" xmlns:w16cid="http://schemas.microsoft.com/office/word/2016/wordml/cid" xmlns:w16="http://schemas.microsoft.com/office/word/2018/wordml" xmlns:w16du="http://schemas.microsoft.com/office/word/2023/wordml/word16du" xmlns:w16sdtdh="http://schemas.microsoft.com/office/word/2020/wordml/sdtdatahash" xmlns:w16sdtfl="http://schemas.microsoft.com/office/word/2024/wordml/sdtformatlock" xmlns:w16se="http://schemas.microsoft.com/office/word/2015/wordml/symex" mc:Ignorable="w14 w15 w16se w16cid w16 w16cex w16sdtdh w16sdtfl w16du">
   <w:docDefaults>
     <w:rPrDefault>
       <w:rPr>
@@ -4872,145 +4815,383 @@
     </w:rPrDefault>
     <w:pPrDefault/>
   </w:docDefaults>
-  <w:latentStyles w:defLockedState="0" w:defUIPriority="99" w:defSemiHidden="1" w:defUnhideWhenUsed="1" w:defQFormat="0" w:count="267">
-    <w:lsdException w:name="Normal" w:semiHidden="0" w:uiPriority="0" w:unhideWhenUsed="0" w:qFormat="1"/>
-    <w:lsdException w:name="heading 1" w:semiHidden="0" w:uiPriority="9" w:unhideWhenUsed="0" w:qFormat="1"/>
-    <w:lsdException w:name="heading 2" w:uiPriority="9" w:qFormat="1"/>
-    <w:lsdException w:name="heading 3" w:uiPriority="9" w:qFormat="1"/>
-    <w:lsdException w:name="heading 4" w:uiPriority="9" w:qFormat="1"/>
-    <w:lsdException w:name="heading 5" w:uiPriority="9" w:qFormat="1"/>
-    <w:lsdException w:name="heading 6" w:uiPriority="9" w:qFormat="1"/>
-    <w:lsdException w:name="heading 7" w:uiPriority="9" w:qFormat="1"/>
-    <w:lsdException w:name="heading 8" w:uiPriority="9" w:qFormat="1"/>
-    <w:lsdException w:name="heading 9" w:uiPriority="9" w:qFormat="1"/>
-    <w:lsdException w:name="toc 1" w:uiPriority="39"/>
-    <w:lsdException w:name="toc 2" w:uiPriority="39"/>
-    <w:lsdException w:name="toc 3" w:uiPriority="39"/>
-    <w:lsdException w:name="toc 4" w:uiPriority="39"/>
-    <w:lsdException w:name="toc 5" w:uiPriority="39"/>
-    <w:lsdException w:name="toc 6" w:uiPriority="39"/>
-    <w:lsdException w:name="toc 7" w:uiPriority="39"/>
-    <w:lsdException w:name="toc 8" w:uiPriority="39"/>
-    <w:lsdException w:name="toc 9" w:uiPriority="39"/>
-    <w:lsdException w:name="caption" w:uiPriority="35" w:qFormat="1"/>
-    <w:lsdException w:name="Title" w:semiHidden="0" w:uiPriority="10" w:unhideWhenUsed="0" w:qFormat="1"/>
-    <w:lsdException w:name="Default Paragraph Font" w:uiPriority="1"/>
-    <w:lsdException w:name="Subtitle" w:semiHidden="0" w:uiPriority="11" w:unhideWhenUsed="0" w:qFormat="1"/>
-    <w:lsdException w:name="Body Text 2" w:uiPriority="0"/>
-    <w:lsdException w:name="Strong" w:semiHidden="0" w:uiPriority="22" w:unhideWhenUsed="0" w:qFormat="1"/>
-    <w:lsdException w:name="Emphasis" w:semiHidden="0" w:uiPriority="20" w:unhideWhenUsed="0" w:qFormat="1"/>
-    <w:lsdException w:name="Table Grid" w:semiHidden="0" w:uiPriority="59" w:unhideWhenUsed="0"/>
-    <w:lsdException w:name="Placeholder Text" w:unhideWhenUsed="0"/>
-    <w:lsdException w:name="No Spacing" w:semiHidden="0" w:uiPriority="1" w:unhideWhenUsed="0" w:qFormat="1"/>
-    <w:lsdException w:name="Light Shading" w:semiHidden="0" w:uiPriority="60" w:unhideWhenUsed="0"/>
-    <w:lsdException w:name="Light List" w:semiHidden="0" w:uiPriority="61" w:unhideWhenUsed="0"/>
-    <w:lsdException w:name="Light Grid" w:semiHidden="0" w:uiPriority="62" w:unhideWhenUsed="0"/>
-    <w:lsdException w:name="Medium Shading 1" w:semiHidden="0" w:uiPriority="63" w:unhideWhenUsed="0"/>
-    <w:lsdException w:name="Medium Shading 2" w:semiHidden="0" w:uiPriority="64" w:unhideWhenUsed="0"/>
-    <w:lsdException w:name="Medium List 1" w:semiHidden="0" w:uiPriority="65" w:unhideWhenUsed="0"/>
-    <w:lsdException w:name="Medium List 2" w:semiHidden="0" w:uiPriority="66" w:unhideWhenUsed="0"/>
-    <w:lsdException w:name="Medium Grid 1" w:semiHidden="0" w:uiPriority="67" w:unhideWhenUsed="0"/>
-    <w:lsdException w:name="Medium Grid 2" w:semiHidden="0" w:uiPriority="68" w:unhideWhenUsed="0"/>
-    <w:lsdException w:name="Medium Grid 3" w:semiHidden="0" w:uiPriority="69" w:unhideWhenUsed="0"/>
-    <w:lsdException w:name="Dark List" w:semiHidden="0" w:uiPriority="70" w:unhideWhenUsed="0"/>
-    <w:lsdException w:name="Colorful Shading" w:semiHidden="0" w:uiPriority="71" w:unhideWhenUsed="0"/>
-    <w:lsdException w:name="Colorful List" w:semiHidden="0" w:uiPriority="72" w:unhideWhenUsed="0"/>
-    <w:lsdException w:name="Colorful Grid" w:semiHidden="0" w:uiPriority="73" w:unhideWhenUsed="0"/>
-    <w:lsdException w:name="Light Shading Accent 1" w:semiHidden="0" w:uiPriority="60" w:unhideWhenUsed="0"/>
-    <w:lsdException w:name="Light List Accent 1" w:semiHidden="0" w:uiPriority="61" w:unhideWhenUsed="0"/>
-    <w:lsdException w:name="Light Grid Accent 1" w:semiHidden="0" w:uiPriority="62" w:unhideWhenUsed="0"/>
-    <w:lsdException w:name="Medium Shading 1 Accent 1" w:semiHidden="0" w:uiPriority="63" w:unhideWhenUsed="0"/>
-    <w:lsdException w:name="Medium Shading 2 Accent 1" w:semiHidden="0" w:uiPriority="64" w:unhideWhenUsed="0"/>
-    <w:lsdException w:name="Medium List 1 Accent 1" w:semiHidden="0" w:uiPriority="65" w:unhideWhenUsed="0"/>
-    <w:lsdException w:name="Revision" w:unhideWhenUsed="0"/>
-    <w:lsdException w:name="List Paragraph" w:semiHidden="0" w:uiPriority="34" w:unhideWhenUsed="0" w:qFormat="1"/>
-    <w:lsdException w:name="Quote" w:semiHidden="0" w:uiPriority="29" w:unhideWhenUsed="0" w:qFormat="1"/>
-    <w:lsdException w:name="Intense Quote" w:semiHidden="0" w:uiPriority="30" w:unhideWhenUsed="0" w:qFormat="1"/>
-    <w:lsdException w:name="Medium List 2 Accent 1" w:semiHidden="0" w:uiPriority="66" w:unhideWhenUsed="0"/>
-    <w:lsdException w:name="Medium Grid 1 Accent 1" w:semiHidden="0" w:uiPriority="67" w:unhideWhenUsed="0"/>
-    <w:lsdException w:name="Medium Grid 2 Accent 1" w:semiHidden="0" w:uiPriority="68" w:unhideWhenUsed="0"/>
-    <w:lsdException w:name="Medium Grid 3 Accent 1" w:semiHidden="0" w:uiPriority="69" w:unhideWhenUsed="0"/>
-    <w:lsdException w:name="Dark List Accent 1" w:semiHidden="0" w:uiPriority="70" w:unhideWhenUsed="0"/>
-    <w:lsdException w:name="Colorful Shading Accent 1" w:semiHidden="0" w:uiPriority="71" w:unhideWhenUsed="0"/>
-    <w:lsdException w:name="Colorful List Accent 1" w:semiHidden="0" w:uiPriority="72" w:unhideWhenUsed="0"/>
-    <w:lsdException w:name="Colorful Grid Accent 1" w:semiHidden="0" w:uiPriority="73" w:unhideWhenUsed="0"/>
-    <w:lsdException w:name="Light Shading Accent 2" w:semiHidden="0" w:uiPriority="60" w:unhideWhenUsed="0"/>
-    <w:lsdException w:name="Light List Accent 2" w:semiHidden="0" w:uiPriority="61" w:unhideWhenUsed="0"/>
-    <w:lsdException w:name="Light Grid Accent 2" w:semiHidden="0" w:uiPriority="62" w:unhideWhenUsed="0"/>
-    <w:lsdException w:name="Medium Shading 1 Accent 2" w:semiHidden="0" w:uiPriority="63" w:unhideWhenUsed="0"/>
-    <w:lsdException w:name="Medium Shading 2 Accent 2" w:semiHidden="0" w:uiPriority="64" w:unhideWhenUsed="0"/>
-    <w:lsdException w:name="Medium List 1 Accent 2" w:semiHidden="0" w:uiPriority="65" w:unhideWhenUsed="0"/>
-    <w:lsdException w:name="Medium List 2 Accent 2" w:semiHidden="0" w:uiPriority="66" w:unhideWhenUsed="0"/>
-    <w:lsdException w:name="Medium Grid 1 Accent 2" w:semiHidden="0" w:uiPriority="67" w:unhideWhenUsed="0"/>
-    <w:lsdException w:name="Medium Grid 2 Accent 2" w:semiHidden="0" w:uiPriority="68" w:unhideWhenUsed="0"/>
-    <w:lsdException w:name="Medium Grid 3 Accent 2" w:semiHidden="0" w:uiPriority="69" w:unhideWhenUsed="0"/>
-    <w:lsdException w:name="Dark List Accent 2" w:semiHidden="0" w:uiPriority="70" w:unhideWhenUsed="0"/>
-    <w:lsdException w:name="Colorful Shading Accent 2" w:semiHidden="0" w:uiPriority="71" w:unhideWhenUsed="0"/>
-    <w:lsdException w:name="Colorful List Accent 2" w:semiHidden="0" w:uiPriority="72" w:unhideWhenUsed="0"/>
-    <w:lsdException w:name="Colorful Grid Accent 2" w:semiHidden="0" w:uiPriority="73" w:unhideWhenUsed="0"/>
-    <w:lsdException w:name="Light Shading Accent 3" w:semiHidden="0" w:uiPriority="60" w:unhideWhenUsed="0"/>
-    <w:lsdException w:name="Light List Accent 3" w:semiHidden="0" w:uiPriority="61" w:unhideWhenUsed="0"/>
-    <w:lsdException w:name="Light Grid Accent 3" w:semiHidden="0" w:uiPriority="62" w:unhideWhenUsed="0"/>
-    <w:lsdException w:name="Medium Shading 1 Accent 3" w:semiHidden="0" w:uiPriority="63" w:unhideWhenUsed="0"/>
-    <w:lsdException w:name="Medium Shading 2 Accent 3" w:semiHidden="0" w:uiPriority="64" w:unhideWhenUsed="0"/>
-    <w:lsdException w:name="Medium List 1 Accent 3" w:semiHidden="0" w:uiPriority="65" w:unhideWhenUsed="0"/>
-    <w:lsdException w:name="Medium List 2 Accent 3" w:semiHidden="0" w:uiPriority="66" w:unhideWhenUsed="0"/>
-    <w:lsdException w:name="Medium Grid 1 Accent 3" w:semiHidden="0" w:uiPriority="67" w:unhideWhenUsed="0"/>
-    <w:lsdException w:name="Medium Grid 2 Accent 3" w:semiHidden="0" w:uiPriority="68" w:unhideWhenUsed="0"/>
-    <w:lsdException w:name="Medium Grid 3 Accent 3" w:semiHidden="0" w:uiPriority="69" w:unhideWhenUsed="0"/>
-    <w:lsdException w:name="Dark List Accent 3" w:semiHidden="0" w:uiPriority="70" w:unhideWhenUsed="0"/>
-    <w:lsdException w:name="Colorful Shading Accent 3" w:semiHidden="0" w:uiPriority="71" w:unhideWhenUsed="0"/>
-    <w:lsdException w:name="Colorful List Accent 3" w:semiHidden="0" w:uiPriority="72" w:unhideWhenUsed="0"/>
-    <w:lsdException w:name="Colorful Grid Accent 3" w:semiHidden="0" w:uiPriority="73" w:unhideWhenUsed="0"/>
-    <w:lsdException w:name="Light Shading Accent 4" w:semiHidden="0" w:uiPriority="60" w:unhideWhenUsed="0"/>
-    <w:lsdException w:name="Light List Accent 4" w:semiHidden="0" w:uiPriority="61" w:unhideWhenUsed="0"/>
-    <w:lsdException w:name="Light Grid Accent 4" w:semiHidden="0" w:uiPriority="62" w:unhideWhenUsed="0"/>
-    <w:lsdException w:name="Medium Shading 1 Accent 4" w:semiHidden="0" w:uiPriority="63" w:unhideWhenUsed="0"/>
-    <w:lsdException w:name="Medium Shading 2 Accent 4" w:semiHidden="0" w:uiPriority="64" w:unhideWhenUsed="0"/>
-    <w:lsdException w:name="Medium List 1 Accent 4" w:semiHidden="0" w:uiPriority="65" w:unhideWhenUsed="0"/>
-    <w:lsdException w:name="Medium List 2 Accent 4" w:semiHidden="0" w:uiPriority="66" w:unhideWhenUsed="0"/>
-    <w:lsdException w:name="Medium Grid 1 Accent 4" w:semiHidden="0" w:uiPriority="67" w:unhideWhenUsed="0"/>
-    <w:lsdException w:name="Medium Grid 2 Accent 4" w:semiHidden="0" w:uiPriority="68" w:unhideWhenUsed="0"/>
-    <w:lsdException w:name="Medium Grid 3 Accent 4" w:semiHidden="0" w:uiPriority="69" w:unhideWhenUsed="0"/>
-    <w:lsdException w:name="Dark List Accent 4" w:semiHidden="0" w:uiPriority="70" w:unhideWhenUsed="0"/>
-    <w:lsdException w:name="Colorful Shading Accent 4" w:semiHidden="0" w:uiPriority="71" w:unhideWhenUsed="0"/>
-    <w:lsdException w:name="Colorful List Accent 4" w:semiHidden="0" w:uiPriority="72" w:unhideWhenUsed="0"/>
-    <w:lsdException w:name="Colorful Grid Accent 4" w:semiHidden="0" w:uiPriority="73" w:unhideWhenUsed="0"/>
-    <w:lsdException w:name="Light Shading Accent 5" w:semiHidden="0" w:uiPriority="60" w:unhideWhenUsed="0"/>
-    <w:lsdException w:name="Light List Accent 5" w:semiHidden="0" w:uiPriority="61" w:unhideWhenUsed="0"/>
-    <w:lsdException w:name="Light Grid Accent 5" w:semiHidden="0" w:uiPriority="62" w:unhideWhenUsed="0"/>
-    <w:lsdException w:name="Medium Shading 1 Accent 5" w:semiHidden="0" w:uiPriority="63" w:unhideWhenUsed="0"/>
-    <w:lsdException w:name="Medium Shading 2 Accent 5" w:semiHidden="0" w:uiPriority="64" w:unhideWhenUsed="0"/>
-    <w:lsdException w:name="Medium List 1 Accent 5" w:semiHidden="0" w:uiPriority="65" w:unhideWhenUsed="0"/>
-    <w:lsdException w:name="Medium List 2 Accent 5" w:semiHidden="0" w:uiPriority="66" w:unhideWhenUsed="0"/>
-    <w:lsdException w:name="Medium Grid 1 Accent 5" w:semiHidden="0" w:uiPriority="67" w:unhideWhenUsed="0"/>
-    <w:lsdException w:name="Medium Grid 2 Accent 5" w:semiHidden="0" w:uiPriority="68" w:unhideWhenUsed="0"/>
-    <w:lsdException w:name="Medium Grid 3 Accent 5" w:semiHidden="0" w:uiPriority="69" w:unhideWhenUsed="0"/>
-    <w:lsdException w:name="Dark List Accent 5" w:semiHidden="0" w:uiPriority="70" w:unhideWhenUsed="0"/>
-    <w:lsdException w:name="Colorful Shading Accent 5" w:semiHidden="0" w:uiPriority="71" w:unhideWhenUsed="0"/>
-    <w:lsdException w:name="Colorful List Accent 5" w:semiHidden="0" w:uiPriority="72" w:unhideWhenUsed="0"/>
-    <w:lsdException w:name="Colorful Grid Accent 5" w:semiHidden="0" w:uiPriority="73" w:unhideWhenUsed="0"/>
-    <w:lsdException w:name="Light Shading Accent 6" w:semiHidden="0" w:uiPriority="60" w:unhideWhenUsed="0"/>
-    <w:lsdException w:name="Light List Accent 6" w:semiHidden="0" w:uiPriority="61" w:unhideWhenUsed="0"/>
-    <w:lsdException w:name="Light Grid Accent 6" w:semiHidden="0" w:uiPriority="62" w:unhideWhenUsed="0"/>
-    <w:lsdException w:name="Medium Shading 1 Accent 6" w:semiHidden="0" w:uiPriority="63" w:unhideWhenUsed="0"/>
-    <w:lsdException w:name="Medium Shading 2 Accent 6" w:semiHidden="0" w:uiPriority="64" w:unhideWhenUsed="0"/>
-    <w:lsdException w:name="Medium List 1 Accent 6" w:semiHidden="0" w:uiPriority="65" w:unhideWhenUsed="0"/>
-    <w:lsdException w:name="Medium List 2 Accent 6" w:semiHidden="0" w:uiPriority="66" w:unhideWhenUsed="0"/>
-    <w:lsdException w:name="Medium Grid 1 Accent 6" w:semiHidden="0" w:uiPriority="67" w:unhideWhenUsed="0"/>
-    <w:lsdException w:name="Medium Grid 2 Accent 6" w:semiHidden="0" w:uiPriority="68" w:unhideWhenUsed="0"/>
-    <w:lsdException w:name="Medium Grid 3 Accent 6" w:semiHidden="0" w:uiPriority="69" w:unhideWhenUsed="0"/>
-    <w:lsdException w:name="Dark List Accent 6" w:semiHidden="0" w:uiPriority="70" w:unhideWhenUsed="0"/>
-    <w:lsdException w:name="Colorful Shading Accent 6" w:semiHidden="0" w:uiPriority="71" w:unhideWhenUsed="0"/>
-    <w:lsdException w:name="Colorful List Accent 6" w:semiHidden="0" w:uiPriority="72" w:unhideWhenUsed="0"/>
-    <w:lsdException w:name="Colorful Grid Accent 6" w:semiHidden="0" w:uiPriority="73" w:unhideWhenUsed="0"/>
-    <w:lsdException w:name="Subtle Emphasis" w:semiHidden="0" w:uiPriority="19" w:unhideWhenUsed="0" w:qFormat="1"/>
-    <w:lsdException w:name="Intense Emphasis" w:semiHidden="0" w:uiPriority="21" w:unhideWhenUsed="0" w:qFormat="1"/>
-    <w:lsdException w:name="Subtle Reference" w:semiHidden="0" w:uiPriority="31" w:unhideWhenUsed="0" w:qFormat="1"/>
-    <w:lsdException w:name="Intense Reference" w:semiHidden="0" w:uiPriority="32" w:unhideWhenUsed="0" w:qFormat="1"/>
-    <w:lsdException w:name="Book Title" w:semiHidden="0" w:uiPriority="33" w:unhideWhenUsed="0" w:qFormat="1"/>
-    <w:lsdException w:name="Bibliography" w:uiPriority="37"/>
-    <w:lsdException w:name="TOC Heading" w:uiPriority="39" w:qFormat="1"/>
+  <w:latentStyles w:defLockedState="0" w:defUIPriority="99" w:defSemiHidden="0" w:defUnhideWhenUsed="0" w:defQFormat="0" w:count="376">
+    <w:lsdException w:name="Normal" w:uiPriority="0" w:qFormat="1"/>
+    <w:lsdException w:name="heading 1" w:uiPriority="9" w:qFormat="1"/>
+    <w:lsdException w:name="heading 2" w:semiHidden="1" w:uiPriority="9" w:unhideWhenUsed="1" w:qFormat="1"/>
+    <w:lsdException w:name="heading 3" w:semiHidden="1" w:uiPriority="9" w:unhideWhenUsed="1" w:qFormat="1"/>
+    <w:lsdException w:name="heading 4" w:semiHidden="1" w:uiPriority="9" w:unhideWhenUsed="1" w:qFormat="1"/>
+    <w:lsdException w:name="heading 5" w:semiHidden="1" w:uiPriority="9" w:unhideWhenUsed="1" w:qFormat="1"/>
+    <w:lsdException w:name="heading 6" w:semiHidden="1" w:uiPriority="9" w:unhideWhenUsed="1" w:qFormat="1"/>
+    <w:lsdException w:name="heading 7" w:semiHidden="1" w:uiPriority="9" w:unhideWhenUsed="1" w:qFormat="1"/>
+    <w:lsdException w:name="heading 8" w:semiHidden="1" w:uiPriority="9" w:unhideWhenUsed="1" w:qFormat="1"/>
+    <w:lsdException w:name="heading 9" w:semiHidden="1" w:uiPriority="9" w:unhideWhenUsed="1" w:qFormat="1"/>
+    <w:lsdException w:name="index 1" w:semiHidden="1" w:unhideWhenUsed="1"/>
+    <w:lsdException w:name="index 2" w:semiHidden="1" w:unhideWhenUsed="1"/>
+    <w:lsdException w:name="index 3" w:semiHidden="1" w:unhideWhenUsed="1"/>
+    <w:lsdException w:name="index 4" w:semiHidden="1" w:unhideWhenUsed="1"/>
+    <w:lsdException w:name="index 5" w:semiHidden="1" w:unhideWhenUsed="1"/>
+    <w:lsdException w:name="index 6" w:semiHidden="1" w:unhideWhenUsed="1"/>
+    <w:lsdException w:name="index 7" w:semiHidden="1" w:unhideWhenUsed="1"/>
+    <w:lsdException w:name="index 8" w:semiHidden="1" w:unhideWhenUsed="1"/>
+    <w:lsdException w:name="index 9" w:semiHidden="1" w:unhideWhenUsed="1"/>
+    <w:lsdException w:name="toc 1" w:semiHidden="1" w:uiPriority="39" w:unhideWhenUsed="1"/>
+    <w:lsdException w:name="toc 2" w:semiHidden="1" w:uiPriority="39" w:unhideWhenUsed="1"/>
+    <w:lsdException w:name="toc 3" w:semiHidden="1" w:uiPriority="39" w:unhideWhenUsed="1"/>
+    <w:lsdException w:name="toc 4" w:semiHidden="1" w:uiPriority="39" w:unhideWhenUsed="1"/>
+    <w:lsdException w:name="toc 5" w:semiHidden="1" w:uiPriority="39" w:unhideWhenUsed="1"/>
+    <w:lsdException w:name="toc 6" w:semiHidden="1" w:uiPriority="39" w:unhideWhenUsed="1"/>
+    <w:lsdException w:name="toc 7" w:semiHidden="1" w:uiPriority="39" w:unhideWhenUsed="1"/>
+    <w:lsdException w:name="toc 8" w:semiHidden="1" w:uiPriority="39" w:unhideWhenUsed="1"/>
+    <w:lsdException w:name="toc 9" w:semiHidden="1" w:uiPriority="39" w:unhideWhenUsed="1"/>
+    <w:lsdException w:name="Normal Indent" w:semiHidden="1" w:unhideWhenUsed="1"/>
+    <w:lsdException w:name="footnote text" w:semiHidden="1" w:unhideWhenUsed="1"/>
+    <w:lsdException w:name="annotation text" w:semiHidden="1" w:unhideWhenUsed="1"/>
+    <w:lsdException w:name="header" w:semiHidden="1" w:unhideWhenUsed="1"/>
+    <w:lsdException w:name="footer" w:semiHidden="1" w:unhideWhenUsed="1"/>
+    <w:lsdException w:name="index heading" w:semiHidden="1" w:unhideWhenUsed="1"/>
+    <w:lsdException w:name="caption" w:semiHidden="1" w:uiPriority="35" w:unhideWhenUsed="1" w:qFormat="1"/>
+    <w:lsdException w:name="table of figures" w:semiHidden="1" w:unhideWhenUsed="1"/>
+    <w:lsdException w:name="envelope address" w:semiHidden="1" w:unhideWhenUsed="1"/>
+    <w:lsdException w:name="envelope return" w:semiHidden="1" w:unhideWhenUsed="1"/>
+    <w:lsdException w:name="footnote reference" w:semiHidden="1" w:unhideWhenUsed="1"/>
+    <w:lsdException w:name="annotation reference" w:semiHidden="1" w:unhideWhenUsed="1"/>
+    <w:lsdException w:name="line number" w:semiHidden="1" w:unhideWhenUsed="1"/>
+    <w:lsdException w:name="page number" w:semiHidden="1" w:unhideWhenUsed="1"/>
+    <w:lsdException w:name="endnote reference" w:semiHidden="1" w:unhideWhenUsed="1"/>
+    <w:lsdException w:name="endnote text" w:semiHidden="1" w:unhideWhenUsed="1"/>
+    <w:lsdException w:name="table of authorities" w:semiHidden="1" w:unhideWhenUsed="1"/>
+    <w:lsdException w:name="macro" w:semiHidden="1" w:unhideWhenUsed="1"/>
+    <w:lsdException w:name="toa heading" w:semiHidden="1" w:unhideWhenUsed="1"/>
+    <w:lsdException w:name="List" w:semiHidden="1" w:unhideWhenUsed="1"/>
+    <w:lsdException w:name="List Bullet" w:semiHidden="1" w:unhideWhenUsed="1"/>
+    <w:lsdException w:name="List Number" w:semiHidden="1" w:unhideWhenUsed="1"/>
+    <w:lsdException w:name="List 2" w:semiHidden="1" w:unhideWhenUsed="1"/>
+    <w:lsdException w:name="List 3" w:semiHidden="1" w:unhideWhenUsed="1"/>
+    <w:lsdException w:name="List 4" w:semiHidden="1" w:unhideWhenUsed="1"/>
+    <w:lsdException w:name="List 5" w:semiHidden="1" w:unhideWhenUsed="1"/>
+    <w:lsdException w:name="List Bullet 2" w:semiHidden="1" w:unhideWhenUsed="1"/>
+    <w:lsdException w:name="List Bullet 3" w:semiHidden="1" w:unhideWhenUsed="1"/>
+    <w:lsdException w:name="List Bullet 4" w:semiHidden="1" w:unhideWhenUsed="1"/>
+    <w:lsdException w:name="List Bullet 5" w:semiHidden="1" w:unhideWhenUsed="1"/>
+    <w:lsdException w:name="List Number 2" w:semiHidden="1" w:unhideWhenUsed="1"/>
+    <w:lsdException w:name="List Number 3" w:semiHidden="1" w:unhideWhenUsed="1"/>
+    <w:lsdException w:name="List Number 4" w:semiHidden="1" w:unhideWhenUsed="1"/>
+    <w:lsdException w:name="List Number 5" w:semiHidden="1" w:unhideWhenUsed="1"/>
+    <w:lsdException w:name="Title" w:uiPriority="10" w:qFormat="1"/>
+    <w:lsdException w:name="Closing" w:semiHidden="1" w:unhideWhenUsed="1"/>
+    <w:lsdException w:name="Signature" w:semiHidden="1" w:unhideWhenUsed="1"/>
+    <w:lsdException w:name="Default Paragraph Font" w:semiHidden="1" w:uiPriority="1" w:unhideWhenUsed="1"/>
+    <w:lsdException w:name="Body Text" w:semiHidden="1" w:unhideWhenUsed="1"/>
+    <w:lsdException w:name="Body Text Indent" w:semiHidden="1" w:unhideWhenUsed="1"/>
+    <w:lsdException w:name="List Continue" w:semiHidden="1" w:unhideWhenUsed="1"/>
+    <w:lsdException w:name="List Continue 2" w:semiHidden="1" w:unhideWhenUsed="1"/>
+    <w:lsdException w:name="List Continue 3" w:semiHidden="1" w:unhideWhenUsed="1"/>
+    <w:lsdException w:name="List Continue 4" w:semiHidden="1" w:unhideWhenUsed="1"/>
+    <w:lsdException w:name="List Continue 5" w:semiHidden="1" w:unhideWhenUsed="1"/>
+    <w:lsdException w:name="Message Header" w:semiHidden="1" w:unhideWhenUsed="1"/>
+    <w:lsdException w:name="Subtitle" w:uiPriority="11" w:qFormat="1"/>
+    <w:lsdException w:name="Salutation" w:semiHidden="1" w:unhideWhenUsed="1"/>
+    <w:lsdException w:name="Date" w:semiHidden="1" w:unhideWhenUsed="1"/>
+    <w:lsdException w:name="Body Text First Indent" w:semiHidden="1" w:unhideWhenUsed="1"/>
+    <w:lsdException w:name="Body Text First Indent 2" w:semiHidden="1" w:unhideWhenUsed="1"/>
+    <w:lsdException w:name="Note Heading" w:semiHidden="1" w:unhideWhenUsed="1"/>
+    <w:lsdException w:name="Body Text 2" w:semiHidden="1" w:uiPriority="0" w:unhideWhenUsed="1"/>
+    <w:lsdException w:name="Body Text 3" w:semiHidden="1" w:unhideWhenUsed="1"/>
+    <w:lsdException w:name="Body Text Indent 2" w:semiHidden="1" w:unhideWhenUsed="1"/>
+    <w:lsdException w:name="Body Text Indent 3" w:semiHidden="1" w:unhideWhenUsed="1"/>
+    <w:lsdException w:name="Block Text" w:semiHidden="1" w:unhideWhenUsed="1"/>
+    <w:lsdException w:name="Hyperlink" w:semiHidden="1" w:unhideWhenUsed="1"/>
+    <w:lsdException w:name="FollowedHyperlink" w:semiHidden="1" w:unhideWhenUsed="1"/>
+    <w:lsdException w:name="Strong" w:uiPriority="22" w:qFormat="1"/>
+    <w:lsdException w:name="Emphasis" w:uiPriority="20" w:qFormat="1"/>
+    <w:lsdException w:name="Document Map" w:semiHidden="1" w:unhideWhenUsed="1"/>
+    <w:lsdException w:name="Plain Text" w:semiHidden="1" w:unhideWhenUsed="1"/>
+    <w:lsdException w:name="E-mail Signature" w:semiHidden="1" w:unhideWhenUsed="1"/>
+    <w:lsdException w:name="HTML Top of Form" w:semiHidden="1" w:unhideWhenUsed="1"/>
+    <w:lsdException w:name="HTML Bottom of Form" w:semiHidden="1" w:unhideWhenUsed="1"/>
+    <w:lsdException w:name="Normal (Web)" w:semiHidden="1" w:unhideWhenUsed="1"/>
+    <w:lsdException w:name="HTML Acronym" w:semiHidden="1" w:unhideWhenUsed="1"/>
+    <w:lsdException w:name="HTML Address" w:semiHidden="1" w:unhideWhenUsed="1"/>
+    <w:lsdException w:name="HTML Cite" w:semiHidden="1" w:unhideWhenUsed="1"/>
+    <w:lsdException w:name="HTML Code" w:semiHidden="1" w:unhideWhenUsed="1"/>
+    <w:lsdException w:name="HTML Definition" w:semiHidden="1" w:unhideWhenUsed="1"/>
+    <w:lsdException w:name="HTML Keyboard" w:semiHidden="1" w:unhideWhenUsed="1"/>
+    <w:lsdException w:name="HTML Preformatted" w:semiHidden="1" w:unhideWhenUsed="1"/>
+    <w:lsdException w:name="HTML Sample" w:semiHidden="1" w:unhideWhenUsed="1"/>
+    <w:lsdException w:name="HTML Typewriter" w:semiHidden="1" w:unhideWhenUsed="1"/>
+    <w:lsdException w:name="HTML Variable" w:semiHidden="1" w:unhideWhenUsed="1"/>
+    <w:lsdException w:name="Normal Table" w:semiHidden="1" w:unhideWhenUsed="1"/>
+    <w:lsdException w:name="annotation subject" w:semiHidden="1" w:unhideWhenUsed="1"/>
+    <w:lsdException w:name="No List" w:semiHidden="1" w:unhideWhenUsed="1"/>
+    <w:lsdException w:name="Outline List 1" w:semiHidden="1" w:unhideWhenUsed="1"/>
+    <w:lsdException w:name="Outline List 2" w:semiHidden="1" w:unhideWhenUsed="1"/>
+    <w:lsdException w:name="Outline List 3" w:semiHidden="1" w:unhideWhenUsed="1"/>
+    <w:lsdException w:name="Table Simple 1" w:semiHidden="1" w:unhideWhenUsed="1"/>
+    <w:lsdException w:name="Table Simple 2" w:semiHidden="1" w:unhideWhenUsed="1"/>
+    <w:lsdException w:name="Table Simple 3" w:semiHidden="1" w:unhideWhenUsed="1"/>
+    <w:lsdException w:name="Table Classic 1" w:semiHidden="1" w:unhideWhenUsed="1"/>
+    <w:lsdException w:name="Table Classic 2" w:semiHidden="1" w:unhideWhenUsed="1"/>
+    <w:lsdException w:name="Table Classic 3" w:semiHidden="1" w:unhideWhenUsed="1"/>
+    <w:lsdException w:name="Table Classic 4" w:semiHidden="1" w:unhideWhenUsed="1"/>
+    <w:lsdException w:name="Table Colorful 1" w:semiHidden="1" w:unhideWhenUsed="1"/>
+    <w:lsdException w:name="Table Colorful 2" w:semiHidden="1" w:unhideWhenUsed="1"/>
+    <w:lsdException w:name="Table Colorful 3" w:semiHidden="1" w:unhideWhenUsed="1"/>
+    <w:lsdException w:name="Table Columns 1" w:semiHidden="1" w:unhideWhenUsed="1"/>
+    <w:lsdException w:name="Table Columns 2" w:semiHidden="1" w:unhideWhenUsed="1"/>
+    <w:lsdException w:name="Table Columns 3" w:semiHidden="1" w:unhideWhenUsed="1"/>
+    <w:lsdException w:name="Table Columns 4" w:semiHidden="1" w:unhideWhenUsed="1"/>
+    <w:lsdException w:name="Table Columns 5" w:semiHidden="1" w:unhideWhenUsed="1"/>
+    <w:lsdException w:name="Table Grid 1" w:semiHidden="1" w:unhideWhenUsed="1"/>
+    <w:lsdException w:name="Table Grid 2" w:semiHidden="1" w:unhideWhenUsed="1"/>
+    <w:lsdException w:name="Table Grid 3" w:semiHidden="1" w:unhideWhenUsed="1"/>
+    <w:lsdException w:name="Table Grid 4" w:semiHidden="1" w:unhideWhenUsed="1"/>
+    <w:lsdException w:name="Table Grid 5" w:semiHidden="1" w:unhideWhenUsed="1"/>
+    <w:lsdException w:name="Table Grid 6" w:semiHidden="1" w:unhideWhenUsed="1"/>
+    <w:lsdException w:name="Table Grid 7" w:semiHidden="1" w:unhideWhenUsed="1"/>
+    <w:lsdException w:name="Table Grid 8" w:semiHidden="1" w:unhideWhenUsed="1"/>
+    <w:lsdException w:name="Table List 1" w:semiHidden="1" w:unhideWhenUsed="1"/>
+    <w:lsdException w:name="Table List 2" w:semiHidden="1" w:unhideWhenUsed="1"/>
+    <w:lsdException w:name="Table List 3" w:semiHidden="1" w:unhideWhenUsed="1"/>
+    <w:lsdException w:name="Table List 4" w:semiHidden="1" w:unhideWhenUsed="1"/>
+    <w:lsdException w:name="Table List 5" w:semiHidden="1" w:unhideWhenUsed="1"/>
+    <w:lsdException w:name="Table List 6" w:semiHidden="1" w:unhideWhenUsed="1"/>
+    <w:lsdException w:name="Table List 7" w:semiHidden="1" w:unhideWhenUsed="1"/>
+    <w:lsdException w:name="Table List 8" w:semiHidden="1" w:unhideWhenUsed="1"/>
+    <w:lsdException w:name="Table 3D effects 1" w:semiHidden="1" w:unhideWhenUsed="1"/>
+    <w:lsdException w:name="Table 3D effects 2" w:semiHidden="1" w:unhideWhenUsed="1"/>
+    <w:lsdException w:name="Table 3D effects 3" w:semiHidden="1" w:unhideWhenUsed="1"/>
+    <w:lsdException w:name="Table Contemporary" w:semiHidden="1" w:unhideWhenUsed="1"/>
+    <w:lsdException w:name="Table Elegant" w:semiHidden="1" w:unhideWhenUsed="1"/>
+    <w:lsdException w:name="Table Professional" w:semiHidden="1" w:unhideWhenUsed="1"/>
+    <w:lsdException w:name="Table Subtle 1" w:semiHidden="1" w:unhideWhenUsed="1"/>
+    <w:lsdException w:name="Table Subtle 2" w:semiHidden="1" w:unhideWhenUsed="1"/>
+    <w:lsdException w:name="Table Web 1" w:semiHidden="1" w:unhideWhenUsed="1"/>
+    <w:lsdException w:name="Table Web 2" w:semiHidden="1" w:unhideWhenUsed="1"/>
+    <w:lsdException w:name="Table Web 3" w:semiHidden="1" w:unhideWhenUsed="1"/>
+    <w:lsdException w:name="Balloon Text" w:semiHidden="1" w:unhideWhenUsed="1"/>
+    <w:lsdException w:name="Table Grid" w:uiPriority="59"/>
+    <w:lsdException w:name="Table Theme" w:semiHidden="1" w:unhideWhenUsed="1"/>
+    <w:lsdException w:name="Placeholder Text" w:semiHidden="1"/>
+    <w:lsdException w:name="No Spacing" w:uiPriority="1" w:qFormat="1"/>
+    <w:lsdException w:name="Light Shading" w:uiPriority="60"/>
+    <w:lsdException w:name="Light List" w:uiPriority="61"/>
+    <w:lsdException w:name="Light Grid" w:uiPriority="62"/>
+    <w:lsdException w:name="Medium Shading 1" w:uiPriority="63"/>
+    <w:lsdException w:name="Medium Shading 2" w:uiPriority="64"/>
+    <w:lsdException w:name="Medium List 1" w:uiPriority="65"/>
+    <w:lsdException w:name="Medium List 2" w:uiPriority="66"/>
+    <w:lsdException w:name="Medium Grid 1" w:uiPriority="67"/>
+    <w:lsdException w:name="Medium Grid 2" w:uiPriority="68"/>
+    <w:lsdException w:name="Medium Grid 3" w:uiPriority="69"/>
+    <w:lsdException w:name="Dark List" w:uiPriority="70"/>
+    <w:lsdException w:name="Colorful Shading" w:uiPriority="71"/>
+    <w:lsdException w:name="Colorful List" w:uiPriority="72"/>
+    <w:lsdException w:name="Colorful Grid" w:uiPriority="73"/>
+    <w:lsdException w:name="Light Shading Accent 1" w:uiPriority="60"/>
+    <w:lsdException w:name="Light List Accent 1" w:uiPriority="61"/>
+    <w:lsdException w:name="Light Grid Accent 1" w:uiPriority="62"/>
+    <w:lsdException w:name="Medium Shading 1 Accent 1" w:uiPriority="63"/>
+    <w:lsdException w:name="Medium Shading 2 Accent 1" w:uiPriority="64"/>
+    <w:lsdException w:name="Medium List 1 Accent 1" w:uiPriority="65"/>
+    <w:lsdException w:name="Revision" w:semiHidden="1"/>
+    <w:lsdException w:name="List Paragraph" w:uiPriority="34" w:qFormat="1"/>
+    <w:lsdException w:name="Quote" w:uiPriority="29" w:qFormat="1"/>
+    <w:lsdException w:name="Intense Quote" w:uiPriority="30" w:qFormat="1"/>
+    <w:lsdException w:name="Medium List 2 Accent 1" w:uiPriority="66"/>
+    <w:lsdException w:name="Medium Grid 1 Accent 1" w:uiPriority="67"/>
+    <w:lsdException w:name="Medium Grid 2 Accent 1" w:uiPriority="68"/>
+    <w:lsdException w:name="Medium Grid 3 Accent 1" w:uiPriority="69"/>
+    <w:lsdException w:name="Dark List Accent 1" w:uiPriority="70"/>
+    <w:lsdException w:name="Colorful Shading Accent 1" w:uiPriority="71"/>
+    <w:lsdException w:name="Colorful List Accent 1" w:uiPriority="72"/>
+    <w:lsdException w:name="Colorful Grid Accent 1" w:uiPriority="73"/>
+    <w:lsdException w:name="Light Shading Accent 2" w:uiPriority="60"/>
+    <w:lsdException w:name="Light List Accent 2" w:uiPriority="61"/>
+    <w:lsdException w:name="Light Grid Accent 2" w:uiPriority="62"/>
+    <w:lsdException w:name="Medium Shading 1 Accent 2" w:uiPriority="63"/>
+    <w:lsdException w:name="Medium Shading 2 Accent 2" w:uiPriority="64"/>
+    <w:lsdException w:name="Medium List 1 Accent 2" w:uiPriority="65"/>
+    <w:lsdException w:name="Medium List 2 Accent 2" w:uiPriority="66"/>
+    <w:lsdException w:name="Medium Grid 1 Accent 2" w:uiPriority="67"/>
+    <w:lsdException w:name="Medium Grid 2 Accent 2" w:uiPriority="68"/>
+    <w:lsdException w:name="Medium Grid 3 Accent 2" w:uiPriority="69"/>
+    <w:lsdException w:name="Dark List Accent 2" w:uiPriority="70"/>
+    <w:lsdException w:name="Colorful Shading Accent 2" w:uiPriority="71"/>
+    <w:lsdException w:name="Colorful List Accent 2" w:uiPriority="72"/>
+    <w:lsdException w:name="Colorful Grid Accent 2" w:uiPriority="73"/>
+    <w:lsdException w:name="Light Shading Accent 3" w:uiPriority="60"/>
+    <w:lsdException w:name="Light List Accent 3" w:uiPriority="61"/>
+    <w:lsdException w:name="Light Grid Accent 3" w:uiPriority="62"/>
+    <w:lsdException w:name="Medium Shading 1 Accent 3" w:uiPriority="63"/>
+    <w:lsdException w:name="Medium Shading 2 Accent 3" w:uiPriority="64"/>
+    <w:lsdException w:name="Medium List 1 Accent 3" w:uiPriority="65"/>
+    <w:lsdException w:name="Medium List 2 Accent 3" w:uiPriority="66"/>
+    <w:lsdException w:name="Medium Grid 1 Accent 3" w:uiPriority="67"/>
+    <w:lsdException w:name="Medium Grid 2 Accent 3" w:uiPriority="68"/>
+    <w:lsdException w:name="Medium Grid 3 Accent 3" w:uiPriority="69"/>
+    <w:lsdException w:name="Dark List Accent 3" w:uiPriority="70"/>
+    <w:lsdException w:name="Colorful Shading Accent 3" w:uiPriority="71"/>
+    <w:lsdException w:name="Colorful List Accent 3" w:uiPriority="72"/>
+    <w:lsdException w:name="Colorful Grid Accent 3" w:uiPriority="73"/>
+    <w:lsdException w:name="Light Shading Accent 4" w:uiPriority="60"/>
+    <w:lsdException w:name="Light List Accent 4" w:uiPriority="61"/>
+    <w:lsdException w:name="Light Grid Accent 4" w:uiPriority="62"/>
+    <w:lsdException w:name="Medium Shading 1 Accent 4" w:uiPriority="63"/>
+    <w:lsdException w:name="Medium Shading 2 Accent 4" w:uiPriority="64"/>
+    <w:lsdException w:name="Medium List 1 Accent 4" w:uiPriority="65"/>
+    <w:lsdException w:name="Medium List 2 Accent 4" w:uiPriority="66"/>
+    <w:lsdException w:name="Medium Grid 1 Accent 4" w:uiPriority="67"/>
+    <w:lsdException w:name="Medium Grid 2 Accent 4" w:uiPriority="68"/>
+    <w:lsdException w:name="Medium Grid 3 Accent 4" w:uiPriority="69"/>
+    <w:lsdException w:name="Dark List Accent 4" w:uiPriority="70"/>
+    <w:lsdException w:name="Colorful Shading Accent 4" w:uiPriority="71"/>
+    <w:lsdException w:name="Colorful List Accent 4" w:uiPriority="72"/>
+    <w:lsdException w:name="Colorful Grid Accent 4" w:uiPriority="73"/>
+    <w:lsdException w:name="Light Shading Accent 5" w:uiPriority="60"/>
+    <w:lsdException w:name="Light List Accent 5" w:uiPriority="61"/>
+    <w:lsdException w:name="Light Grid Accent 5" w:uiPriority="62"/>
+    <w:lsdException w:name="Medium Shading 1 Accent 5" w:uiPriority="63"/>
+    <w:lsdException w:name="Medium Shading 2 Accent 5" w:uiPriority="64"/>
+    <w:lsdException w:name="Medium List 1 Accent 5" w:uiPriority="65"/>
+    <w:lsdException w:name="Medium List 2 Accent 5" w:uiPriority="66"/>
+    <w:lsdException w:name="Medium Grid 1 Accent 5" w:uiPriority="67"/>
+    <w:lsdException w:name="Medium Grid 2 Accent 5" w:uiPriority="68"/>
+    <w:lsdException w:name="Medium Grid 3 Accent 5" w:uiPriority="69"/>
+    <w:lsdException w:name="Dark List Accent 5" w:uiPriority="70"/>
+    <w:lsdException w:name="Colorful Shading Accent 5" w:uiPriority="71"/>
+    <w:lsdException w:name="Colorful List Accent 5" w:uiPriority="72"/>
+    <w:lsdException w:name="Colorful Grid Accent 5" w:uiPriority="73"/>
+    <w:lsdException w:name="Light Shading Accent 6" w:uiPriority="60"/>
+    <w:lsdException w:name="Light List Accent 6" w:uiPriority="61"/>
+    <w:lsdException w:name="Light Grid Accent 6" w:uiPriority="62"/>
+    <w:lsdException w:name="Medium Shading 1 Accent 6" w:uiPriority="63"/>
+    <w:lsdException w:name="Medium Shading 2 Accent 6" w:uiPriority="64"/>
+    <w:lsdException w:name="Medium List 1 Accent 6" w:uiPriority="65"/>
+    <w:lsdException w:name="Medium List 2 Accent 6" w:uiPriority="66"/>
+    <w:lsdException w:name="Medium Grid 1 Accent 6" w:uiPriority="67"/>
+    <w:lsdException w:name="Medium Grid 2 Accent 6" w:uiPriority="68"/>
+    <w:lsdException w:name="Medium Grid 3 Accent 6" w:uiPriority="69"/>
+    <w:lsdException w:name="Dark List Accent 6" w:uiPriority="70"/>
+    <w:lsdException w:name="Colorful Shading Accent 6" w:uiPriority="71"/>
+    <w:lsdException w:name="Colorful List Accent 6" w:uiPriority="72"/>
+    <w:lsdException w:name="Colorful Grid Accent 6" w:uiPriority="73"/>
+    <w:lsdException w:name="Subtle Emphasis" w:uiPriority="19" w:qFormat="1"/>
+    <w:lsdException w:name="Intense Emphasis" w:uiPriority="21" w:qFormat="1"/>
+    <w:lsdException w:name="Subtle Reference" w:uiPriority="31" w:qFormat="1"/>
+    <w:lsdException w:name="Intense Reference" w:uiPriority="32" w:qFormat="1"/>
+    <w:lsdException w:name="Book Title" w:uiPriority="33" w:qFormat="1"/>
+    <w:lsdException w:name="Bibliography" w:semiHidden="1" w:uiPriority="37" w:unhideWhenUsed="1"/>
+    <w:lsdException w:name="TOC Heading" w:semiHidden="1" w:uiPriority="39" w:unhideWhenUsed="1" w:qFormat="1"/>
+    <w:lsdException w:name="Plain Table 1" w:uiPriority="41"/>
+    <w:lsdException w:name="Plain Table 2" w:uiPriority="42"/>
+    <w:lsdException w:name="Plain Table 3" w:uiPriority="43"/>
+    <w:lsdException w:name="Plain Table 4" w:uiPriority="44"/>
+    <w:lsdException w:name="Plain Table 5" w:uiPriority="45"/>
+    <w:lsdException w:name="Grid Table Light" w:uiPriority="40"/>
+    <w:lsdException w:name="Grid Table 1 Light" w:uiPriority="46"/>
+    <w:lsdException w:name="Grid Table 2" w:uiPriority="47"/>
+    <w:lsdException w:name="Grid Table 3" w:uiPriority="48"/>
+    <w:lsdException w:name="Grid Table 4" w:uiPriority="49"/>
+    <w:lsdException w:name="Grid Table 5 Dark" w:uiPriority="50"/>
+    <w:lsdException w:name="Grid Table 6 Colorful" w:uiPriority="51"/>
+    <w:lsdException w:name="Grid Table 7 Colorful" w:uiPriority="52"/>
+    <w:lsdException w:name="Grid Table 1 Light Accent 1" w:uiPriority="46"/>
+    <w:lsdException w:name="Grid Table 2 Accent 1" w:uiPriority="47"/>
+    <w:lsdException w:name="Grid Table 3 Accent 1" w:uiPriority="48"/>
+    <w:lsdException w:name="Grid Table 4 Accent 1" w:uiPriority="49"/>
+    <w:lsdException w:name="Grid Table 5 Dark Accent 1" w:uiPriority="50"/>
+    <w:lsdException w:name="Grid Table 6 Colorful Accent 1" w:uiPriority="51"/>
+    <w:lsdException w:name="Grid Table 7 Colorful Accent 1" w:uiPriority="52"/>
+    <w:lsdException w:name="Grid Table 1 Light Accent 2" w:uiPriority="46"/>
+    <w:lsdException w:name="Grid Table 2 Accent 2" w:uiPriority="47"/>
+    <w:lsdException w:name="Grid Table 3 Accent 2" w:uiPriority="48"/>
+    <w:lsdException w:name="Grid Table 4 Accent 2" w:uiPriority="49"/>
+    <w:lsdException w:name="Grid Table 5 Dark Accent 2" w:uiPriority="50"/>
+    <w:lsdException w:name="Grid Table 6 Colorful Accent 2" w:uiPriority="51"/>
+    <w:lsdException w:name="Grid Table 7 Colorful Accent 2" w:uiPriority="52"/>
+    <w:lsdException w:name="Grid Table 1 Light Accent 3" w:uiPriority="46"/>
+    <w:lsdException w:name="Grid Table 2 Accent 3" w:uiPriority="47"/>
+    <w:lsdException w:name="Grid Table 3 Accent 3" w:uiPriority="48"/>
+    <w:lsdException w:name="Grid Table 4 Accent 3" w:uiPriority="49"/>
+    <w:lsdException w:name="Grid Table 5 Dark Accent 3" w:uiPriority="50"/>
+    <w:lsdException w:name="Grid Table 6 Colorful Accent 3" w:uiPriority="51"/>
+    <w:lsdException w:name="Grid Table 7 Colorful Accent 3" w:uiPriority="52"/>
+    <w:lsdException w:name="Grid Table 1 Light Accent 4" w:uiPriority="46"/>
+    <w:lsdException w:name="Grid Table 2 Accent 4" w:uiPriority="47"/>
+    <w:lsdException w:name="Grid Table 3 Accent 4" w:uiPriority="48"/>
+    <w:lsdException w:name="Grid Table 4 Accent 4" w:uiPriority="49"/>
+    <w:lsdException w:name="Grid Table 5 Dark Accent 4" w:uiPriority="50"/>
+    <w:lsdException w:name="Grid Table 6 Colorful Accent 4" w:uiPriority="51"/>
+    <w:lsdException w:name="Grid Table 7 Colorful Accent 4" w:uiPriority="52"/>
+    <w:lsdException w:name="Grid Table 1 Light Accent 5" w:uiPriority="46"/>
+    <w:lsdException w:name="Grid Table 2 Accent 5" w:uiPriority="47"/>
+    <w:lsdException w:name="Grid Table 3 Accent 5" w:uiPriority="48"/>
+    <w:lsdException w:name="Grid Table 4 Accent 5" w:uiPriority="49"/>
+    <w:lsdException w:name="Grid Table 5 Dark Accent 5" w:uiPriority="50"/>
+    <w:lsdException w:name="Grid Table 6 Colorful Accent 5" w:uiPriority="51"/>
+    <w:lsdException w:name="Grid Table 7 Colorful Accent 5" w:uiPriority="52"/>
+    <w:lsdException w:name="Grid Table 1 Light Accent 6" w:uiPriority="46"/>
+    <w:lsdException w:name="Grid Table 2 Accent 6" w:uiPriority="47"/>
+    <w:lsdException w:name="Grid Table 3 Accent 6" w:uiPriority="48"/>
+    <w:lsdException w:name="Grid Table 4 Accent 6" w:uiPriority="49"/>
+    <w:lsdException w:name="Grid Table 5 Dark Accent 6" w:uiPriority="50"/>
+    <w:lsdException w:name="Grid Table 6 Colorful Accent 6" w:uiPriority="51"/>
+    <w:lsdException w:name="Grid Table 7 Colorful Accent 6" w:uiPriority="52"/>
+    <w:lsdException w:name="List Table 1 Light" w:uiPriority="46"/>
+    <w:lsdException w:name="List Table 2" w:uiPriority="47"/>
+    <w:lsdException w:name="List Table 3" w:uiPriority="48"/>
+    <w:lsdException w:name="List Table 4" w:uiPriority="49"/>
+    <w:lsdException w:name="List Table 5 Dark" w:uiPriority="50"/>
+    <w:lsdException w:name="List Table 6 Colorful" w:uiPriority="51"/>
+    <w:lsdException w:name="List Table 7 Colorful" w:uiPriority="52"/>
+    <w:lsdException w:name="List Table 1 Light Accent 1" w:uiPriority="46"/>
+    <w:lsdException w:name="List Table 2 Accent 1" w:uiPriority="47"/>
+    <w:lsdException w:name="List Table 3 Accent 1" w:uiPriority="48"/>
+    <w:lsdException w:name="List Table 4 Accent 1" w:uiPriority="49"/>
+    <w:lsdException w:name="List Table 5 Dark Accent 1" w:uiPriority="50"/>
+    <w:lsdException w:name="List Table 6 Colorful Accent 1" w:uiPriority="51"/>
+    <w:lsdException w:name="List Table 7 Colorful Accent 1" w:uiPriority="52"/>
+    <w:lsdException w:name="List Table 1 Light Accent 2" w:uiPriority="46"/>
+    <w:lsdException w:name="List Table 2 Accent 2" w:uiPriority="47"/>
+    <w:lsdException w:name="List Table 3 Accent 2" w:uiPriority="48"/>
+    <w:lsdException w:name="List Table 4 Accent 2" w:uiPriority="49"/>
+    <w:lsdException w:name="List Table 5 Dark Accent 2" w:uiPriority="50"/>
+    <w:lsdException w:name="List Table 6 Colorful Accent 2" w:uiPriority="51"/>
+    <w:lsdException w:name="List Table 7 Colorful Accent 2" w:uiPriority="52"/>
+    <w:lsdException w:name="List Table 1 Light Accent 3" w:uiPriority="46"/>
+    <w:lsdException w:name="List Table 2 Accent 3" w:uiPriority="47"/>
+    <w:lsdException w:name="List Table 3 Accent 3" w:uiPriority="48"/>
+    <w:lsdException w:name="List Table 4 Accent 3" w:uiPriority="49"/>
+    <w:lsdException w:name="List Table 5 Dark Accent 3" w:uiPriority="50"/>
+    <w:lsdException w:name="List Table 6 Colorful Accent 3" w:uiPriority="51"/>
+    <w:lsdException w:name="List Table 7 Colorful Accent 3" w:uiPriority="52"/>
+    <w:lsdException w:name="List Table 1 Light Accent 4" w:uiPriority="46"/>
+    <w:lsdException w:name="List Table 2 Accent 4" w:uiPriority="47"/>
+    <w:lsdException w:name="List Table 3 Accent 4" w:uiPriority="48"/>
+    <w:lsdException w:name="List Table 4 Accent 4" w:uiPriority="49"/>
+    <w:lsdException w:name="List Table 5 Dark Accent 4" w:uiPriority="50"/>
+    <w:lsdException w:name="List Table 6 Colorful Accent 4" w:uiPriority="51"/>
+    <w:lsdException w:name="List Table 7 Colorful Accent 4" w:uiPriority="52"/>
+    <w:lsdException w:name="List Table 1 Light Accent 5" w:uiPriority="46"/>
+    <w:lsdException w:name="List Table 2 Accent 5" w:uiPriority="47"/>
+    <w:lsdException w:name="List Table 3 Accent 5" w:uiPriority="48"/>
+    <w:lsdException w:name="List Table 4 Accent 5" w:uiPriority="49"/>
+    <w:lsdException w:name="List Table 5 Dark Accent 5" w:uiPriority="50"/>
+    <w:lsdException w:name="List Table 6 Colorful Accent 5" w:uiPriority="51"/>
+    <w:lsdException w:name="List Table 7 Colorful Accent 5" w:uiPriority="52"/>
+    <w:lsdException w:name="List Table 1 Light Accent 6" w:uiPriority="46"/>
+    <w:lsdException w:name="List Table 2 Accent 6" w:uiPriority="47"/>
+    <w:lsdException w:name="List Table 3 Accent 6" w:uiPriority="48"/>
+    <w:lsdException w:name="List Table 4 Accent 6" w:uiPriority="49"/>
+    <w:lsdException w:name="List Table 5 Dark Accent 6" w:uiPriority="50"/>
+    <w:lsdException w:name="List Table 6 Colorful Accent 6" w:uiPriority="51"/>
+    <w:lsdException w:name="List Table 7 Colorful Accent 6" w:uiPriority="52"/>
+    <w:lsdException w:name="Mention" w:semiHidden="1" w:unhideWhenUsed="1"/>
+    <w:lsdException w:name="Smart Hyperlink" w:semiHidden="1" w:unhideWhenUsed="1"/>
+    <w:lsdException w:name="Hashtag" w:semiHidden="1" w:unhideWhenUsed="1"/>
+    <w:lsdException w:name="Unresolved Mention" w:semiHidden="1" w:unhideWhenUsed="1"/>
+    <w:lsdException w:name="Smart Link" w:semiHidden="1" w:unhideWhenUsed="1"/>
   </w:latentStyles>
   <w:style w:type="paragraph" w:default="1" w:styleId="Normal">
     <w:name w:val="Normal"/>
@@ -5306,7 +5487,6 @@
     <w:uiPriority w:val="59"/>
     <w:rsid w:val="006930BA"/>
     <w:tblPr>
-      <w:tblInd w:w="0" w:type="dxa"/>
       <w:tblBorders>
         <w:top w:val="single" w:sz="4" w:space="0" w:color="auto"/>
         <w:left w:val="single" w:sz="4" w:space="0" w:color="auto"/>
@@ -5315,505 +5495,6 @@
         <w:insideH w:val="single" w:sz="4" w:space="0" w:color="auto"/>
         <w:insideV w:val="single" w:sz="4" w:space="0" w:color="auto"/>
       </w:tblBorders>
-      <w:tblCellMar>
-        <w:top w:w="0" w:type="dxa"/>
-        <w:left w:w="108" w:type="dxa"/>
-        <w:bottom w:w="0" w:type="dxa"/>
-        <w:right w:w="108" w:type="dxa"/>
-      </w:tblCellMar>
-    </w:tblPr>
-  </w:style>
-  <w:style w:type="character" w:customStyle="1" w:styleId="Textoindependiente2Car">
-    <w:name w:val="Texto independiente 2 Car"/>
-    <w:basedOn w:val="Fuentedeprrafopredeter"/>
-    <w:link w:val="Textoindependiente2"/>
-    <w:rsid w:val="00B46B8E"/>
-    <w:rPr>
-      <w:sz w:val="24"/>
-      <w:lang w:val="es-CO"/>
-    </w:rPr>
-  </w:style>
-  <w:style w:type="paragraph" w:styleId="Revisin">
-    <w:name w:val="Revision"/>
-    <w:hidden/>
-    <w:uiPriority w:val="99"/>
-    <w:semiHidden/>
-    <w:rsid w:val="008B7E58"/>
-  </w:style>
-  <w:style w:type="paragraph" w:styleId="Prrafodelista">
-    <w:name w:val="List Paragraph"/>
-    <w:basedOn w:val="Normal"/>
-    <w:uiPriority w:val="34"/>
-    <w:qFormat/>
-    <w:rsid w:val="00043DB2"/>
-    <w:pPr>
-      <w:ind w:left="720"/>
-      <w:contextualSpacing/>
-    </w:pPr>
-  </w:style>
-</w:styles>
-</file>
-
-<file path=word/stylesWithEffects.xml><?xml version="1.0" encoding="utf-8"?>
-<w:styles xmlns:wpc="http://schemas.microsoft.com/office/word/2010/wordprocessingCanvas" xmlns:mc="http://schemas.openxmlformats.org/markup-compatibility/2006" xmlns:o="urn:schemas-microsoft-com:office:office" xmlns:r="http://schemas.openxmlformats.org/officeDocument/2006/relationships" xmlns:m="http://schemas.openxmlformats.org/officeDocument/2006/math" xmlns:v="urn:schemas-microsoft-com:vml" xmlns:wp14="http://schemas.microsoft.com/office/word/2010/wordprocessingDrawing" xmlns:wp="http://schemas.openxmlformats.org/drawingml/2006/wordprocessingDrawing" xmlns:w10="urn:schemas-microsoft-com:office:word" xmlns:w="http://schemas.openxmlformats.org/wordprocessingml/2006/main" xmlns:w14="http://schemas.microsoft.com/office/word/2010/wordml" xmlns:wpg="http://schemas.microsoft.com/office/word/2010/wordprocessingGroup" xmlns:wpi="http://schemas.microsoft.com/office/word/2010/wordprocessingInk" xmlns:wne="http://schemas.microsoft.com/office/word/2006/wordml" xmlns:wps="http://schemas.microsoft.com/office/word/2010/wordprocessingShape" mc:Ignorable="w14 wp14">
-  <w:docDefaults>
-    <w:rPrDefault>
-      <w:rPr>
-        <w:rFonts w:ascii="Times New Roman" w:eastAsia="Times New Roman" w:hAnsi="Times New Roman" w:cs="Times New Roman"/>
-        <w:lang w:val="es-ES" w:eastAsia="es-ES" w:bidi="ar-SA"/>
-      </w:rPr>
-    </w:rPrDefault>
-    <w:pPrDefault/>
-  </w:docDefaults>
-  <w:latentStyles w:defLockedState="0" w:defUIPriority="99" w:defSemiHidden="1" w:defUnhideWhenUsed="1" w:defQFormat="0" w:count="267">
-    <w:lsdException w:name="Normal" w:semiHidden="0" w:uiPriority="0" w:unhideWhenUsed="0" w:qFormat="1"/>
-    <w:lsdException w:name="heading 1" w:semiHidden="0" w:uiPriority="9" w:unhideWhenUsed="0" w:qFormat="1"/>
-    <w:lsdException w:name="heading 2" w:uiPriority="9" w:qFormat="1"/>
-    <w:lsdException w:name="heading 3" w:uiPriority="9" w:qFormat="1"/>
-    <w:lsdException w:name="heading 4" w:uiPriority="9" w:qFormat="1"/>
-    <w:lsdException w:name="heading 5" w:uiPriority="9" w:qFormat="1"/>
-    <w:lsdException w:name="heading 6" w:uiPriority="9" w:qFormat="1"/>
-    <w:lsdException w:name="heading 7" w:uiPriority="9" w:qFormat="1"/>
-    <w:lsdException w:name="heading 8" w:uiPriority="9" w:qFormat="1"/>
-    <w:lsdException w:name="heading 9" w:uiPriority="9" w:qFormat="1"/>
-    <w:lsdException w:name="toc 1" w:uiPriority="39"/>
-    <w:lsdException w:name="toc 2" w:uiPriority="39"/>
-    <w:lsdException w:name="toc 3" w:uiPriority="39"/>
-    <w:lsdException w:name="toc 4" w:uiPriority="39"/>
-    <w:lsdException w:name="toc 5" w:uiPriority="39"/>
-    <w:lsdException w:name="toc 6" w:uiPriority="39"/>
-    <w:lsdException w:name="toc 7" w:uiPriority="39"/>
-    <w:lsdException w:name="toc 8" w:uiPriority="39"/>
-    <w:lsdException w:name="toc 9" w:uiPriority="39"/>
-    <w:lsdException w:name="caption" w:uiPriority="35" w:qFormat="1"/>
-    <w:lsdException w:name="Title" w:semiHidden="0" w:uiPriority="10" w:unhideWhenUsed="0" w:qFormat="1"/>
-    <w:lsdException w:name="Default Paragraph Font" w:uiPriority="1"/>
-    <w:lsdException w:name="Subtitle" w:semiHidden="0" w:uiPriority="11" w:unhideWhenUsed="0" w:qFormat="1"/>
-    <w:lsdException w:name="Body Text 2" w:uiPriority="0"/>
-    <w:lsdException w:name="Strong" w:semiHidden="0" w:uiPriority="22" w:unhideWhenUsed="0" w:qFormat="1"/>
-    <w:lsdException w:name="Emphasis" w:semiHidden="0" w:uiPriority="20" w:unhideWhenUsed="0" w:qFormat="1"/>
-    <w:lsdException w:name="Table Grid" w:semiHidden="0" w:uiPriority="59" w:unhideWhenUsed="0"/>
-    <w:lsdException w:name="Placeholder Text" w:unhideWhenUsed="0"/>
-    <w:lsdException w:name="No Spacing" w:semiHidden="0" w:uiPriority="1" w:unhideWhenUsed="0" w:qFormat="1"/>
-    <w:lsdException w:name="Light Shading" w:semiHidden="0" w:uiPriority="60" w:unhideWhenUsed="0"/>
-    <w:lsdException w:name="Light List" w:semiHidden="0" w:uiPriority="61" w:unhideWhenUsed="0"/>
-    <w:lsdException w:name="Light Grid" w:semiHidden="0" w:uiPriority="62" w:unhideWhenUsed="0"/>
-    <w:lsdException w:name="Medium Shading 1" w:semiHidden="0" w:uiPriority="63" w:unhideWhenUsed="0"/>
-    <w:lsdException w:name="Medium Shading 2" w:semiHidden="0" w:uiPriority="64" w:unhideWhenUsed="0"/>
-    <w:lsdException w:name="Medium List 1" w:semiHidden="0" w:uiPriority="65" w:unhideWhenUsed="0"/>
-    <w:lsdException w:name="Medium List 2" w:semiHidden="0" w:uiPriority="66" w:unhideWhenUsed="0"/>
-    <w:lsdException w:name="Medium Grid 1" w:semiHidden="0" w:uiPriority="67" w:unhideWhenUsed="0"/>
-    <w:lsdException w:name="Medium Grid 2" w:semiHidden="0" w:uiPriority="68" w:unhideWhenUsed="0"/>
-    <w:lsdException w:name="Medium Grid 3" w:semiHidden="0" w:uiPriority="69" w:unhideWhenUsed="0"/>
-    <w:lsdException w:name="Dark List" w:semiHidden="0" w:uiPriority="70" w:unhideWhenUsed="0"/>
-    <w:lsdException w:name="Colorful Shading" w:semiHidden="0" w:uiPriority="71" w:unhideWhenUsed="0"/>
-    <w:lsdException w:name="Colorful List" w:semiHidden="0" w:uiPriority="72" w:unhideWhenUsed="0"/>
-    <w:lsdException w:name="Colorful Grid" w:semiHidden="0" w:uiPriority="73" w:unhideWhenUsed="0"/>
-    <w:lsdException w:name="Light Shading Accent 1" w:semiHidden="0" w:uiPriority="60" w:unhideWhenUsed="0"/>
-    <w:lsdException w:name="Light List Accent 1" w:semiHidden="0" w:uiPriority="61" w:unhideWhenUsed="0"/>
-    <w:lsdException w:name="Light Grid Accent 1" w:semiHidden="0" w:uiPriority="62" w:unhideWhenUsed="0"/>
-    <w:lsdException w:name="Medium Shading 1 Accent 1" w:semiHidden="0" w:uiPriority="63" w:unhideWhenUsed="0"/>
-    <w:lsdException w:name="Medium Shading 2 Accent 1" w:semiHidden="0" w:uiPriority="64" w:unhideWhenUsed="0"/>
-    <w:lsdException w:name="Medium List 1 Accent 1" w:semiHidden="0" w:uiPriority="65" w:unhideWhenUsed="0"/>
-    <w:lsdException w:name="Revision" w:unhideWhenUsed="0"/>
-    <w:lsdException w:name="List Paragraph" w:semiHidden="0" w:uiPriority="34" w:unhideWhenUsed="0" w:qFormat="1"/>
-    <w:lsdException w:name="Quote" w:semiHidden="0" w:uiPriority="29" w:unhideWhenUsed="0" w:qFormat="1"/>
-    <w:lsdException w:name="Intense Quote" w:semiHidden="0" w:uiPriority="30" w:unhideWhenUsed="0" w:qFormat="1"/>
-    <w:lsdException w:name="Medium List 2 Accent 1" w:semiHidden="0" w:uiPriority="66" w:unhideWhenUsed="0"/>
-    <w:lsdException w:name="Medium Grid 1 Accent 1" w:semiHidden="0" w:uiPriority="67" w:unhideWhenUsed="0"/>
-    <w:lsdException w:name="Medium Grid 2 Accent 1" w:semiHidden="0" w:uiPriority="68" w:unhideWhenUsed="0"/>
-    <w:lsdException w:name="Medium Grid 3 Accent 1" w:semiHidden="0" w:uiPriority="69" w:unhideWhenUsed="0"/>
-    <w:lsdException w:name="Dark List Accent 1" w:semiHidden="0" w:uiPriority="70" w:unhideWhenUsed="0"/>
-    <w:lsdException w:name="Colorful Shading Accent 1" w:semiHidden="0" w:uiPriority="71" w:unhideWhenUsed="0"/>
-    <w:lsdException w:name="Colorful List Accent 1" w:semiHidden="0" w:uiPriority="72" w:unhideWhenUsed="0"/>
-    <w:lsdException w:name="Colorful Grid Accent 1" w:semiHidden="0" w:uiPriority="73" w:unhideWhenUsed="0"/>
-    <w:lsdException w:name="Light Shading Accent 2" w:semiHidden="0" w:uiPriority="60" w:unhideWhenUsed="0"/>
-    <w:lsdException w:name="Light List Accent 2" w:semiHidden="0" w:uiPriority="61" w:unhideWhenUsed="0"/>
-    <w:lsdException w:name="Light Grid Accent 2" w:semiHidden="0" w:uiPriority="62" w:unhideWhenUsed="0"/>
-    <w:lsdException w:name="Medium Shading 1 Accent 2" w:semiHidden="0" w:uiPriority="63" w:unhideWhenUsed="0"/>
-    <w:lsdException w:name="Medium Shading 2 Accent 2" w:semiHidden="0" w:uiPriority="64" w:unhideWhenUsed="0"/>
-    <w:lsdException w:name="Medium List 1 Accent 2" w:semiHidden="0" w:uiPriority="65" w:unhideWhenUsed="0"/>
-    <w:lsdException w:name="Medium List 2 Accent 2" w:semiHidden="0" w:uiPriority="66" w:unhideWhenUsed="0"/>
-    <w:lsdException w:name="Medium Grid 1 Accent 2" w:semiHidden="0" w:uiPriority="67" w:unhideWhenUsed="0"/>
-    <w:lsdException w:name="Medium Grid 2 Accent 2" w:semiHidden="0" w:uiPriority="68" w:unhideWhenUsed="0"/>
-    <w:lsdException w:name="Medium Grid 3 Accent 2" w:semiHidden="0" w:uiPriority="69" w:unhideWhenUsed="0"/>
-    <w:lsdException w:name="Dark List Accent 2" w:semiHidden="0" w:uiPriority="70" w:unhideWhenUsed="0"/>
-    <w:lsdException w:name="Colorful Shading Accent 2" w:semiHidden="0" w:uiPriority="71" w:unhideWhenUsed="0"/>
-    <w:lsdException w:name="Colorful List Accent 2" w:semiHidden="0" w:uiPriority="72" w:unhideWhenUsed="0"/>
-    <w:lsdException w:name="Colorful Grid Accent 2" w:semiHidden="0" w:uiPriority="73" w:unhideWhenUsed="0"/>
-    <w:lsdException w:name="Light Shading Accent 3" w:semiHidden="0" w:uiPriority="60" w:unhideWhenUsed="0"/>
-    <w:lsdException w:name="Light List Accent 3" w:semiHidden="0" w:uiPriority="61" w:unhideWhenUsed="0"/>
-    <w:lsdException w:name="Light Grid Accent 3" w:semiHidden="0" w:uiPriority="62" w:unhideWhenUsed="0"/>
-    <w:lsdException w:name="Medium Shading 1 Accent 3" w:semiHidden="0" w:uiPriority="63" w:unhideWhenUsed="0"/>
-    <w:lsdException w:name="Medium Shading 2 Accent 3" w:semiHidden="0" w:uiPriority="64" w:unhideWhenUsed="0"/>
-    <w:lsdException w:name="Medium List 1 Accent 3" w:semiHidden="0" w:uiPriority="65" w:unhideWhenUsed="0"/>
-    <w:lsdException w:name="Medium List 2 Accent 3" w:semiHidden="0" w:uiPriority="66" w:unhideWhenUsed="0"/>
-    <w:lsdException w:name="Medium Grid 1 Accent 3" w:semiHidden="0" w:uiPriority="67" w:unhideWhenUsed="0"/>
-    <w:lsdException w:name="Medium Grid 2 Accent 3" w:semiHidden="0" w:uiPriority="68" w:unhideWhenUsed="0"/>
-    <w:lsdException w:name="Medium Grid 3 Accent 3" w:semiHidden="0" w:uiPriority="69" w:unhideWhenUsed="0"/>
-    <w:lsdException w:name="Dark List Accent 3" w:semiHidden="0" w:uiPriority="70" w:unhideWhenUsed="0"/>
-    <w:lsdException w:name="Colorful Shading Accent 3" w:semiHidden="0" w:uiPriority="71" w:unhideWhenUsed="0"/>
-    <w:lsdException w:name="Colorful List Accent 3" w:semiHidden="0" w:uiPriority="72" w:unhideWhenUsed="0"/>
-    <w:lsdException w:name="Colorful Grid Accent 3" w:semiHidden="0" w:uiPriority="73" w:unhideWhenUsed="0"/>
-    <w:lsdException w:name="Light Shading Accent 4" w:semiHidden="0" w:uiPriority="60" w:unhideWhenUsed="0"/>
-    <w:lsdException w:name="Light List Accent 4" w:semiHidden="0" w:uiPriority="61" w:unhideWhenUsed="0"/>
-    <w:lsdException w:name="Light Grid Accent 4" w:semiHidden="0" w:uiPriority="62" w:unhideWhenUsed="0"/>
-    <w:lsdException w:name="Medium Shading 1 Accent 4" w:semiHidden="0" w:uiPriority="63" w:unhideWhenUsed="0"/>
-    <w:lsdException w:name="Medium Shading 2 Accent 4" w:semiHidden="0" w:uiPriority="64" w:unhideWhenUsed="0"/>
-    <w:lsdException w:name="Medium List 1 Accent 4" w:semiHidden="0" w:uiPriority="65" w:unhideWhenUsed="0"/>
-    <w:lsdException w:name="Medium List 2 Accent 4" w:semiHidden="0" w:uiPriority="66" w:unhideWhenUsed="0"/>
-    <w:lsdException w:name="Medium Grid 1 Accent 4" w:semiHidden="0" w:uiPriority="67" w:unhideWhenUsed="0"/>
-    <w:lsdException w:name="Medium Grid 2 Accent 4" w:semiHidden="0" w:uiPriority="68" w:unhideWhenUsed="0"/>
-    <w:lsdException w:name="Medium Grid 3 Accent 4" w:semiHidden="0" w:uiPriority="69" w:unhideWhenUsed="0"/>
-    <w:lsdException w:name="Dark List Accent 4" w:semiHidden="0" w:uiPriority="70" w:unhideWhenUsed="0"/>
-    <w:lsdException w:name="Colorful Shading Accent 4" w:semiHidden="0" w:uiPriority="71" w:unhideWhenUsed="0"/>
-    <w:lsdException w:name="Colorful List Accent 4" w:semiHidden="0" w:uiPriority="72" w:unhideWhenUsed="0"/>
-    <w:lsdException w:name="Colorful Grid Accent 4" w:semiHidden="0" w:uiPriority="73" w:unhideWhenUsed="0"/>
-    <w:lsdException w:name="Light Shading Accent 5" w:semiHidden="0" w:uiPriority="60" w:unhideWhenUsed="0"/>
-    <w:lsdException w:name="Light List Accent 5" w:semiHidden="0" w:uiPriority="61" w:unhideWhenUsed="0"/>
-    <w:lsdException w:name="Light Grid Accent 5" w:semiHidden="0" w:uiPriority="62" w:unhideWhenUsed="0"/>
-    <w:lsdException w:name="Medium Shading 1 Accent 5" w:semiHidden="0" w:uiPriority="63" w:unhideWhenUsed="0"/>
-    <w:lsdException w:name="Medium Shading 2 Accent 5" w:semiHidden="0" w:uiPriority="64" w:unhideWhenUsed="0"/>
-    <w:lsdException w:name="Medium List 1 Accent 5" w:semiHidden="0" w:uiPriority="65" w:unhideWhenUsed="0"/>
-    <w:lsdException w:name="Medium List 2 Accent 5" w:semiHidden="0" w:uiPriority="66" w:unhideWhenUsed="0"/>
-    <w:lsdException w:name="Medium Grid 1 Accent 5" w:semiHidden="0" w:uiPriority="67" w:unhideWhenUsed="0"/>
-    <w:lsdException w:name="Medium Grid 2 Accent 5" w:semiHidden="0" w:uiPriority="68" w:unhideWhenUsed="0"/>
-    <w:lsdException w:name="Medium Grid 3 Accent 5" w:semiHidden="0" w:uiPriority="69" w:unhideWhenUsed="0"/>
-    <w:lsdException w:name="Dark List Accent 5" w:semiHidden="0" w:uiPriority="70" w:unhideWhenUsed="0"/>
-    <w:lsdException w:name="Colorful Shading Accent 5" w:semiHidden="0" w:uiPriority="71" w:unhideWhenUsed="0"/>
-    <w:lsdException w:name="Colorful List Accent 5" w:semiHidden="0" w:uiPriority="72" w:unhideWhenUsed="0"/>
-    <w:lsdException w:name="Colorful Grid Accent 5" w:semiHidden="0" w:uiPriority="73" w:unhideWhenUsed="0"/>
-    <w:lsdException w:name="Light Shading Accent 6" w:semiHidden="0" w:uiPriority="60" w:unhideWhenUsed="0"/>
-    <w:lsdException w:name="Light List Accent 6" w:semiHidden="0" w:uiPriority="61" w:unhideWhenUsed="0"/>
-    <w:lsdException w:name="Light Grid Accent 6" w:semiHidden="0" w:uiPriority="62" w:unhideWhenUsed="0"/>
-    <w:lsdException w:name="Medium Shading 1 Accent 6" w:semiHidden="0" w:uiPriority="63" w:unhideWhenUsed="0"/>
-    <w:lsdException w:name="Medium Shading 2 Accent 6" w:semiHidden="0" w:uiPriority="64" w:unhideWhenUsed="0"/>
-    <w:lsdException w:name="Medium List 1 Accent 6" w:semiHidden="0" w:uiPriority="65" w:unhideWhenUsed="0"/>
-    <w:lsdException w:name="Medium List 2 Accent 6" w:semiHidden="0" w:uiPriority="66" w:unhideWhenUsed="0"/>
-    <w:lsdException w:name="Medium Grid 1 Accent 6" w:semiHidden="0" w:uiPriority="67" w:unhideWhenUsed="0"/>
-    <w:lsdException w:name="Medium Grid 2 Accent 6" w:semiHidden="0" w:uiPriority="68" w:unhideWhenUsed="0"/>
-    <w:lsdException w:name="Medium Grid 3 Accent 6" w:semiHidden="0" w:uiPriority="69" w:unhideWhenUsed="0"/>
-    <w:lsdException w:name="Dark List Accent 6" w:semiHidden="0" w:uiPriority="70" w:unhideWhenUsed="0"/>
-    <w:lsdException w:name="Colorful Shading Accent 6" w:semiHidden="0" w:uiPriority="71" w:unhideWhenUsed="0"/>
-    <w:lsdException w:name="Colorful List Accent 6" w:semiHidden="0" w:uiPriority="72" w:unhideWhenUsed="0"/>
-    <w:lsdException w:name="Colorful Grid Accent 6" w:semiHidden="0" w:uiPriority="73" w:unhideWhenUsed="0"/>
-    <w:lsdException w:name="Subtle Emphasis" w:semiHidden="0" w:uiPriority="19" w:unhideWhenUsed="0" w:qFormat="1"/>
-    <w:lsdException w:name="Intense Emphasis" w:semiHidden="0" w:uiPriority="21" w:unhideWhenUsed="0" w:qFormat="1"/>
-    <w:lsdException w:name="Subtle Reference" w:semiHidden="0" w:uiPriority="31" w:unhideWhenUsed="0" w:qFormat="1"/>
-    <w:lsdException w:name="Intense Reference" w:semiHidden="0" w:uiPriority="32" w:unhideWhenUsed="0" w:qFormat="1"/>
-    <w:lsdException w:name="Book Title" w:semiHidden="0" w:uiPriority="33" w:unhideWhenUsed="0" w:qFormat="1"/>
-    <w:lsdException w:name="Bibliography" w:uiPriority="37"/>
-    <w:lsdException w:name="TOC Heading" w:uiPriority="39" w:qFormat="1"/>
-  </w:latentStyles>
-  <w:style w:type="paragraph" w:default="1" w:styleId="Normal">
-    <w:name w:val="Normal"/>
-    <w:pPr>
-      <w:suppressAutoHyphens/>
-      <w:autoSpaceDN w:val="0"/>
-      <w:textAlignment w:val="baseline"/>
-    </w:pPr>
-  </w:style>
-  <w:style w:type="paragraph" w:styleId="Ttulo1">
-    <w:name w:val="heading 1"/>
-    <w:basedOn w:val="Normal"/>
-    <w:next w:val="Normal"/>
-    <w:pPr>
-      <w:keepNext/>
-      <w:outlineLvl w:val="0"/>
-    </w:pPr>
-    <w:rPr>
-      <w:sz w:val="24"/>
-      <w:lang w:val="es-CO"/>
-    </w:rPr>
-  </w:style>
-  <w:style w:type="paragraph" w:styleId="Ttulo2">
-    <w:name w:val="heading 2"/>
-    <w:basedOn w:val="Normal"/>
-    <w:next w:val="Normal"/>
-    <w:pPr>
-      <w:keepNext/>
-      <w:jc w:val="center"/>
-      <w:outlineLvl w:val="1"/>
-    </w:pPr>
-    <w:rPr>
-      <w:sz w:val="24"/>
-      <w:lang w:val="es-CO"/>
-    </w:rPr>
-  </w:style>
-  <w:style w:type="paragraph" w:styleId="Ttulo3">
-    <w:name w:val="heading 3"/>
-    <w:basedOn w:val="Normal"/>
-    <w:next w:val="Normal"/>
-    <w:pPr>
-      <w:keepNext/>
-      <w:spacing w:line="480" w:lineRule="auto"/>
-      <w:jc w:val="center"/>
-      <w:outlineLvl w:val="2"/>
-    </w:pPr>
-    <w:rPr>
-      <w:b/>
-      <w:sz w:val="32"/>
-      <w:lang w:val="es-CO"/>
-    </w:rPr>
-  </w:style>
-  <w:style w:type="paragraph" w:styleId="Ttulo4">
-    <w:name w:val="heading 4"/>
-    <w:basedOn w:val="Normal"/>
-    <w:next w:val="Normal"/>
-    <w:pPr>
-      <w:keepNext/>
-      <w:spacing w:line="480" w:lineRule="auto"/>
-      <w:jc w:val="center"/>
-      <w:outlineLvl w:val="3"/>
-    </w:pPr>
-    <w:rPr>
-      <w:b/>
-      <w:sz w:val="24"/>
-      <w:lang w:val="es-CO"/>
-    </w:rPr>
-  </w:style>
-  <w:style w:type="paragraph" w:styleId="Ttulo5">
-    <w:name w:val="heading 5"/>
-    <w:basedOn w:val="Normal"/>
-    <w:next w:val="Normal"/>
-    <w:pPr>
-      <w:keepNext/>
-      <w:spacing w:line="480" w:lineRule="auto"/>
-      <w:outlineLvl w:val="4"/>
-    </w:pPr>
-    <w:rPr>
-      <w:b/>
-      <w:sz w:val="24"/>
-      <w:lang w:val="es-CO"/>
-    </w:rPr>
-  </w:style>
-  <w:style w:type="character" w:default="1" w:styleId="Fuentedeprrafopredeter">
-    <w:name w:val="Default Paragraph Font"/>
-    <w:uiPriority w:val="1"/>
-    <w:semiHidden/>
-    <w:unhideWhenUsed/>
-  </w:style>
-  <w:style w:type="table" w:default="1" w:styleId="Tablanormal">
-    <w:name w:val="Normal Table"/>
-    <w:uiPriority w:val="99"/>
-    <w:semiHidden/>
-    <w:unhideWhenUsed/>
-    <w:tblPr>
-      <w:tblInd w:w="0" w:type="dxa"/>
-      <w:tblCellMar>
-        <w:top w:w="0" w:type="dxa"/>
-        <w:left w:w="108" w:type="dxa"/>
-        <w:bottom w:w="0" w:type="dxa"/>
-        <w:right w:w="108" w:type="dxa"/>
-      </w:tblCellMar>
-    </w:tblPr>
-  </w:style>
-  <w:style w:type="numbering" w:default="1" w:styleId="Sinlista">
-    <w:name w:val="No List"/>
-    <w:uiPriority w:val="99"/>
-    <w:semiHidden/>
-    <w:unhideWhenUsed/>
-  </w:style>
-  <w:style w:type="paragraph" w:styleId="Textoindependiente">
-    <w:name w:val="Body Text"/>
-    <w:basedOn w:val="Normal"/>
-    <w:pPr>
-      <w:spacing w:line="480" w:lineRule="auto"/>
-    </w:pPr>
-    <w:rPr>
-      <w:sz w:val="24"/>
-      <w:lang w:val="es-CO"/>
-    </w:rPr>
-  </w:style>
-  <w:style w:type="paragraph" w:styleId="Textoindependiente2">
-    <w:name w:val="Body Text 2"/>
-    <w:basedOn w:val="Normal"/>
-    <w:link w:val="Textoindependiente2Car"/>
-    <w:pPr>
-      <w:spacing w:line="480" w:lineRule="auto"/>
-      <w:jc w:val="both"/>
-    </w:pPr>
-    <w:rPr>
-      <w:sz w:val="24"/>
-      <w:lang w:val="es-CO"/>
-    </w:rPr>
-  </w:style>
-  <w:style w:type="paragraph" w:styleId="Encabezado">
-    <w:name w:val="header"/>
-    <w:basedOn w:val="Normal"/>
-    <w:uiPriority w:val="99"/>
-    <w:pPr>
-      <w:tabs>
-        <w:tab w:val="center" w:pos="4252"/>
-        <w:tab w:val="right" w:pos="8504"/>
-      </w:tabs>
-    </w:pPr>
-  </w:style>
-  <w:style w:type="paragraph" w:styleId="Piedepgina">
-    <w:name w:val="footer"/>
-    <w:basedOn w:val="Normal"/>
-    <w:pPr>
-      <w:tabs>
-        <w:tab w:val="center" w:pos="4252"/>
-        <w:tab w:val="right" w:pos="8504"/>
-      </w:tabs>
-    </w:pPr>
-  </w:style>
-  <w:style w:type="paragraph" w:styleId="Mapadeldocumento">
-    <w:name w:val="Document Map"/>
-    <w:basedOn w:val="Normal"/>
-    <w:pPr>
-      <w:shd w:val="clear" w:color="auto" w:fill="000080"/>
-    </w:pPr>
-    <w:rPr>
-      <w:rFonts w:ascii="Tahoma" w:hAnsi="Tahoma" w:cs="Tahoma"/>
-    </w:rPr>
-  </w:style>
-  <w:style w:type="paragraph" w:styleId="Textodeglobo">
-    <w:name w:val="Balloon Text"/>
-    <w:basedOn w:val="Normal"/>
-    <w:rPr>
-      <w:rFonts w:ascii="Tahoma" w:hAnsi="Tahoma" w:cs="Tahoma"/>
-      <w:sz w:val="16"/>
-      <w:szCs w:val="16"/>
-    </w:rPr>
-  </w:style>
-  <w:style w:type="character" w:styleId="Nmerodepgina">
-    <w:name w:val="page number"/>
-    <w:basedOn w:val="Fuentedeprrafopredeter"/>
-  </w:style>
-  <w:style w:type="character" w:styleId="Hipervnculo">
-    <w:name w:val="Hyperlink"/>
-    <w:rPr>
-      <w:color w:val="0000FF"/>
-      <w:u w:val="single"/>
-    </w:rPr>
-  </w:style>
-  <w:style w:type="character" w:customStyle="1" w:styleId="PiedepginaCar">
-    <w:name w:val="Pie de página Car"/>
-    <w:rPr>
-      <w:lang w:eastAsia="es-ES"/>
-    </w:rPr>
-  </w:style>
-  <w:style w:type="paragraph" w:styleId="Textonotapie">
-    <w:name w:val="footnote text"/>
-    <w:basedOn w:val="Normal"/>
-  </w:style>
-  <w:style w:type="character" w:customStyle="1" w:styleId="TextonotapieCar">
-    <w:name w:val="Texto nota pie Car"/>
-    <w:rPr>
-      <w:lang w:eastAsia="es-ES"/>
-    </w:rPr>
-  </w:style>
-  <w:style w:type="character" w:styleId="Refdenotaalpie">
-    <w:name w:val="footnote reference"/>
-    <w:rPr>
-      <w:position w:val="0"/>
-      <w:vertAlign w:val="superscript"/>
-    </w:rPr>
-  </w:style>
-  <w:style w:type="character" w:customStyle="1" w:styleId="EncabezadoCar">
-    <w:name w:val="Encabezado Car"/>
-    <w:uiPriority w:val="99"/>
-    <w:rPr>
-      <w:lang w:eastAsia="es-ES"/>
-    </w:rPr>
-  </w:style>
-  <w:style w:type="paragraph" w:styleId="NormalWeb">
-    <w:name w:val="Normal (Web)"/>
-    <w:basedOn w:val="Normal"/>
-    <w:uiPriority w:val="99"/>
-    <w:unhideWhenUsed/>
-    <w:rsid w:val="00780F5E"/>
-    <w:pPr>
-      <w:suppressAutoHyphens w:val="0"/>
-      <w:autoSpaceDN/>
-      <w:spacing w:before="100" w:beforeAutospacing="1" w:after="100" w:afterAutospacing="1"/>
-      <w:textAlignment w:val="auto"/>
-    </w:pPr>
-    <w:rPr>
-      <w:rFonts w:eastAsiaTheme="minorEastAsia"/>
-      <w:sz w:val="24"/>
-      <w:szCs w:val="24"/>
-      <w:lang w:val="es-CO" w:eastAsia="es-CO"/>
-    </w:rPr>
-  </w:style>
-  <w:style w:type="character" w:styleId="Refdecomentario">
-    <w:name w:val="annotation reference"/>
-    <w:basedOn w:val="Fuentedeprrafopredeter"/>
-    <w:uiPriority w:val="99"/>
-    <w:semiHidden/>
-    <w:unhideWhenUsed/>
-    <w:rsid w:val="006C4CA9"/>
-    <w:rPr>
-      <w:sz w:val="16"/>
-      <w:szCs w:val="16"/>
-    </w:rPr>
-  </w:style>
-  <w:style w:type="paragraph" w:styleId="Textocomentario">
-    <w:name w:val="annotation text"/>
-    <w:basedOn w:val="Normal"/>
-    <w:link w:val="TextocomentarioCar"/>
-    <w:uiPriority w:val="99"/>
-    <w:semiHidden/>
-    <w:unhideWhenUsed/>
-    <w:rsid w:val="006C4CA9"/>
-  </w:style>
-  <w:style w:type="character" w:customStyle="1" w:styleId="TextocomentarioCar">
-    <w:name w:val="Texto comentario Car"/>
-    <w:basedOn w:val="Fuentedeprrafopredeter"/>
-    <w:link w:val="Textocomentario"/>
-    <w:uiPriority w:val="99"/>
-    <w:semiHidden/>
-    <w:rsid w:val="006C4CA9"/>
-  </w:style>
-  <w:style w:type="paragraph" w:styleId="Asuntodelcomentario">
-    <w:name w:val="annotation subject"/>
-    <w:basedOn w:val="Textocomentario"/>
-    <w:next w:val="Textocomentario"/>
-    <w:link w:val="AsuntodelcomentarioCar"/>
-    <w:uiPriority w:val="99"/>
-    <w:semiHidden/>
-    <w:unhideWhenUsed/>
-    <w:rsid w:val="006C4CA9"/>
-    <w:rPr>
-      <w:b/>
-      <w:bCs/>
-    </w:rPr>
-  </w:style>
-  <w:style w:type="character" w:customStyle="1" w:styleId="AsuntodelcomentarioCar">
-    <w:name w:val="Asunto del comentario Car"/>
-    <w:basedOn w:val="TextocomentarioCar"/>
-    <w:link w:val="Asuntodelcomentario"/>
-    <w:uiPriority w:val="99"/>
-    <w:semiHidden/>
-    <w:rsid w:val="006C4CA9"/>
-    <w:rPr>
-      <w:b/>
-      <w:bCs/>
-    </w:rPr>
-  </w:style>
-  <w:style w:type="table" w:styleId="Tablaconcuadrcula">
-    <w:name w:val="Table Grid"/>
-    <w:basedOn w:val="Tablanormal"/>
-    <w:uiPriority w:val="59"/>
-    <w:rsid w:val="006930BA"/>
-    <w:tblPr>
-      <w:tblInd w:w="0" w:type="dxa"/>
-      <w:tblBorders>
-        <w:top w:val="single" w:sz="4" w:space="0" w:color="auto"/>
-        <w:left w:val="single" w:sz="4" w:space="0" w:color="auto"/>
-        <w:bottom w:val="single" w:sz="4" w:space="0" w:color="auto"/>
-        <w:right w:val="single" w:sz="4" w:space="0" w:color="auto"/>
-        <w:insideH w:val="single" w:sz="4" w:space="0" w:color="auto"/>
-        <w:insideV w:val="single" w:sz="4" w:space="0" w:color="auto"/>
-      </w:tblBorders>
-      <w:tblCellMar>
-        <w:top w:w="0" w:type="dxa"/>
-        <w:left w:w="108" w:type="dxa"/>
-        <w:bottom w:w="0" w:type="dxa"/>
-        <w:right w:w="108" w:type="dxa"/>
-      </w:tblCellMar>
     </w:tblPr>
   </w:style>
   <w:style w:type="character" w:customStyle="1" w:styleId="Textoindependiente2Car">

</xml_diff>

<commit_message>
feat: Add pagoSeguridadSocial, observacionesFinancieras logic and date formatting improvements
</commit_message>
<xml_diff>
--- a/plantillas/INFORME_SUPERVISION_TEMPLATE.docx
+++ b/plantillas/INFORME_SUPERVISION_TEMPLATE.docx
@@ -152,6 +152,7 @@
                                   <w:pPr>
                                     <w:pStyle w:val="Textoindependiente2"/>
                                     <w:spacing w:line="240" w:lineRule="auto"/>
+                                    <w:jc w:val="center"/>
                                     <w:rPr>
                                       <w:rFonts w:ascii="Arial" w:hAnsi="Arial" w:cs="Arial"/>
                                       <w:szCs w:val="24"/>
@@ -162,7 +163,7 @@
                                       <w:rFonts w:ascii="Arial" w:hAnsi="Arial" w:cs="Arial"/>
                                       <w:szCs w:val="24"/>
                                     </w:rPr>
-                                    <w:t xml:space="preserve">${X_FINAL} </w:t>
+                                    <w:t>${X_FINAL}</w:t>
                                   </w:r>
                                 </w:p>
                                 <w:p>
@@ -202,6 +203,7 @@
                             <w:pPr>
                               <w:pStyle w:val="Textoindependiente2"/>
                               <w:spacing w:line="240" w:lineRule="auto"/>
+                              <w:jc w:val="center"/>
                               <w:rPr>
                                 <w:rFonts w:ascii="Arial" w:hAnsi="Arial" w:cs="Arial"/>
                                 <w:szCs w:val="24"/>
@@ -212,7 +214,7 @@
                                 <w:rFonts w:ascii="Arial" w:hAnsi="Arial" w:cs="Arial"/>
                                 <w:szCs w:val="24"/>
                               </w:rPr>
-                              <w:t xml:space="preserve">${X_FINAL} </w:t>
+                              <w:t>${X_FINAL}</w:t>
                             </w:r>
                           </w:p>
                           <w:p>
@@ -2850,18 +2852,48 @@
               <w:spacing w:line="240" w:lineRule="auto"/>
               <w:rPr>
                 <w:rFonts w:ascii="Arial" w:hAnsi="Arial" w:cs="Arial"/>
-                <w:szCs w:val="24"/>
-              </w:rPr>
-            </w:pPr>
-            <w:r>
-              <w:rPr>
-                <w:rFonts w:ascii="Arial" w:hAnsi="Arial" w:cs="Arial"/>
                 <w:bCs/>
                 <w:szCs w:val="24"/>
                 <w:lang w:val="es-MX"/>
               </w:rPr>
+            </w:pPr>
+            <w:r>
+              <w:rPr>
+                <w:rFonts w:ascii="Arial" w:hAnsi="Arial" w:cs="Arial"/>
+                <w:bCs/>
+                <w:szCs w:val="24"/>
+                <w:lang w:val="es-MX"/>
+              </w:rPr>
               <w:t>Observaciones al informe contable y financiero:</w:t>
             </w:r>
+            <w:r>
+              <w:rPr>
+                <w:rFonts w:ascii="Arial" w:hAnsi="Arial" w:cs="Arial"/>
+                <w:bCs/>
+                <w:szCs w:val="24"/>
+                <w:lang w:val="es-MX"/>
+              </w:rPr>
+              <w:t xml:space="preserve"> </w:t>
+            </w:r>
+            <w:r>
+              <w:rPr>
+                <w:rFonts w:ascii="Arial" w:hAnsi="Arial" w:cs="Arial"/>
+                <w:bCs/>
+                <w:szCs w:val="24"/>
+                <w:lang w:val="es-MX"/>
+              </w:rPr>
+              <w:t>${OBSERVACIONES_FINANCIERAS}</w:t>
+            </w:r>
+          </w:p>
+          <w:p>
+            <w:pPr>
+              <w:pStyle w:val="Textoindependiente2"/>
+              <w:spacing w:line="240" w:lineRule="auto"/>
+              <w:rPr>
+                <w:rFonts w:ascii="Arial" w:hAnsi="Arial" w:cs="Arial"/>
+                <w:szCs w:val="24"/>
+              </w:rPr>
+            </w:pPr>
           </w:p>
         </w:tc>
       </w:tr>
@@ -2949,7 +2981,7 @@
       </w:tr>
       <w:tr>
         <w:trPr>
-          <w:trHeight w:val="227"/>
+          <w:trHeight w:val="567"/>
         </w:trPr>
         <w:tc>
           <w:tcPr>
@@ -2967,7 +2999,6 @@
               <w:bottom w:w="0" w:type="dxa"/>
               <w:right w:w="70" w:type="dxa"/>
             </w:tcMar>
-            <w:vAlign w:val="center"/>
           </w:tcPr>
           <w:p>
             <w:pPr>
@@ -2975,13 +3006,17 @@
               <w:spacing w:line="240" w:lineRule="auto"/>
               <w:rPr>
                 <w:rFonts w:ascii="Arial" w:hAnsi="Arial" w:cs="Arial"/>
-                <w:szCs w:val="24"/>
-              </w:rPr>
-            </w:pPr>
-            <w:r>
-              <w:rPr>
-                <w:rFonts w:ascii="Arial" w:hAnsi="Arial" w:cs="Arial"/>
-                <w:szCs w:val="24"/>
+                <w:bCs/>
+                <w:szCs w:val="24"/>
+                <w:lang w:val="es-MX"/>
+              </w:rPr>
+            </w:pPr>
+            <w:r>
+              <w:rPr>
+                <w:rFonts w:ascii="Arial" w:hAnsi="Arial" w:cs="Arial"/>
+                <w:bCs/>
+                <w:szCs w:val="24"/>
+                <w:lang w:val="es-MX"/>
               </w:rPr>
               <w:t xml:space="preserve">Concepto Supervisor: </w:t>
             </w:r>
@@ -3010,6 +3045,7 @@
                 <w:rFonts w:ascii="Arial" w:hAnsi="Arial" w:cs="Arial"/>
                 <w:szCs w:val="24"/>
               </w:rPr>
+              <w:lastRenderedPageBreak/>
               <w:t>${CONCEPTO_SUPERVISOR}</w:t>
             </w:r>
           </w:p>
@@ -3771,7 +3807,25 @@
         <w:sz w:val="16"/>
         <w:szCs w:val="16"/>
       </w:rPr>
-      <w:t xml:space="preserve"> de Santiago de Cali.  Prohibida su alteración o modificación por cualquier medio, sin previa autorización del Alcalde.</w:t>
+      <w:t xml:space="preserve"> de Santiago de Cali.  Prohibida su alteración o modificación por cualquier medio, sin previa autorización del </w:t>
+    </w:r>
+    <w:proofErr w:type="gramStart"/>
+    <w:r>
+      <w:rPr>
+        <w:rFonts w:ascii="Arial" w:hAnsi="Arial" w:cs="Arial"/>
+        <w:sz w:val="16"/>
+        <w:szCs w:val="16"/>
+      </w:rPr>
+      <w:t>Alcalde</w:t>
+    </w:r>
+    <w:proofErr w:type="gramEnd"/>
+    <w:r>
+      <w:rPr>
+        <w:rFonts w:ascii="Arial" w:hAnsi="Arial" w:cs="Arial"/>
+        <w:sz w:val="16"/>
+        <w:szCs w:val="16"/>
+      </w:rPr>
+      <w:t>.</w:t>
     </w:r>
   </w:p>
   <w:p>
@@ -4175,7 +4229,25 @@
               <w:color w:val="000000"/>
               <w:shd w:val="clear" w:color="auto" w:fill="FFFFFF"/>
             </w:rPr>
-            <w:t>MAJA01.04.03.P002.F003</w:t>
+            <w:t>MAJA01.04.</w:t>
+          </w:r>
+          <w:proofErr w:type="gramStart"/>
+          <w:r>
+            <w:rPr>
+              <w:rFonts w:ascii="Arial" w:hAnsi="Arial" w:cs="Arial"/>
+              <w:color w:val="000000"/>
+              <w:shd w:val="clear" w:color="auto" w:fill="FFFFFF"/>
+            </w:rPr>
+            <w:t>03.P002.F</w:t>
+          </w:r>
+          <w:proofErr w:type="gramEnd"/>
+          <w:r>
+            <w:rPr>
+              <w:rFonts w:ascii="Arial" w:hAnsi="Arial" w:cs="Arial"/>
+              <w:color w:val="000000"/>
+              <w:shd w:val="clear" w:color="auto" w:fill="FFFFFF"/>
+            </w:rPr>
+            <w:t>003</w:t>
           </w:r>
         </w:p>
       </w:tc>

</xml_diff>

<commit_message>
Cambio de botones a descarga directa de Word en Informe de Supervisión y mejoras en conversión XML a Word
</commit_message>
<xml_diff>
--- a/plantillas/INFORME_SUPERVISION_TEMPLATE.docx
+++ b/plantillas/INFORME_SUPERVISION_TEMPLATE.docx
@@ -3018,6 +3018,7 @@
                 <w:szCs w:val="24"/>
                 <w:lang w:val="es-MX"/>
               </w:rPr>
+              <w:lastRenderedPageBreak/>
               <w:t xml:space="preserve">Concepto Supervisor: </w:t>
             </w:r>
           </w:p>
@@ -3045,7 +3046,6 @@
                 <w:rFonts w:ascii="Arial" w:hAnsi="Arial" w:cs="Arial"/>
                 <w:szCs w:val="24"/>
               </w:rPr>
-              <w:lastRenderedPageBreak/>
               <w:t>${CONCEPTO_SUPERVISOR}</w:t>
             </w:r>
           </w:p>
@@ -3097,7 +3097,6 @@
                 <w:rFonts w:ascii="Arial" w:hAnsi="Arial" w:cs="Arial"/>
                 <w:szCs w:val="24"/>
               </w:rPr>
-              <w:lastRenderedPageBreak/>
               <w:t>Recibo a Satisfacción de Servicios:</w:t>
             </w:r>
             <w:r>
@@ -4096,8 +4095,8 @@
             <w:jc w:val="center"/>
             <w:rPr>
               <w:rFonts w:ascii="Arial" w:hAnsi="Arial" w:cs="Arial"/>
-              <w:sz w:val="14"/>
-              <w:szCs w:val="14"/>
+              <w:sz w:val="16"/>
+              <w:szCs w:val="16"/>
             </w:rPr>
           </w:pPr>
           <w:r>
@@ -4116,6 +4115,17 @@
             </w:rPr>
             <w:t>N CONTRACTUAL</w:t>
           </w:r>
+        </w:p>
+        <w:p>
+          <w:pPr>
+            <w:pStyle w:val="Encabezado"/>
+            <w:jc w:val="center"/>
+            <w:rPr>
+              <w:rFonts w:ascii="Arial" w:hAnsi="Arial" w:cs="Arial"/>
+              <w:sz w:val="14"/>
+              <w:szCs w:val="14"/>
+            </w:rPr>
+          </w:pPr>
         </w:p>
       </w:tc>
       <w:tc>

</xml_diff>